<commit_message>
paper: fix make-all figures, designation, citations and appendix listings in Project 1 report
</commit_message>
<xml_diff>
--- a/BlastRadius_Project1_Report.docx
+++ b/BlastRadius_Project1_Report.docx
@@ -329,9 +329,8 @@
         <w:rPr>
           <w:b/>
           <w:bCs/>
-          <w:highlight w:val="yellow"/>
-        </w:rPr>
-        <w:t>[Designation]</w:t>
+        </w:rPr>
+        <w:t>Assistant Professor Sr. Grade 1</w:t>
       </w:r>
       <w:r>
         <w:rPr>
@@ -606,9 +605,8 @@
         <w:rPr>
           <w:b/>
           <w:bCs/>
-          <w:highlight w:val="yellow"/>
-        </w:rPr>
-        <w:t>[Designation]</w:t>
+        </w:rPr>
+        <w:t>Assistant Professor Sr. Grade 1</w:t>
       </w:r>
       <w:r>
         <w:t xml:space="preserve">, School of Computer Science Engineering and Information Systems, Vellore Institute of Technology, Vellore for the constant guidance and continual encouragement in our endeavour. Our association with our guide is not confined to academics only, but it is a great opportunity on our part to work with an intellectual and an expert in the field of </w:t>
@@ -13079,16 +13077,7 @@
         <w:jc w:val="both"/>
       </w:pPr>
       <w:r>
-        <w:t xml:space="preserve">Several further strands of work are relevant. A recent intent-aware co-change approach named RIPPLE is reported to identify co-changed program elements; like the CIA work above, it never observes a test outcome and therefore predicts a different dependent variable </w:t>
-      </w:r>
-      <w:r>
-        <w:rPr>
-          <w:highlight w:val="yellow"/>
-        </w:rPr>
-        <w:t>[VERIFY: confirm the RIPPLE citation before submission]</w:t>
-      </w:r>
-      <w:r>
-        <w:t xml:space="preserve">. The SWE-bench family of benchmarks evaluates whether an agent can fix a bug given a failing test; these are agent-evaluation benchmarks, whereas BR-Bench is a prediction benchmark that asks which tests a diff will turn red. Ekstazi (Gligoric et al., 2015) and STARTS (Legunsen et al., 2017) are regression test selection tools for Java that select tests by dynamic file dependencies and static class dependencies respectively; both are safe over-approximations rather than observations.</w:t>
+        <w:t xml:space="preserve">Several further strands of work are relevant. The SWE-bench family of benchmarks evaluates whether an agent can fix a bug given a failing test; these are agent-evaluation benchmarks, whereas BR-Bench is a prediction benchmark that asks which tests a diff will turn red. Ekstazi (Gligoric et al., 2015) and STARTS (Legunsen et al., 2017) are regression test selection tools for Java that select tests by dynamic file dependencies and static class dependencies respectively; both are safe over-approximations rather than observations.</w:t>
       </w:r>
     </w:p>
     <w:p>
@@ -15760,7 +15749,7 @@
                 <w:sz w:val="20"/>
                 <w:szCs w:val="20"/>
               </w:rPr>
-              <w:t xml:space="preserve">Done: 13 min 59.96 s against a 15-minute target (reference run); make tables regenerates every number offline in about 8 minutes</w:t>
+              <w:t xml:space="preserve">Done: make all in 9 min 47.23 s against a 15-minute target; make tables regenerates every reported number offline in about eight minutes</w:t>
             </w:r>
           </w:p>
         </w:tc>
@@ -30944,10 +30933,10 @@
         <w:rPr>
           <w:b/>
         </w:rPr>
-        <w:t xml:space="preserve">13 min 59.96 s</w:t>
-      </w:r>
-      <w:r>
-        <w:t xml:space="preserve">, against a target of under 15 minutes, with 655 tests passed and 1 skipped at that time; the suite has since grown to 782 passing tests, and make tables alone regenerates every reported number offline in about eight minutes. Because make all takes about fourteen minutes, a prepared recording is shown during the review rather than running it live, and the terminal summary is shown as a still image.</w:t>
+        <w:t xml:space="preserve">9 min 47.23 s</w:t>
+      </w:r>
+      <w:r>
+        <w:t xml:space="preserve">, against a target of under 15 minutes, with 655 tests passed and 1 skipped (the first run, before a graph-query performance fix, took 13 min 59.96 s with 632 passed and 12 skipped; both are inside the budget). The suite has since grown to 782 passing tests with 1 skipped, and make tables regenerates every reported number offline in about eight minutes (7 min 43 s on the final code commit). Because make all takes about ten minutes or more, a prepared recording is shown during the review rather than running it live, and the terminal summary is shown as a still image.</w:t>
       </w:r>
     </w:p>
     <w:p>
@@ -37360,7 +37349,7 @@
           <w:sz w:val="21"/>
           <w:szCs w:val="21"/>
         </w:rPr>
-        <w:t xml:space="preserve">13 min 59.96 s</w:t>
+        <w:t xml:space="preserve">9 min 47.23 s</w:t>
       </w:r>
       <w:r>
         <w:rPr>
@@ -37368,7 +37357,7 @@
           <w:sz w:val="21"/>
           <w:szCs w:val="21"/>
         </w:rPr>
-        <w:t xml:space="preserve">, against a target of under 15 minutes, with 655 tests passed and 1 skipped at that time. At the final freeze the main suite stands at 782 passing tests, and make tables regenerates every reported number offline in about eight minutes. This is the strongest single piece of evidence for the reproducibility claim: the full pipeline, from raw data to tables, runs with one command on a laptop within the budget.</w:t>
+        <w:t xml:space="preserve">, against a target of under 15 minutes, with 655 tests passed and 1 skipped; the first run, before a graph-query performance fix, took 13 min 59.96 s with 632 passed and 12 skipped. At the final freeze the main suite stands at 782 passing tests with 1 skipped, and make tables regenerates every reported number offline in 7 min 43 s on the final code commit. This is the strongest single piece of evidence for the reproducibility claim: the full pipeline, from raw data to tables, runs with one command on a laptop within the budget.</w:t>
       </w:r>
     </w:p>
     <w:p>
@@ -39764,7 +39753,7 @@
         <w:t xml:space="preserve">One-command reproduction</w:t>
       </w:r>
       <w:r>
-        <w:t xml:space="preserve">: make all in 13 min 59.96 s against a 15-minute target; the main suite stands at 782 passing tests, and make tables regenerates every reported number offline in about eight minutes.</w:t>
+        <w:t xml:space="preserve">: make all in 9 min 47.23 s against a 15-minute target (655 passed, 1 skipped); the main suite now stands at 782 passing tests, and make tables regenerates every reported number offline in about eight minutes.</w:t>
       </w:r>
     </w:p>
     <w:p>
@@ -40205,23 +40194,35 @@
         <w:ind w:left="720" w:hanging="720"/>
       </w:pPr>
       <w:r>
-        <w:t xml:space="preserve">Dai, Wang, Jin, Gong, &amp; Yang. (2022). An improving approach to analyzing change impact of C programs. </w:t>
+        <w:t xml:space="preserve">Dai, P., Wang, Y., Jin, D., Gong, Y., &amp; Yang, W. (2022). An improving approach to analyzing change impact of C programs. </w:t>
+      </w:r>
+      <w:r>
+        <w:rPr>
+          <w:i/>
+        </w:rPr>
+        <w:t xml:space="preserve">Computer Communications, 182</w:t>
+      </w:r>
+      <w:r>
+        <w:t xml:space="preserve">, 60–71. https://doi.org/10.1016/j.comcom.2021.10.039</w:t>
+      </w:r>
+    </w:p>
+    <w:p>
+      <w:pPr>
+        <w:spacing w:after="120" w:line="360" w:lineRule="auto"/>
+        <w:ind w:left="720" w:hanging="720"/>
+      </w:pPr>
+      <w:r>
+        <w:t xml:space="preserve">Gebru, T., Morgenstern, J., Vecchione, B., Vaughan, J. W., Wallach, H., Daumé III, H., &amp; Crawford, K. (2021). Datasheets for datasets. </w:t>
       </w:r>
       <w:r>
         <w:rPr>
           <w:i/>
           <w:iCs/>
         </w:rPr>
-        <w:t>Computer Communications, 182</w:t>
-      </w:r>
-      <w:r>
-        <w:t xml:space="preserve">. </w:t>
-      </w:r>
-      <w:r>
-        <w:rPr>
-          <w:highlight w:val="yellow"/>
-        </w:rPr>
-        <w:t>[VERIFY: author initials and page range]</w:t>
+        <w:t>Communications of the ACM, 64</w:t>
+      </w:r>
+      <w:r>
+        <w:t>(12), 86–92.</w:t>
       </w:r>
     </w:p>
     <w:p>
@@ -40230,17 +40231,17 @@
         <w:ind w:left="720" w:hanging="720"/>
       </w:pPr>
       <w:r>
-        <w:t xml:space="preserve">Gebru, T., Morgenstern, J., Vecchione, B., Vaughan, J. W., Wallach, H., Daumé III, H., &amp; Crawford, K. (2021). Datasheets for datasets. </w:t>
+        <w:t xml:space="preserve">Gligoric, M., Eloussi, L., &amp; Marinov, D. (2015). Practical regression test selection with dynamic file dependencies. In </w:t>
       </w:r>
       <w:r>
         <w:rPr>
           <w:i/>
           <w:iCs/>
         </w:rPr>
-        <w:t>Communications of the ACM, 64</w:t>
-      </w:r>
-      <w:r>
-        <w:t>(12), 86–92.</w:t>
+        <w:t>Proceedings of the 2015 International Symposium on Software Testing and Analysis (ISSTA)</w:t>
+      </w:r>
+      <w:r>
+        <w:t xml:space="preserve"> (pp. 211–222). ACM.</w:t>
       </w:r>
     </w:p>
     <w:p>
@@ -40249,42 +40250,16 @@
         <w:ind w:left="720" w:hanging="720"/>
       </w:pPr>
       <w:r>
-        <w:t xml:space="preserve">Gligoric, M., Eloussi, L., &amp; Marinov, D. (2015). Practical regression test selection with dynamic file dependencies. In </w:t>
+        <w:t xml:space="preserve">Gupta, C., &amp; Gupta, V. (2015). Software change impact analysis: An approach to compute and prioritize impacted functions in software systems. </w:t>
       </w:r>
       <w:r>
         <w:rPr>
           <w:i/>
-          <w:iCs/>
-        </w:rPr>
-        <w:t>Proceedings of the 2015 International Symposium on Software Testing and Analysis (ISSTA)</w:t>
-      </w:r>
-      <w:r>
-        <w:t xml:space="preserve"> (pp. 211–222). ACM.</w:t>
-      </w:r>
-    </w:p>
-    <w:p>
-      <w:pPr>
-        <w:spacing w:after="120" w:line="360" w:lineRule="auto"/>
-        <w:ind w:left="720" w:hanging="720"/>
-      </w:pPr>
-      <w:r>
-        <w:t xml:space="preserve">Gupta, &amp; Gupta. (2015). Software change impact analysis: An approach to compute and prioritize impacted functions. </w:t>
-      </w:r>
-      <w:r>
-        <w:rPr>
-          <w:i/>
-          <w:iCs/>
-        </w:rPr>
-        <w:t>International Journal of Systems and Service-Oriented Engineering (IJSSOE), 5</w:t>
-      </w:r>
-      <w:r>
-        <w:t xml:space="preserve">(2). </w:t>
-      </w:r>
-      <w:r>
-        <w:rPr>
-          <w:highlight w:val="yellow"/>
-        </w:rPr>
-        <w:t>[VERIFY: author initials, journal title and pages]</w:t>
+        </w:rPr>
+        <w:t xml:space="preserve">International Journal of Systems and Service-Oriented Engineering, 5</w:t>
+      </w:r>
+      <w:r>
+        <w:t xml:space="preserve">(2), 44–55. https://doi.org/10.4018/IJSSOE.2015040103</w:t>
       </w:r>
     </w:p>
     <w:p>
@@ -40349,7 +40324,7 @@
         <w:rPr>
           <w:highlight w:val="yellow"/>
         </w:rPr>
-        <w:t>[VERIFY: page range]</w:t>
+        <w:t>[VERIFY: these authors could not be confirmed; ICSME 2016 lists this title under Angerer, Prähofer and Grünbacher. Check IEEE Xplore or DBLP, then correct authors and pages, or delete this reference and its survey entry]</w:t>
       </w:r>
     </w:p>
     <w:p>
@@ -40739,10 +40714,116 @@
         <w:jc w:val="both"/>
       </w:pPr>
       <w:r>
-        <w:rPr>
-          <w:highlight w:val="yellow"/>
-        </w:rPr>
-        <w:t>[Insert the contents of REPRODUCE.md from the repository here.]</w:t>
+        <w:t xml:space="preserve">The reproduction guide in the repository (docs/REPRODUCE.md) states the prerequisites and the measured output. The environment is WSL2 Ubuntu with Python 3.11 managed by uv, and the reproduction makes no network call, needs no API token and calls no language model. make tables sets BR_OFFLINE=1, so any step that later gains a network call fails loudly instead of fetching. The network-bound base-run resolution is a separate explicit target, make resolve-bases, which refuses to run without tokens.</w:t>
+      </w:r>
+    </w:p>
+    <w:p>
+      <w:pPr>
+        <w:keepNext/>
+        <w:spacing w:before="160" w:after="60"/>
+      </w:pPr>
+      <w:r>
+        <w:rPr>
+          <w:i/>
+          <w:iCs/>
+          <w:sz w:val="20"/>
+          <w:szCs w:val="20"/>
+        </w:rPr>
+        <w:t>Listing A.1b Commands from docs/REPRODUCE.md</w:t>
+      </w:r>
+    </w:p>
+    <w:p>
+      <w:pPr>
+        <w:keepNext/>
+        <w:keepLines/>
+        <w:pBdr>
+          <w:left w:val="single" w:sz="12" w:space="8" w:color="1F3A5F"/>
+        </w:pBdr>
+        <w:shd w:val="clear" w:color="auto" w:fill="F4F6F8"/>
+        <w:ind w:left="200"/>
+      </w:pPr>
+      <w:r>
+        <w:rPr>
+          <w:rFonts w:ascii="Courier New" w:eastAsia="Courier New" w:hAnsi="Courier New" w:cs="Courier New"/>
+          <w:sz w:val="18"/>
+          <w:szCs w:val="18"/>
+        </w:rPr>
+        <w:t xml:space="preserve">uv sync --extra graph</w:t>
+      </w:r>
+    </w:p>
+    <w:p>
+      <w:pPr>
+        <w:keepNext/>
+        <w:keepLines/>
+        <w:pBdr>
+          <w:left w:val="single" w:sz="12" w:space="8" w:color="1F3A5F"/>
+        </w:pBdr>
+        <w:shd w:val="clear" w:color="auto" w:fill="F4F6F8"/>
+        <w:ind w:left="200"/>
+      </w:pPr>
+      <w:r>
+        <w:rPr>
+          <w:rFonts w:ascii="Courier New" w:eastAsia="Courier New" w:hAnsi="Courier New" w:cs="Courier New"/>
+          <w:sz w:val="18"/>
+          <w:szCs w:val="18"/>
+        </w:rPr>
+        <w:t xml:space="preserve">make all            # pytest + the mini-corpus reproduction</w:t>
+      </w:r>
+    </w:p>
+    <w:p>
+      <w:pPr>
+        <w:keepNext/>
+        <w:keepLines/>
+        <w:pBdr>
+          <w:left w:val="single" w:sz="12" w:space="8" w:color="1F3A5F"/>
+        </w:pBdr>
+        <w:shd w:val="clear" w:color="auto" w:fill="F4F6F8"/>
+        <w:ind w:left="200"/>
+      </w:pPr>
+      <w:r>
+        <w:rPr>
+          <w:rFonts w:ascii="Courier New" w:eastAsia="Courier New" w:hAnsi="Courier New" w:cs="Courier New"/>
+          <w:sz w:val="18"/>
+          <w:szCs w:val="18"/>
+        </w:rPr>
+        <w:t xml:space="preserve">make tables         # regenerates every number that reaches the paper</w:t>
+      </w:r>
+    </w:p>
+    <w:p>
+      <w:pPr>
+        <w:keepNext/>
+        <w:keepLines/>
+        <w:pBdr>
+          <w:left w:val="single" w:sz="12" w:space="8" w:color="1F3A5F"/>
+        </w:pBdr>
+        <w:shd w:val="clear" w:color="auto" w:fill="F4F6F8"/>
+        <w:ind w:left="200"/>
+      </w:pPr>
+      <w:r>
+        <w:rPr>
+          <w:rFonts w:ascii="Courier New" w:eastAsia="Courier New" w:hAnsi="Courier New" w:cs="Courier New"/>
+          <w:sz w:val="18"/>
+          <w:szCs w:val="18"/>
+        </w:rPr>
+        <w:t xml:space="preserve">make demo           # read-only walkthrough of one strict instance</w:t>
+      </w:r>
+    </w:p>
+    <w:p>
+      <w:pPr>
+        <w:keepLines/>
+        <w:pBdr>
+          <w:left w:val="single" w:sz="12" w:space="8" w:color="1F3A5F"/>
+        </w:pBdr>
+        <w:shd w:val="clear" w:color="auto" w:fill="F4F6F8"/>
+        <w:ind w:left="200"/>
+      </w:pPr>
+      <w:r>
+        <w:rPr>
+          <w:rFonts w:ascii="Courier New" w:eastAsia="Courier New" w:hAnsi="Courier New" w:cs="Courier New"/>
+          <w:sz w:val="18"/>
+          <w:szCs w:val="18"/>
+        </w:rPr>
+        <w:t xml:space="preserve">make resolve-bases  # network + token; NOT part of make tables</w:t>
       </w:r>
     </w:p>
     <w:p>
@@ -41067,10 +41148,401 @@
         <w:jc w:val="both"/>
       </w:pPr>
       <w:r>
-        <w:rPr>
-          <w:highlight w:val="yellow"/>
-        </w:rPr>
-        <w:t>[Insert the corresponding excerpt from the labelling engine.]</w:t>
+        <w:t xml:space="preserve">The corresponding excerpt from the repository (src/label/fault_revealing.py) shows the same logic: runs with status no_base emit no labels, the relaxed split drops tests that also failed at the base, and the strict split additionally drops same-commit flips.</w:t>
+      </w:r>
+    </w:p>
+    <w:p>
+      <w:pPr>
+        <w:keepNext/>
+        <w:spacing w:before="160" w:after="60"/>
+      </w:pPr>
+      <w:r>
+        <w:rPr>
+          <w:i/>
+          <w:iCs/>
+          <w:sz w:val="20"/>
+          <w:szCs w:val="20"/>
+        </w:rPr>
+        <w:t>Listing A.2b Excerpt from src/label/fault_revealing.py</w:t>
+      </w:r>
+    </w:p>
+    <w:p>
+      <w:pPr>
+        <w:keepNext/>
+        <w:keepLines/>
+        <w:pBdr>
+          <w:left w:val="single" w:sz="12" w:space="8" w:color="1F3A5F"/>
+        </w:pBdr>
+        <w:shd w:val="clear" w:color="auto" w:fill="F4F6F8"/>
+        <w:ind w:left="200"/>
+      </w:pPr>
+      <w:r>
+        <w:rPr>
+          <w:rFonts w:ascii="Courier New" w:eastAsia="Courier New" w:hAnsi="Courier New" w:cs="Courier New"/>
+          <w:sz w:val="18"/>
+          <w:szCs w:val="18"/>
+        </w:rPr>
+        <w:t xml:space="preserve">    for _, row in res_df.iterrows():</w:t>
+      </w:r>
+    </w:p>
+    <w:p>
+      <w:pPr>
+        <w:keepNext/>
+        <w:keepLines/>
+        <w:pBdr>
+          <w:left w:val="single" w:sz="12" w:space="8" w:color="1F3A5F"/>
+        </w:pBdr>
+        <w:shd w:val="clear" w:color="auto" w:fill="F4F6F8"/>
+        <w:ind w:left="200"/>
+      </w:pPr>
+      <w:r>
+        <w:rPr>
+          <w:rFonts w:ascii="Courier New" w:eastAsia="Courier New" w:hAnsi="Courier New" w:cs="Courier New"/>
+          <w:sz w:val="18"/>
+          <w:szCs w:val="18"/>
+        </w:rPr>
+        <w:t xml:space="preserve">        r_id = row['run_id']</w:t>
+      </w:r>
+    </w:p>
+    <w:p>
+      <w:pPr>
+        <w:keepNext/>
+        <w:keepLines/>
+        <w:pBdr>
+          <w:left w:val="single" w:sz="12" w:space="8" w:color="1F3A5F"/>
+        </w:pBdr>
+        <w:shd w:val="clear" w:color="auto" w:fill="F4F6F8"/>
+        <w:ind w:left="200"/>
+      </w:pPr>
+      <w:r>
+        <w:rPr>
+          <w:rFonts w:ascii="Courier New" w:eastAsia="Courier New" w:hAnsi="Courier New" w:cs="Courier New"/>
+          <w:sz w:val="18"/>
+          <w:szCs w:val="18"/>
+        </w:rPr>
+        <w:t xml:space="preserve">        status = row['status']</w:t>
+      </w:r>
+    </w:p>
+    <w:p>
+      <w:pPr>
+        <w:keepNext/>
+        <w:keepLines/>
+        <w:pBdr>
+          <w:left w:val="single" w:sz="12" w:space="8" w:color="1F3A5F"/>
+        </w:pBdr>
+        <w:shd w:val="clear" w:color="auto" w:fill="F4F6F8"/>
+        <w:ind w:left="200"/>
+      </w:pPr>
+      <w:r>
+        <w:rPr>
+          <w:rFonts w:ascii="Courier New" w:eastAsia="Courier New" w:hAnsi="Courier New" w:cs="Courier New"/>
+          <w:sz w:val="18"/>
+          <w:szCs w:val="18"/>
+        </w:rPr>
+        <w:t xml:space="preserve">        if status == 'no_base':</w:t>
+      </w:r>
+    </w:p>
+    <w:p>
+      <w:pPr>
+        <w:keepNext/>
+        <w:keepLines/>
+        <w:pBdr>
+          <w:left w:val="single" w:sz="12" w:space="8" w:color="1F3A5F"/>
+        </w:pBdr>
+        <w:shd w:val="clear" w:color="auto" w:fill="F4F6F8"/>
+        <w:ind w:left="200"/>
+      </w:pPr>
+      <w:r>
+        <w:rPr>
+          <w:rFonts w:ascii="Courier New" w:eastAsia="Courier New" w:hAnsi="Courier New" w:cs="Courier New"/>
+          <w:sz w:val="18"/>
+          <w:szCs w:val="18"/>
+        </w:rPr>
+        <w:t xml:space="preserve">            continue</w:t>
+      </w:r>
+    </w:p>
+    <w:p>
+      <w:pPr>
+        <w:keepNext/>
+        <w:keepLines/>
+        <w:pBdr>
+          <w:left w:val="single" w:sz="12" w:space="8" w:color="1F3A5F"/>
+        </w:pBdr>
+        <w:shd w:val="clear" w:color="auto" w:fill="F4F6F8"/>
+        <w:ind w:left="200"/>
+      </w:pPr>
+      <w:r>
+        <w:rPr>
+          <w:rFonts w:ascii="Courier New" w:eastAsia="Courier New" w:hAnsi="Courier New" w:cs="Courier New"/>
+          <w:sz w:val="18"/>
+          <w:szCs w:val="18"/>
+        </w:rPr>
+        <w:t xml:space="preserve">        if r_id not in runs_with_head_outcomes:</w:t>
+      </w:r>
+    </w:p>
+    <w:p>
+      <w:pPr>
+        <w:keepNext/>
+        <w:keepLines/>
+        <w:pBdr>
+          <w:left w:val="single" w:sz="12" w:space="8" w:color="1F3A5F"/>
+        </w:pBdr>
+        <w:shd w:val="clear" w:color="auto" w:fill="F4F6F8"/>
+        <w:ind w:left="200"/>
+      </w:pPr>
+      <w:r>
+        <w:rPr>
+          <w:rFonts w:ascii="Courier New" w:eastAsia="Courier New" w:hAnsi="Courier New" w:cs="Courier New"/>
+          <w:sz w:val="18"/>
+          <w:szCs w:val="18"/>
+        </w:rPr>
+        <w:t xml:space="preserve">            head_no_tests_count += 1</w:t>
+      </w:r>
+    </w:p>
+    <w:p>
+      <w:pPr>
+        <w:keepNext/>
+        <w:keepLines/>
+        <w:pBdr>
+          <w:left w:val="single" w:sz="12" w:space="8" w:color="1F3A5F"/>
+        </w:pBdr>
+        <w:shd w:val="clear" w:color="auto" w:fill="F4F6F8"/>
+        <w:ind w:left="200"/>
+      </w:pPr>
+      <w:r>
+        <w:rPr>
+          <w:rFonts w:ascii="Courier New" w:eastAsia="Courier New" w:hAnsi="Courier New" w:cs="Courier New"/>
+          <w:sz w:val="18"/>
+          <w:szCs w:val="18"/>
+        </w:rPr>
+        <w:t xml:space="preserve">            continue</w:t>
+      </w:r>
+    </w:p>
+    <w:p>
+      <w:pPr>
+        <w:keepNext/>
+        <w:keepLines/>
+        <w:pBdr>
+          <w:left w:val="single" w:sz="12" w:space="8" w:color="1F3A5F"/>
+        </w:pBdr>
+        <w:shd w:val="clear" w:color="auto" w:fill="F4F6F8"/>
+        <w:ind w:left="200"/>
+      </w:pPr>
+      <w:r>
+        <w:rPr>
+          <w:rFonts w:ascii="Courier New" w:eastAsia="Courier New" w:hAnsi="Courier New" w:cs="Courier New"/>
+          <w:sz w:val="18"/>
+          <w:szCs w:val="18"/>
+        </w:rPr>
+        <w:t xml:space="preserve">        elif status == 'exact_green':</w:t>
+      </w:r>
+    </w:p>
+    <w:p>
+      <w:pPr>
+        <w:keepNext/>
+        <w:keepLines/>
+        <w:pBdr>
+          <w:left w:val="single" w:sz="12" w:space="8" w:color="1F3A5F"/>
+        </w:pBdr>
+        <w:shd w:val="clear" w:color="auto" w:fill="F4F6F8"/>
+        <w:ind w:left="200"/>
+      </w:pPr>
+      <w:r>
+        <w:rPr>
+          <w:rFonts w:ascii="Courier New" w:eastAsia="Courier New" w:hAnsi="Courier New" w:cs="Courier New"/>
+          <w:sz w:val="18"/>
+          <w:szCs w:val="18"/>
+        </w:rPr>
+        <w:t xml:space="preserve">            valid_runs.append(r_id)</w:t>
+      </w:r>
+    </w:p>
+    <w:p>
+      <w:pPr>
+        <w:keepNext/>
+        <w:keepLines/>
+        <w:pBdr>
+          <w:left w:val="single" w:sz="12" w:space="8" w:color="1F3A5F"/>
+        </w:pBdr>
+        <w:shd w:val="clear" w:color="auto" w:fill="F4F6F8"/>
+        <w:ind w:left="200"/>
+      </w:pPr>
+      <w:r>
+        <w:rPr>
+          <w:rFonts w:ascii="Courier New" w:eastAsia="Courier New" w:hAnsi="Courier New" w:cs="Courier New"/>
+          <w:sz w:val="18"/>
+          <w:szCs w:val="18"/>
+        </w:rPr>
+        <w:t xml:space="preserve">        elif status in ['exact', 'ancestor', 'branch_prior']:</w:t>
+      </w:r>
+    </w:p>
+    <w:p>
+      <w:pPr>
+        <w:keepNext/>
+        <w:keepLines/>
+        <w:pBdr>
+          <w:left w:val="single" w:sz="12" w:space="8" w:color="1F3A5F"/>
+        </w:pBdr>
+        <w:shd w:val="clear" w:color="auto" w:fill="F4F6F8"/>
+        <w:ind w:left="200"/>
+      </w:pPr>
+      <w:r>
+        <w:rPr>
+          <w:rFonts w:ascii="Courier New" w:eastAsia="Courier New" w:hAnsi="Courier New" w:cs="Courier New"/>
+          <w:sz w:val="18"/>
+          <w:szCs w:val="18"/>
+        </w:rPr>
+        <w:t xml:space="preserve">            if r_id in runs_with_base_outcomes:</w:t>
+      </w:r>
+    </w:p>
+    <w:p>
+      <w:pPr>
+        <w:keepNext/>
+        <w:keepLines/>
+        <w:pBdr>
+          <w:left w:val="single" w:sz="12" w:space="8" w:color="1F3A5F"/>
+        </w:pBdr>
+        <w:shd w:val="clear" w:color="auto" w:fill="F4F6F8"/>
+        <w:ind w:left="200"/>
+      </w:pPr>
+      <w:r>
+        <w:rPr>
+          <w:rFonts w:ascii="Courier New" w:eastAsia="Courier New" w:hAnsi="Courier New" w:cs="Courier New"/>
+          <w:sz w:val="18"/>
+          <w:szCs w:val="18"/>
+        </w:rPr>
+        <w:t xml:space="preserve">                valid_runs.append(r_id)</w:t>
+      </w:r>
+    </w:p>
+    <w:p>
+      <w:pPr>
+        <w:keepNext/>
+        <w:keepLines/>
+        <w:pBdr>
+          <w:left w:val="single" w:sz="12" w:space="8" w:color="1F3A5F"/>
+        </w:pBdr>
+        <w:shd w:val="clear" w:color="auto" w:fill="F4F6F8"/>
+        <w:ind w:left="200"/>
+      </w:pPr>
+      <w:r>
+        <w:rPr>
+          <w:rFonts w:ascii="Courier New" w:eastAsia="Courier New" w:hAnsi="Courier New" w:cs="Courier New"/>
+          <w:sz w:val="18"/>
+          <w:szCs w:val="18"/>
+        </w:rPr>
+        <w:t xml:space="preserve">            else:</w:t>
+      </w:r>
+    </w:p>
+    <w:p>
+      <w:pPr>
+        <w:keepNext/>
+        <w:keepLines/>
+        <w:pBdr>
+          <w:left w:val="single" w:sz="12" w:space="8" w:color="1F3A5F"/>
+        </w:pBdr>
+        <w:shd w:val="clear" w:color="auto" w:fill="F4F6F8"/>
+        <w:ind w:left="200"/>
+      </w:pPr>
+      <w:r>
+        <w:rPr>
+          <w:rFonts w:ascii="Courier New" w:eastAsia="Courier New" w:hAnsi="Courier New" w:cs="Courier New"/>
+          <w:sz w:val="18"/>
+          <w:szCs w:val="18"/>
+        </w:rPr>
+        <w:t xml:space="preserve">                no_output_count += 1</w:t>
+      </w:r>
+    </w:p>
+    <w:p>
+      <w:pPr>
+        <w:keepNext/>
+        <w:keepLines/>
+        <w:pBdr>
+          <w:left w:val="single" w:sz="12" w:space="8" w:color="1F3A5F"/>
+        </w:pBdr>
+        <w:shd w:val="clear" w:color="auto" w:fill="F4F6F8"/>
+        <w:ind w:left="200"/>
+      </w:pPr>
+      <w:r>
+        <w:rPr>
+          <w:rFonts w:ascii="Courier New" w:eastAsia="Courier New" w:hAnsi="Courier New" w:cs="Courier New"/>
+          <w:sz w:val="18"/>
+          <w:szCs w:val="18"/>
+        </w:rPr>
+        <w:t xml:space="preserve">    ...</w:t>
+      </w:r>
+    </w:p>
+    <w:p>
+      <w:pPr>
+        <w:keepNext/>
+        <w:keepLines/>
+        <w:pBdr>
+          <w:left w:val="single" w:sz="12" w:space="8" w:color="1F3A5F"/>
+        </w:pBdr>
+        <w:shd w:val="clear" w:color="auto" w:fill="F4F6F8"/>
+        <w:ind w:left="200"/>
+      </w:pPr>
+      <w:r>
+        <w:rPr>
+          <w:rFonts w:ascii="Courier New" w:eastAsia="Courier New" w:hAnsi="Courier New" w:cs="Courier New"/>
+          <w:sz w:val="18"/>
+          <w:szCs w:val="18"/>
+        </w:rPr>
+        <w:t xml:space="preserve">    relaxed_labels = head_labels[~head_labels['in_base']][['run_id', 'test_id']].copy()</w:t>
+      </w:r>
+    </w:p>
+    <w:p>
+      <w:pPr>
+        <w:keepNext/>
+        <w:keepLines/>
+        <w:pBdr>
+          <w:left w:val="single" w:sz="12" w:space="8" w:color="1F3A5F"/>
+        </w:pBdr>
+        <w:shd w:val="clear" w:color="auto" w:fill="F4F6F8"/>
+        <w:ind w:left="200"/>
+      </w:pPr>
+      <w:r>
+        <w:rPr>
+          <w:rFonts w:ascii="Courier New" w:eastAsia="Courier New" w:hAnsi="Courier New" w:cs="Courier New"/>
+          <w:sz w:val="18"/>
+          <w:szCs w:val="18"/>
+        </w:rPr>
+        <w:t xml:space="preserve">    ...</w:t>
+      </w:r>
+    </w:p>
+    <w:p>
+      <w:pPr>
+        <w:keepNext/>
+        <w:keepLines/>
+        <w:pBdr>
+          <w:left w:val="single" w:sz="12" w:space="8" w:color="1F3A5F"/>
+        </w:pBdr>
+        <w:shd w:val="clear" w:color="auto" w:fill="F4F6F8"/>
+        <w:ind w:left="200"/>
+      </w:pPr>
+      <w:r>
+        <w:rPr>
+          <w:rFonts w:ascii="Courier New" w:eastAsia="Courier New" w:hAnsi="Courier New" w:cs="Courier New"/>
+          <w:sz w:val="18"/>
+          <w:szCs w:val="18"/>
+        </w:rPr>
+        <w:t xml:space="preserve">        strict_mask = ~relaxed_labels.apply(is_flaky, axis=1)</w:t>
+      </w:r>
+    </w:p>
+    <w:p>
+      <w:pPr>
+        <w:keepLines/>
+        <w:pBdr>
+          <w:left w:val="single" w:sz="12" w:space="8" w:color="1F3A5F"/>
+        </w:pBdr>
+        <w:shd w:val="clear" w:color="auto" w:fill="F4F6F8"/>
+        <w:ind w:left="200"/>
+      </w:pPr>
+      <w:r>
+        <w:rPr>
+          <w:rFonts w:ascii="Courier New" w:eastAsia="Courier New" w:hAnsi="Courier New" w:cs="Courier New"/>
+          <w:sz w:val="18"/>
+          <w:szCs w:val="18"/>
+        </w:rPr>
+        <w:t xml:space="preserve">        strict_labels = relaxed_labels[strict_mask][['run_id', 'test_id']].copy()</w:t>
       </w:r>
     </w:p>
     <w:p>
@@ -41187,10 +41659,439 @@
         <w:jc w:val="both"/>
       </w:pPr>
       <w:r>
-        <w:rPr>
-          <w:highlight w:val="yellow"/>
-        </w:rPr>
-        <w:t>[Insert the freshness-guard excerpt from the repository.]</w:t>
+        <w:t xml:space="preserve">The corresponding excerpt from the repository (analysis/check_freshness.py) compares the modification time of each derived artifact with each of its inputs and reports every artifact that is older; make tables runs it first.</w:t>
+      </w:r>
+    </w:p>
+    <w:p>
+      <w:pPr>
+        <w:keepNext/>
+        <w:spacing w:before="160" w:after="60"/>
+      </w:pPr>
+      <w:r>
+        <w:rPr>
+          <w:i/>
+          <w:iCs/>
+          <w:sz w:val="20"/>
+          <w:szCs w:val="20"/>
+        </w:rPr>
+        <w:t>Listing A.3b Excerpt from analysis/check_freshness.py</w:t>
+      </w:r>
+    </w:p>
+    <w:p>
+      <w:pPr>
+        <w:keepNext/>
+        <w:keepLines/>
+        <w:pBdr>
+          <w:left w:val="single" w:sz="12" w:space="8" w:color="1F3A5F"/>
+        </w:pBdr>
+        <w:shd w:val="clear" w:color="auto" w:fill="F4F6F8"/>
+        <w:ind w:left="200"/>
+      </w:pPr>
+      <w:r>
+        <w:rPr>
+          <w:rFonts w:ascii="Courier New" w:eastAsia="Courier New" w:hAnsi="Courier New" w:cs="Courier New"/>
+          <w:sz w:val="18"/>
+          <w:szCs w:val="18"/>
+        </w:rPr>
+        <w:t xml:space="preserve">    for artifact, inputs in sorted(table.items()):</w:t>
+      </w:r>
+    </w:p>
+    <w:p>
+      <w:pPr>
+        <w:keepNext/>
+        <w:keepLines/>
+        <w:pBdr>
+          <w:left w:val="single" w:sz="12" w:space="8" w:color="1F3A5F"/>
+        </w:pBdr>
+        <w:shd w:val="clear" w:color="auto" w:fill="F4F6F8"/>
+        <w:ind w:left="200"/>
+      </w:pPr>
+      <w:r>
+        <w:rPr>
+          <w:rFonts w:ascii="Courier New" w:eastAsia="Courier New" w:hAnsi="Courier New" w:cs="Courier New"/>
+          <w:sz w:val="18"/>
+          <w:szCs w:val="18"/>
+        </w:rPr>
+        <w:t xml:space="preserve">        artifact_path = root / artifact</w:t>
+      </w:r>
+    </w:p>
+    <w:p>
+      <w:pPr>
+        <w:keepNext/>
+        <w:keepLines/>
+        <w:pBdr>
+          <w:left w:val="single" w:sz="12" w:space="8" w:color="1F3A5F"/>
+        </w:pBdr>
+        <w:shd w:val="clear" w:color="auto" w:fill="F4F6F8"/>
+        <w:ind w:left="200"/>
+      </w:pPr>
+      <w:r>
+        <w:rPr>
+          <w:rFonts w:ascii="Courier New" w:eastAsia="Courier New" w:hAnsi="Courier New" w:cs="Courier New"/>
+          <w:sz w:val="18"/>
+          <w:szCs w:val="18"/>
+        </w:rPr>
+        <w:t xml:space="preserve">        if not artifact_path.exists():</w:t>
+      </w:r>
+    </w:p>
+    <w:p>
+      <w:pPr>
+        <w:keepNext/>
+        <w:keepLines/>
+        <w:pBdr>
+          <w:left w:val="single" w:sz="12" w:space="8" w:color="1F3A5F"/>
+        </w:pBdr>
+        <w:shd w:val="clear" w:color="auto" w:fill="F4F6F8"/>
+        <w:ind w:left="200"/>
+      </w:pPr>
+      <w:r>
+        <w:rPr>
+          <w:rFonts w:ascii="Courier New" w:eastAsia="Courier New" w:hAnsi="Courier New" w:cs="Courier New"/>
+          <w:sz w:val="18"/>
+          <w:szCs w:val="18"/>
+        </w:rPr>
+        <w:t xml:space="preserve">            skipped.append(f"{artifact} (artifact absent)")</w:t>
+      </w:r>
+    </w:p>
+    <w:p>
+      <w:pPr>
+        <w:keepNext/>
+        <w:keepLines/>
+        <w:pBdr>
+          <w:left w:val="single" w:sz="12" w:space="8" w:color="1F3A5F"/>
+        </w:pBdr>
+        <w:shd w:val="clear" w:color="auto" w:fill="F4F6F8"/>
+        <w:ind w:left="200"/>
+      </w:pPr>
+      <w:r>
+        <w:rPr>
+          <w:rFonts w:ascii="Courier New" w:eastAsia="Courier New" w:hAnsi="Courier New" w:cs="Courier New"/>
+          <w:sz w:val="18"/>
+          <w:szCs w:val="18"/>
+        </w:rPr>
+        <w:t xml:space="preserve">            continue</w:t>
+      </w:r>
+    </w:p>
+    <w:p>
+      <w:pPr>
+        <w:keepNext/>
+        <w:keepLines/>
+        <w:pBdr>
+          <w:left w:val="single" w:sz="12" w:space="8" w:color="1F3A5F"/>
+        </w:pBdr>
+        <w:shd w:val="clear" w:color="auto" w:fill="F4F6F8"/>
+        <w:ind w:left="200"/>
+      </w:pPr>
+      <w:r>
+        <w:rPr>
+          <w:rFonts w:ascii="Courier New" w:eastAsia="Courier New" w:hAnsi="Courier New" w:cs="Courier New"/>
+          <w:sz w:val="18"/>
+          <w:szCs w:val="18"/>
+        </w:rPr>
+        <w:t xml:space="preserve">        artifact_mtime = artifact_path.stat().st_mtime_ns</w:t>
+      </w:r>
+    </w:p>
+    <w:p>
+      <w:pPr>
+        <w:keepNext/>
+        <w:keepLines/>
+        <w:pBdr>
+          <w:left w:val="single" w:sz="12" w:space="8" w:color="1F3A5F"/>
+        </w:pBdr>
+        <w:shd w:val="clear" w:color="auto" w:fill="F4F6F8"/>
+        <w:ind w:left="200"/>
+      </w:pPr>
+      <w:r>
+        <w:rPr>
+          <w:rFonts w:ascii="Courier New" w:eastAsia="Courier New" w:hAnsi="Courier New" w:cs="Courier New"/>
+          <w:sz w:val="18"/>
+          <w:szCs w:val="18"/>
+        </w:rPr>
+        <w:t xml:space="preserve">        for input_name in inputs:</w:t>
+      </w:r>
+    </w:p>
+    <w:p>
+      <w:pPr>
+        <w:keepNext/>
+        <w:keepLines/>
+        <w:pBdr>
+          <w:left w:val="single" w:sz="12" w:space="8" w:color="1F3A5F"/>
+        </w:pBdr>
+        <w:shd w:val="clear" w:color="auto" w:fill="F4F6F8"/>
+        <w:ind w:left="200"/>
+      </w:pPr>
+      <w:r>
+        <w:rPr>
+          <w:rFonts w:ascii="Courier New" w:eastAsia="Courier New" w:hAnsi="Courier New" w:cs="Courier New"/>
+          <w:sz w:val="18"/>
+          <w:szCs w:val="18"/>
+        </w:rPr>
+        <w:t xml:space="preserve">            input_path = root / input_name</w:t>
+      </w:r>
+    </w:p>
+    <w:p>
+      <w:pPr>
+        <w:keepNext/>
+        <w:keepLines/>
+        <w:pBdr>
+          <w:left w:val="single" w:sz="12" w:space="8" w:color="1F3A5F"/>
+        </w:pBdr>
+        <w:shd w:val="clear" w:color="auto" w:fill="F4F6F8"/>
+        <w:ind w:left="200"/>
+      </w:pPr>
+      <w:r>
+        <w:rPr>
+          <w:rFonts w:ascii="Courier New" w:eastAsia="Courier New" w:hAnsi="Courier New" w:cs="Courier New"/>
+          <w:sz w:val="18"/>
+          <w:szCs w:val="18"/>
+        </w:rPr>
+        <w:t xml:space="preserve">            if not input_path.exists():</w:t>
+      </w:r>
+    </w:p>
+    <w:p>
+      <w:pPr>
+        <w:keepNext/>
+        <w:keepLines/>
+        <w:pBdr>
+          <w:left w:val="single" w:sz="12" w:space="8" w:color="1F3A5F"/>
+        </w:pBdr>
+        <w:shd w:val="clear" w:color="auto" w:fill="F4F6F8"/>
+        <w:ind w:left="200"/>
+      </w:pPr>
+      <w:r>
+        <w:rPr>
+          <w:rFonts w:ascii="Courier New" w:eastAsia="Courier New" w:hAnsi="Courier New" w:cs="Courier New"/>
+          <w:sz w:val="18"/>
+          <w:szCs w:val="18"/>
+        </w:rPr>
+        <w:t xml:space="preserve">                skipped.append(f"{artifact} &lt;- {input_name} (input absent)")</w:t>
+      </w:r>
+    </w:p>
+    <w:p>
+      <w:pPr>
+        <w:keepNext/>
+        <w:keepLines/>
+        <w:pBdr>
+          <w:left w:val="single" w:sz="12" w:space="8" w:color="1F3A5F"/>
+        </w:pBdr>
+        <w:shd w:val="clear" w:color="auto" w:fill="F4F6F8"/>
+        <w:ind w:left="200"/>
+      </w:pPr>
+      <w:r>
+        <w:rPr>
+          <w:rFonts w:ascii="Courier New" w:eastAsia="Courier New" w:hAnsi="Courier New" w:cs="Courier New"/>
+          <w:sz w:val="18"/>
+          <w:szCs w:val="18"/>
+        </w:rPr>
+        <w:t xml:space="preserve">                continue</w:t>
+      </w:r>
+    </w:p>
+    <w:p>
+      <w:pPr>
+        <w:keepNext/>
+        <w:keepLines/>
+        <w:pBdr>
+          <w:left w:val="single" w:sz="12" w:space="8" w:color="1F3A5F"/>
+        </w:pBdr>
+        <w:shd w:val="clear" w:color="auto" w:fill="F4F6F8"/>
+        <w:ind w:left="200"/>
+      </w:pPr>
+      <w:r>
+        <w:rPr>
+          <w:rFonts w:ascii="Courier New" w:eastAsia="Courier New" w:hAnsi="Courier New" w:cs="Courier New"/>
+          <w:sz w:val="18"/>
+          <w:szCs w:val="18"/>
+        </w:rPr>
+        <w:t xml:space="preserve">            input_mtime = input_path.stat().st_mtime_ns</w:t>
+      </w:r>
+    </w:p>
+    <w:p>
+      <w:pPr>
+        <w:keepNext/>
+        <w:keepLines/>
+        <w:pBdr>
+          <w:left w:val="single" w:sz="12" w:space="8" w:color="1F3A5F"/>
+        </w:pBdr>
+        <w:shd w:val="clear" w:color="auto" w:fill="F4F6F8"/>
+        <w:ind w:left="200"/>
+      </w:pPr>
+      <w:r>
+        <w:rPr>
+          <w:rFonts w:ascii="Courier New" w:eastAsia="Courier New" w:hAnsi="Courier New" w:cs="Courier New"/>
+          <w:sz w:val="18"/>
+          <w:szCs w:val="18"/>
+        </w:rPr>
+        <w:t xml:space="preserve">            if artifact_mtime &lt; input_mtime:</w:t>
+      </w:r>
+    </w:p>
+    <w:p>
+      <w:pPr>
+        <w:keepNext/>
+        <w:keepLines/>
+        <w:pBdr>
+          <w:left w:val="single" w:sz="12" w:space="8" w:color="1F3A5F"/>
+        </w:pBdr>
+        <w:shd w:val="clear" w:color="auto" w:fill="F4F6F8"/>
+        <w:ind w:left="200"/>
+      </w:pPr>
+      <w:r>
+        <w:rPr>
+          <w:rFonts w:ascii="Courier New" w:eastAsia="Courier New" w:hAnsi="Courier New" w:cs="Courier New"/>
+          <w:sz w:val="18"/>
+          <w:szCs w:val="18"/>
+        </w:rPr>
+        <w:t xml:space="preserve">                findings.append(</w:t>
+      </w:r>
+    </w:p>
+    <w:p>
+      <w:pPr>
+        <w:keepNext/>
+        <w:keepLines/>
+        <w:pBdr>
+          <w:left w:val="single" w:sz="12" w:space="8" w:color="1F3A5F"/>
+        </w:pBdr>
+        <w:shd w:val="clear" w:color="auto" w:fill="F4F6F8"/>
+        <w:ind w:left="200"/>
+      </w:pPr>
+      <w:r>
+        <w:rPr>
+          <w:rFonts w:ascii="Courier New" w:eastAsia="Courier New" w:hAnsi="Courier New" w:cs="Courier New"/>
+          <w:sz w:val="18"/>
+          <w:szCs w:val="18"/>
+        </w:rPr>
+        <w:t xml:space="preserve">                    Staleness(</w:t>
+      </w:r>
+    </w:p>
+    <w:p>
+      <w:pPr>
+        <w:keepNext/>
+        <w:keepLines/>
+        <w:pBdr>
+          <w:left w:val="single" w:sz="12" w:space="8" w:color="1F3A5F"/>
+        </w:pBdr>
+        <w:shd w:val="clear" w:color="auto" w:fill="F4F6F8"/>
+        <w:ind w:left="200"/>
+      </w:pPr>
+      <w:r>
+        <w:rPr>
+          <w:rFonts w:ascii="Courier New" w:eastAsia="Courier New" w:hAnsi="Courier New" w:cs="Courier New"/>
+          <w:sz w:val="18"/>
+          <w:szCs w:val="18"/>
+        </w:rPr>
+        <w:t xml:space="preserve">                        artifact=artifact,</w:t>
+      </w:r>
+    </w:p>
+    <w:p>
+      <w:pPr>
+        <w:keepNext/>
+        <w:keepLines/>
+        <w:pBdr>
+          <w:left w:val="single" w:sz="12" w:space="8" w:color="1F3A5F"/>
+        </w:pBdr>
+        <w:shd w:val="clear" w:color="auto" w:fill="F4F6F8"/>
+        <w:ind w:left="200"/>
+      </w:pPr>
+      <w:r>
+        <w:rPr>
+          <w:rFonts w:ascii="Courier New" w:eastAsia="Courier New" w:hAnsi="Courier New" w:cs="Courier New"/>
+          <w:sz w:val="18"/>
+          <w:szCs w:val="18"/>
+        </w:rPr>
+        <w:t xml:space="preserve">                        artifact_mtime_ns=artifact_mtime,</w:t>
+      </w:r>
+    </w:p>
+    <w:p>
+      <w:pPr>
+        <w:keepNext/>
+        <w:keepLines/>
+        <w:pBdr>
+          <w:left w:val="single" w:sz="12" w:space="8" w:color="1F3A5F"/>
+        </w:pBdr>
+        <w:shd w:val="clear" w:color="auto" w:fill="F4F6F8"/>
+        <w:ind w:left="200"/>
+      </w:pPr>
+      <w:r>
+        <w:rPr>
+          <w:rFonts w:ascii="Courier New" w:eastAsia="Courier New" w:hAnsi="Courier New" w:cs="Courier New"/>
+          <w:sz w:val="18"/>
+          <w:szCs w:val="18"/>
+        </w:rPr>
+        <w:t xml:space="preserve">                        input_name=input_name,</w:t>
+      </w:r>
+    </w:p>
+    <w:p>
+      <w:pPr>
+        <w:keepNext/>
+        <w:keepLines/>
+        <w:pBdr>
+          <w:left w:val="single" w:sz="12" w:space="8" w:color="1F3A5F"/>
+        </w:pBdr>
+        <w:shd w:val="clear" w:color="auto" w:fill="F4F6F8"/>
+        <w:ind w:left="200"/>
+      </w:pPr>
+      <w:r>
+        <w:rPr>
+          <w:rFonts w:ascii="Courier New" w:eastAsia="Courier New" w:hAnsi="Courier New" w:cs="Courier New"/>
+          <w:sz w:val="18"/>
+          <w:szCs w:val="18"/>
+        </w:rPr>
+        <w:t xml:space="preserve">                        input_mtime_ns=input_mtime,</w:t>
+      </w:r>
+    </w:p>
+    <w:p>
+      <w:pPr>
+        <w:keepNext/>
+        <w:keepLines/>
+        <w:pBdr>
+          <w:left w:val="single" w:sz="12" w:space="8" w:color="1F3A5F"/>
+        </w:pBdr>
+        <w:shd w:val="clear" w:color="auto" w:fill="F4F6F8"/>
+        <w:ind w:left="200"/>
+      </w:pPr>
+      <w:r>
+        <w:rPr>
+          <w:rFonts w:ascii="Courier New" w:eastAsia="Courier New" w:hAnsi="Courier New" w:cs="Courier New"/>
+          <w:sz w:val="18"/>
+          <w:szCs w:val="18"/>
+        </w:rPr>
+        <w:t xml:space="preserve">                    )</w:t>
+      </w:r>
+    </w:p>
+    <w:p>
+      <w:pPr>
+        <w:keepNext/>
+        <w:keepLines/>
+        <w:pBdr>
+          <w:left w:val="single" w:sz="12" w:space="8" w:color="1F3A5F"/>
+        </w:pBdr>
+        <w:shd w:val="clear" w:color="auto" w:fill="F4F6F8"/>
+        <w:ind w:left="200"/>
+      </w:pPr>
+      <w:r>
+        <w:rPr>
+          <w:rFonts w:ascii="Courier New" w:eastAsia="Courier New" w:hAnsi="Courier New" w:cs="Courier New"/>
+          <w:sz w:val="18"/>
+          <w:szCs w:val="18"/>
+        </w:rPr>
+        <w:t xml:space="preserve">                )</w:t>
+      </w:r>
+    </w:p>
+    <w:p>
+      <w:pPr>
+        <w:keepLines/>
+        <w:pBdr>
+          <w:left w:val="single" w:sz="12" w:space="8" w:color="1F3A5F"/>
+        </w:pBdr>
+        <w:shd w:val="clear" w:color="auto" w:fill="F4F6F8"/>
+        <w:ind w:left="200"/>
+      </w:pPr>
+      <w:r>
+        <w:rPr>
+          <w:rFonts w:ascii="Courier New" w:eastAsia="Courier New" w:hAnsi="Courier New" w:cs="Courier New"/>
+          <w:sz w:val="18"/>
+          <w:szCs w:val="18"/>
+        </w:rPr>
+        <w:t xml:space="preserve">    return findings, skipped</w:t>
       </w:r>
     </w:p>
     <w:p>
@@ -41335,10 +42236,135 @@
         <w:jc w:val="both"/>
       </w:pPr>
       <w:r>
-        <w:rPr>
-          <w:highlight w:val="yellow"/>
-        </w:rPr>
-        <w:t xml:space="preserve">[Insert a short usage example of normalize_test_id() from the repository, showing one Java and one pytest input and their canonical outputs.]</w:t>
+        <w:t xml:space="preserve">Listing A.5 shows normalize_test_id() on one Java and one pytest identifier taken from the corpus, and on a Gradle console line from the contract tests; each output is the canonical test_id (class#method for Java, path::name for Python), with parameters removed.</w:t>
+      </w:r>
+    </w:p>
+    <w:p>
+      <w:pPr>
+        <w:keepNext/>
+        <w:spacing w:before="160" w:after="60"/>
+      </w:pPr>
+      <w:r>
+        <w:rPr>
+          <w:i/>
+          <w:iCs/>
+          <w:sz w:val="20"/>
+          <w:szCs w:val="20"/>
+        </w:rPr>
+        <w:t>Listing A.5 normalize_test_id() inputs and canonical outputs (src/parse/test_ids.py)</w:t>
+      </w:r>
+    </w:p>
+    <w:p>
+      <w:pPr>
+        <w:keepNext/>
+        <w:keepLines/>
+        <w:pBdr>
+          <w:left w:val="single" w:sz="12" w:space="8" w:color="1F3A5F"/>
+        </w:pBdr>
+        <w:shd w:val="clear" w:color="auto" w:fill="F4F6F8"/>
+        <w:ind w:left="200"/>
+      </w:pPr>
+      <w:r>
+        <w:rPr>
+          <w:rFonts w:ascii="Courier New" w:eastAsia="Courier New" w:hAnsi="Courier New" w:cs="Courier New"/>
+          <w:sz w:val="18"/>
+          <w:szCs w:val="18"/>
+        </w:rPr>
+        <w:t xml:space="preserve">org.apache.zeppelin.integration.PersonalizeActionsIT#testDynamicFormAction</w:t>
+      </w:r>
+    </w:p>
+    <w:p>
+      <w:pPr>
+        <w:keepNext/>
+        <w:keepLines/>
+        <w:pBdr>
+          <w:left w:val="single" w:sz="12" w:space="8" w:color="1F3A5F"/>
+        </w:pBdr>
+        <w:shd w:val="clear" w:color="auto" w:fill="F4F6F8"/>
+        <w:ind w:left="200"/>
+      </w:pPr>
+      <w:r>
+        <w:rPr>
+          <w:rFonts w:ascii="Courier New" w:eastAsia="Courier New" w:hAnsi="Courier New" w:cs="Courier New"/>
+          <w:sz w:val="18"/>
+          <w:szCs w:val="18"/>
+        </w:rPr>
+        <w:t xml:space="preserve">  -&gt; org.apache.zeppelin.integration.PersonalizeActionsIT#testDynamicFormAction</w:t>
+      </w:r>
+    </w:p>
+    <w:p>
+      <w:pPr>
+        <w:keepNext/>
+        <w:keepLines/>
+        <w:pBdr>
+          <w:left w:val="single" w:sz="12" w:space="8" w:color="1F3A5F"/>
+        </w:pBdr>
+        <w:shd w:val="clear" w:color="auto" w:fill="F4F6F8"/>
+        <w:ind w:left="200"/>
+      </w:pPr>
+      <w:r>
+        <w:rPr>
+          <w:rFonts w:ascii="Courier New" w:eastAsia="Courier New" w:hAnsi="Courier New" w:cs="Courier New"/>
+          <w:sz w:val="18"/>
+          <w:szCs w:val="18"/>
+        </w:rPr>
+        <w:t xml:space="preserve">tests/ops/test_parallax.py::test_parallel</w:t>
+      </w:r>
+    </w:p>
+    <w:p>
+      <w:pPr>
+        <w:keepNext/>
+        <w:keepLines/>
+        <w:pBdr>
+          <w:left w:val="single" w:sz="12" w:space="8" w:color="1F3A5F"/>
+        </w:pBdr>
+        <w:shd w:val="clear" w:color="auto" w:fill="F4F6F8"/>
+        <w:ind w:left="200"/>
+      </w:pPr>
+      <w:r>
+        <w:rPr>
+          <w:rFonts w:ascii="Courier New" w:eastAsia="Courier New" w:hAnsi="Courier New" w:cs="Courier New"/>
+          <w:sz w:val="18"/>
+          <w:szCs w:val="18"/>
+        </w:rPr>
+        <w:t xml:space="preserve">  -&gt; tests/ops/test_parallax.py::test_parallel</w:t>
+      </w:r>
+    </w:p>
+    <w:p>
+      <w:pPr>
+        <w:keepNext/>
+        <w:keepLines/>
+        <w:pBdr>
+          <w:left w:val="single" w:sz="12" w:space="8" w:color="1F3A5F"/>
+        </w:pBdr>
+        <w:shd w:val="clear" w:color="auto" w:fill="F4F6F8"/>
+        <w:ind w:left="200"/>
+      </w:pPr>
+      <w:r>
+        <w:rPr>
+          <w:rFonts w:ascii="Courier New" w:eastAsia="Courier New" w:hAnsi="Courier New" w:cs="Courier New"/>
+          <w:sz w:val="18"/>
+          <w:szCs w:val="18"/>
+        </w:rPr>
+        <w:t xml:space="preserve">com.example.FooTest &gt; testBar(String) [1] FAILED</w:t>
+      </w:r>
+    </w:p>
+    <w:p>
+      <w:pPr>
+        <w:keepLines/>
+        <w:pBdr>
+          <w:left w:val="single" w:sz="12" w:space="8" w:color="1F3A5F"/>
+        </w:pBdr>
+        <w:shd w:val="clear" w:color="auto" w:fill="F4F6F8"/>
+        <w:ind w:left="200"/>
+      </w:pPr>
+      <w:r>
+        <w:rPr>
+          <w:rFonts w:ascii="Courier New" w:eastAsia="Courier New" w:hAnsi="Courier New" w:cs="Courier New"/>
+          <w:sz w:val="18"/>
+          <w:szCs w:val="18"/>
+        </w:rPr>
+        <w:t xml:space="preserve">  -&gt; com.example.FooTest#testBar</w:t>
       </w:r>
     </w:p>
     <w:p>
@@ -42228,7 +43254,7 @@
         <w:rPr>
           <w:highlight w:val="yellow"/>
         </w:rPr>
-        <w:t>[Insert additional screenshots here if required: further dashboard panels, sample parsed-outcome rows and a sample release-bundle file listing.]</w:t>
+        <w:t>[Insert screenshots: demo site Overview tab and demo site Live run blast-radius picture (files docs/screenshots/figA8_demo_overview.png and figA8_demo_liverun.png).]</w:t>
       </w:r>
     </w:p>
     <w:sectPr>

</xml_diff>

<commit_message>
paper: embed real dashboard and demo captures, fix author lists, record MIT licence
</commit_message>
<xml_diff>
--- a/BlastRadius_Project1_Report.docx
+++ b/BlastRadius_Project1_Report.docx
@@ -31354,20 +31354,99 @@
     <w:p>
       <w:pPr>
         <w:keepNext/>
-        <w:pBdr>
-          <w:left w:val="dashed" w:sz="8" w:space="6" w:color="7F7F7F"/>
-          <w:right w:val="dashed" w:sz="8" w:space="6" w:color="7F7F7F"/>
-        </w:pBdr>
-        <w:spacing w:line="276" w:lineRule="auto"/>
+        <w:spacing w:before="200" w:after="60"/>
         <w:jc w:val="center"/>
       </w:pPr>
       <w:r>
         <w:rPr>
-          <w:sz w:val="22"/>
-          <w:szCs w:val="22"/>
-          <w:highlight w:val="yellow"/>
-        </w:rPr>
-        <w:t>[Insert screenshot: dashboard panels]</w:t>
+          <w:noProof/>
+        </w:rPr>
+        <w:drawing>
+          <wp:inline distT="0" distB="0" distL="0" distR="0">
+            <wp:extent cx="4297680" cy="5924658"/>
+            <wp:effectExtent l="0" t="0" r="0" b="0"/>
+            <wp:docPr id="9400" name="fig6_4a_dashboard" descr="fig6_4a_dashboard"/>
+            <wp:cNvGraphicFramePr>
+              <a:graphicFrameLocks xmlns:a="http://schemas.openxmlformats.org/drawingml/2006/main" noChangeAspect="1"/>
+            </wp:cNvGraphicFramePr>
+            <a:graphic xmlns:a="http://schemas.openxmlformats.org/drawingml/2006/main">
+              <a:graphicData uri="http://schemas.openxmlformats.org/drawingml/2006/picture">
+                <pic:pic xmlns:pic="http://schemas.openxmlformats.org/drawingml/2006/picture">
+                  <pic:nvPicPr>
+                    <pic:cNvPr id="0" name=""/>
+                    <pic:cNvPicPr>
+                      <a:picLocks noChangeAspect="1"/>
+                    </pic:cNvPicPr>
+                  </pic:nvPicPr>
+                  <pic:blipFill>
+                    <a:blip r:embed="rIdBRfig6_4a_dashboard"/>
+                    <a:stretch>
+                      <a:fillRect/>
+                    </a:stretch>
+                  </pic:blipFill>
+                  <pic:spPr>
+                    <a:xfrm>
+                      <a:off x="0" y="0"/>
+                      <a:ext cx="4297680" cy="5924658"/>
+                    </a:xfrm>
+                    <a:prstGeom prst="rect">
+                      <a:avLst/>
+                    </a:prstGeom>
+                  </pic:spPr>
+                </pic:pic>
+              </a:graphicData>
+            </a:graphic>
+          </wp:inline>
+        </w:drawing>
+      </w:r>
+    </w:p>
+    <w:p>
+      <w:pPr>
+        <w:keepNext/>
+        <w:spacing w:before="200" w:after="60"/>
+        <w:jc w:val="center"/>
+      </w:pPr>
+      <w:r>
+        <w:rPr>
+          <w:noProof/>
+        </w:rPr>
+        <w:drawing>
+          <wp:inline distT="0" distB="0" distL="0" distR="0">
+            <wp:extent cx="4297680" cy="5924658"/>
+            <wp:effectExtent l="0" t="0" r="0" b="0"/>
+            <wp:docPr id="9561" name="fig6_4b_dashboard" descr="fig6_4b_dashboard"/>
+            <wp:cNvGraphicFramePr>
+              <a:graphicFrameLocks xmlns:a="http://schemas.openxmlformats.org/drawingml/2006/main" noChangeAspect="1"/>
+            </wp:cNvGraphicFramePr>
+            <a:graphic xmlns:a="http://schemas.openxmlformats.org/drawingml/2006/main">
+              <a:graphicData uri="http://schemas.openxmlformats.org/drawingml/2006/picture">
+                <pic:pic xmlns:pic="http://schemas.openxmlformats.org/drawingml/2006/picture">
+                  <pic:nvPicPr>
+                    <pic:cNvPr id="0" name=""/>
+                    <pic:cNvPicPr>
+                      <a:picLocks noChangeAspect="1"/>
+                    </pic:cNvPicPr>
+                  </pic:nvPicPr>
+                  <pic:blipFill>
+                    <a:blip r:embed="rIdBRfig6_4b_dashboard"/>
+                    <a:stretch>
+                      <a:fillRect/>
+                    </a:stretch>
+                  </pic:blipFill>
+                  <pic:spPr>
+                    <a:xfrm>
+                      <a:off x="0" y="0"/>
+                      <a:ext cx="4297680" cy="5924658"/>
+                    </a:xfrm>
+                    <a:prstGeom prst="rect">
+                      <a:avLst/>
+                    </a:prstGeom>
+                  </pic:spPr>
+                </pic:pic>
+              </a:graphicData>
+            </a:graphic>
+          </wp:inline>
+        </w:drawing>
       </w:r>
     </w:p>
     <w:p>
@@ -43246,6 +43325,77 @@
     </w:p>
     <w:p>
       <w:pPr>
+        <w:keepNext/>
+        <w:spacing w:before="200" w:after="60"/>
+        <w:jc w:val="center"/>
+      </w:pPr>
+      <w:r>
+        <w:rPr>
+          <w:noProof/>
+        </w:rPr>
+        <w:drawing>
+          <wp:inline distT="0" distB="0" distL="0" distR="0">
+            <wp:extent cx="5486400" cy="5369298"/>
+            <wp:effectExtent l="0" t="0" r="0" b="0"/>
+            <wp:docPr id="9726" name="figA8_demo_overview" descr="figA8_demo_overview"/>
+            <wp:cNvGraphicFramePr>
+              <a:graphicFrameLocks xmlns:a="http://schemas.openxmlformats.org/drawingml/2006/main" noChangeAspect="1"/>
+            </wp:cNvGraphicFramePr>
+            <a:graphic xmlns:a="http://schemas.openxmlformats.org/drawingml/2006/main">
+              <a:graphicData uri="http://schemas.openxmlformats.org/drawingml/2006/picture">
+                <pic:pic xmlns:pic="http://schemas.openxmlformats.org/drawingml/2006/picture">
+                  <pic:nvPicPr>
+                    <pic:cNvPr id="0" name=""/>
+                    <pic:cNvPicPr>
+                      <a:picLocks noChangeAspect="1"/>
+                    </pic:cNvPicPr>
+                  </pic:nvPicPr>
+                  <pic:blipFill>
+                    <a:blip r:embed="rIdBRfigA8_demo_overview"/>
+                    <a:stretch>
+                      <a:fillRect/>
+                    </a:stretch>
+                  </pic:blipFill>
+                  <pic:spPr>
+                    <a:xfrm>
+                      <a:off x="0" y="0"/>
+                      <a:ext cx="5486400" cy="5369298"/>
+                    </a:xfrm>
+                    <a:prstGeom prst="rect">
+                      <a:avLst/>
+                    </a:prstGeom>
+                  </pic:spPr>
+                </pic:pic>
+              </a:graphicData>
+            </a:graphic>
+          </wp:inline>
+        </w:drawing>
+      </w:r>
+    </w:p>
+    <w:p>
+      <w:pPr>
+        <w:spacing w:before="100" w:after="240"/>
+        <w:jc w:val="center"/>
+      </w:pPr>
+      <w:r>
+        <w:rPr>
+          <w:b/>
+          <w:bCs/>
+          <w:sz w:val="20"/>
+          <w:szCs w:val="20"/>
+        </w:rPr>
+        <w:t xml:space="preserve">Fig. A.1 </w:t>
+      </w:r>
+      <w:r>
+        <w:rPr>
+          <w:sz w:val="20"/>
+          <w:szCs w:val="20"/>
+        </w:rPr>
+        <w:t xml:space="preserve">Demo site Overview tab: scale of the corpus and the headline RQ1 finding</w:t>
+      </w:r>
+    </w:p>
+    <w:p>
+      <w:pPr>
         <w:spacing w:after="120" w:line="360" w:lineRule="auto"/>
         <w:ind w:firstLine="720"/>
         <w:jc w:val="both"/>
@@ -43254,7 +43404,7 @@
         <w:rPr>
           <w:highlight w:val="yellow"/>
         </w:rPr>
-        <w:t>[Insert screenshots: demo site Overview tab and demo site Live run blast-radius picture (files docs/screenshots/figA8_demo_overview.png and figA8_demo_liverun.png).]</w:t>
+        <w:t>[Insert screenshot: demo site Live run (recapture from the upgraded site, file docs/screenshots/figA8_demo_liverun.png).]</w:t>
       </w:r>
     </w:p>
     <w:sectPr>

</xml_diff>

<commit_message>
paper: embed real terminal and dashboard screenshots, correct make-all and test-count figures
</commit_message>
<xml_diff>
--- a/BlastRadius_Project1_Report.docx
+++ b/BlastRadius_Project1_Report.docx
@@ -15749,7 +15749,7 @@
                 <w:sz w:val="20"/>
                 <w:szCs w:val="20"/>
               </w:rPr>
-              <w:t xml:space="preserve">Done: make all in 9 min 47.23 s against a 15-minute target; make tables regenerates every reported number offline in about eight minutes</w:t>
+              <w:t xml:space="preserve">Done: mini-corpus reproduction 511.09 s of its 900 s budget; whole make all 16 min 35 s including tests; make tables about eight minutes</w:t>
             </w:r>
           </w:p>
         </w:tc>
@@ -30927,16 +30927,25 @@
         <w:jc w:val="both"/>
       </w:pPr>
       <w:r>
-        <w:t xml:space="preserve">The first item demonstrates reproducibility. make all rebuilds the derived artifacts on the three-repository mini-corpus, regenerates the tables and runs the full test suite. On the reference run it completed with exit code 0 in </w:t>
+        <w:t xml:space="preserve">The first item demonstrates reproducibility. make all runs the full test suite and then rebuilds the derived artifacts on the three-repository mini-corpus. The 15-minute budget (target T5.6b, 900 s) governs the reproduction step, not the test suite. On the most recent run (8 October 2026) the reproduction took </w:t>
       </w:r>
       <w:r>
         <w:rPr>
           <w:b/>
         </w:rPr>
-        <w:t xml:space="preserve">9 min 47.23 s</w:t>
-      </w:r>
-      <w:r>
-        <w:t xml:space="preserve">, against a target of under 15 minutes, with 655 tests passed and 1 skipped (the first run, before a graph-query performance fix, took 13 min 59.96 s with 632 passed and 12 skipped; both are inside the budget). The suite has since grown to 782 passing tests with 1 skipped, and make tables regenerates every reported number offline in about eight minutes (7 min 43 s on the final code commit). Because make all takes about ten minutes or more, a prepared recording is shown during the review rather than running it live, and the terminal summary is shown as a still image.</w:t>
+        <w:t xml:space="preserve">511.09 s</w:t>
+      </w:r>
+      <w:r>
+        <w:t xml:space="preserve"> of its 900 s budget (T5.6b met), and make all as a whole exited 0 in </w:t>
+      </w:r>
+      <w:r>
+        <w:rPr>
+          <w:b/>
+        </w:rPr>
+        <w:t xml:space="preserve">16 min 35 s</w:t>
+      </w:r>
+      <w:r>
+        <w:t xml:space="preserve">, because the 787 tests run first (787 passed, 1 skipped in 528.38 s when run on their own). An earlier run on another machine took 9 min 47.23 s in total (655 passed, 1 skipped, after a graph-query performance fix), and the first run took 13 min 59.96 s (632 passed, 12 skipped). make tables alone regenerates every reported number offline in about eight minutes. Because make all takes well over ten minutes, a prepared recording is shown during the review rather than running it live, and the terminal summary is shown as a still image.</w:t>
       </w:r>
     </w:p>
     <w:p>
@@ -31006,355 +31015,7 @@
     <w:p>
       <w:pPr>
         <w:keepNext/>
-        <w:pBdr>
-          <w:top w:val="dashed" w:sz="8" w:space="6" w:color="7F7F7F"/>
-          <w:left w:val="dashed" w:sz="8" w:space="6" w:color="7F7F7F"/>
-          <w:right w:val="dashed" w:sz="8" w:space="6" w:color="7F7F7F"/>
-        </w:pBdr>
-        <w:spacing w:line="276" w:lineRule="auto"/>
-        <w:jc w:val="center"/>
-      </w:pPr>
-    </w:p>
-    <w:p>
-      <w:pPr>
-        <w:keepNext/>
-        <w:pBdr>
-          <w:left w:val="dashed" w:sz="8" w:space="6" w:color="7F7F7F"/>
-          <w:right w:val="dashed" w:sz="8" w:space="6" w:color="7F7F7F"/>
-        </w:pBdr>
-        <w:spacing w:line="276" w:lineRule="auto"/>
-        <w:jc w:val="center"/>
-      </w:pPr>
-    </w:p>
-    <w:p>
-      <w:pPr>
-        <w:keepNext/>
-        <w:pBdr>
-          <w:left w:val="dashed" w:sz="8" w:space="6" w:color="7F7F7F"/>
-          <w:right w:val="dashed" w:sz="8" w:space="6" w:color="7F7F7F"/>
-        </w:pBdr>
-        <w:spacing w:line="276" w:lineRule="auto"/>
-        <w:jc w:val="center"/>
-      </w:pPr>
-    </w:p>
-    <w:p>
-      <w:pPr>
-        <w:keepNext/>
-        <w:pBdr>
-          <w:left w:val="dashed" w:sz="8" w:space="6" w:color="7F7F7F"/>
-          <w:right w:val="dashed" w:sz="8" w:space="6" w:color="7F7F7F"/>
-        </w:pBdr>
-        <w:spacing w:line="276" w:lineRule="auto"/>
-        <w:jc w:val="center"/>
-      </w:pPr>
-    </w:p>
-    <w:p>
-      <w:pPr>
-        <w:keepNext/>
-        <w:pBdr>
-          <w:left w:val="dashed" w:sz="8" w:space="6" w:color="7F7F7F"/>
-          <w:right w:val="dashed" w:sz="8" w:space="6" w:color="7F7F7F"/>
-        </w:pBdr>
-        <w:spacing w:line="276" w:lineRule="auto"/>
-        <w:jc w:val="center"/>
-      </w:pPr>
-      <w:r>
-        <w:rPr>
-          <w:sz w:val="22"/>
-          <w:szCs w:val="22"/>
-          <w:highlight w:val="yellow"/>
-        </w:rPr>
-        <w:t xml:space="preserve">[Insert screenshot: make all terminal summary showing exit 0, elapsed time and the test summary]</w:t>
-      </w:r>
-    </w:p>
-    <w:p>
-      <w:pPr>
-        <w:keepNext/>
-        <w:pBdr>
-          <w:left w:val="dashed" w:sz="8" w:space="6" w:color="7F7F7F"/>
-          <w:right w:val="dashed" w:sz="8" w:space="6" w:color="7F7F7F"/>
-        </w:pBdr>
-        <w:spacing w:line="276" w:lineRule="auto"/>
-        <w:jc w:val="center"/>
-      </w:pPr>
-    </w:p>
-    <w:p>
-      <w:pPr>
-        <w:keepNext/>
-        <w:pBdr>
-          <w:left w:val="dashed" w:sz="8" w:space="6" w:color="7F7F7F"/>
-          <w:right w:val="dashed" w:sz="8" w:space="6" w:color="7F7F7F"/>
-        </w:pBdr>
-        <w:spacing w:line="276" w:lineRule="auto"/>
-        <w:jc w:val="center"/>
-      </w:pPr>
-    </w:p>
-    <w:p>
-      <w:pPr>
-        <w:keepNext/>
-        <w:pBdr>
-          <w:left w:val="dashed" w:sz="8" w:space="6" w:color="7F7F7F"/>
-          <w:bottom w:val="dashed" w:sz="8" w:space="6" w:color="7F7F7F"/>
-          <w:right w:val="dashed" w:sz="8" w:space="6" w:color="7F7F7F"/>
-        </w:pBdr>
-        <w:spacing w:line="276" w:lineRule="auto"/>
-        <w:jc w:val="center"/>
-      </w:pPr>
-    </w:p>
-    <w:p>
-      <w:pPr>
-        <w:spacing w:before="100" w:after="240"/>
-        <w:jc w:val="center"/>
-      </w:pPr>
-      <w:r>
-        <w:rPr>
-          <w:b/>
-          <w:bCs/>
-          <w:sz w:val="20"/>
-          <w:szCs w:val="20"/>
-        </w:rPr>
-        <w:t xml:space="preserve">Fig. 6.2 </w:t>
-      </w:r>
-      <w:r>
-        <w:rPr>
-          <w:sz w:val="20"/>
-          <w:szCs w:val="20"/>
-        </w:rPr>
-        <w:t>Terminal Summary of make all on the Mini-Corpus</w:t>
-      </w:r>
-    </w:p>
-    <w:p>
-      <w:pPr>
-        <w:pStyle w:val="Heading2"/>
-        <w:keepNext/>
-        <w:spacing w:before="240" w:after="120" w:line="360" w:lineRule="auto"/>
-      </w:pPr>
-      <w:r>
-        <w:t>6.2 Regenerating Tables and the Freshness Guard</w:t>
-      </w:r>
-    </w:p>
-    <w:p>
-      <w:pPr>
-        <w:spacing w:after="120" w:line="360" w:lineRule="auto"/>
-        <w:ind w:firstLine="720"/>
-        <w:jc w:val="both"/>
-      </w:pPr>
-      <w:r>
-        <w:t xml:space="preserve">The second item shows </w:t>
-      </w:r>
-      <w:r>
-        <w:rPr>
-          <w:rFonts w:ascii="Courier New" w:eastAsia="Courier New" w:hAnsi="Courier New" w:cs="Courier New"/>
-          <w:sz w:val="21"/>
-          <w:szCs w:val="21"/>
-        </w:rPr>
-        <w:t>make tables</w:t>
-      </w:r>
-      <w:r>
-        <w:t xml:space="preserve"> regenerating every reported table from raw data, and then shows the freshness guard refusing to run. To trigger the guard, an input file is touched so that it becomes newer than a derived artifact that depends on it; the next invocation of </w:t>
-      </w:r>
-      <w:r>
-        <w:rPr>
-          <w:rFonts w:ascii="Courier New" w:eastAsia="Courier New" w:hAnsi="Courier New" w:cs="Courier New"/>
-          <w:sz w:val="21"/>
-          <w:szCs w:val="21"/>
-        </w:rPr>
-        <w:t>make tables</w:t>
-      </w:r>
-      <w:r>
-        <w:t xml:space="preserve"> stops with an error naming the stale artifact instead of printing numbers. This demonstrates the lesson of the October rebuild described in Section 7.1: a table script that silently reads a stale file produces plausible but wrong numbers, and the only defence is an explicit check.</w:t>
-      </w:r>
-    </w:p>
-    <w:p>
-      <w:pPr>
-        <w:keepNext/>
-        <w:spacing w:before="200"/>
-      </w:pPr>
-    </w:p>
-    <w:p>
-      <w:pPr>
-        <w:keepNext/>
-        <w:pBdr>
-          <w:top w:val="dashed" w:sz="8" w:space="6" w:color="7F7F7F"/>
-          <w:left w:val="dashed" w:sz="8" w:space="6" w:color="7F7F7F"/>
-          <w:right w:val="dashed" w:sz="8" w:space="6" w:color="7F7F7F"/>
-        </w:pBdr>
-        <w:spacing w:line="276" w:lineRule="auto"/>
-        <w:jc w:val="center"/>
-      </w:pPr>
-    </w:p>
-    <w:p>
-      <w:pPr>
-        <w:keepNext/>
-        <w:pBdr>
-          <w:left w:val="dashed" w:sz="8" w:space="6" w:color="7F7F7F"/>
-          <w:right w:val="dashed" w:sz="8" w:space="6" w:color="7F7F7F"/>
-        </w:pBdr>
-        <w:spacing w:line="276" w:lineRule="auto"/>
-        <w:jc w:val="center"/>
-      </w:pPr>
-    </w:p>
-    <w:p>
-      <w:pPr>
-        <w:keepNext/>
-        <w:pBdr>
-          <w:left w:val="dashed" w:sz="8" w:space="6" w:color="7F7F7F"/>
-          <w:right w:val="dashed" w:sz="8" w:space="6" w:color="7F7F7F"/>
-        </w:pBdr>
-        <w:spacing w:line="276" w:lineRule="auto"/>
-        <w:jc w:val="center"/>
-      </w:pPr>
-    </w:p>
-    <w:p>
-      <w:pPr>
-        <w:keepNext/>
-        <w:pBdr>
-          <w:left w:val="dashed" w:sz="8" w:space="6" w:color="7F7F7F"/>
-          <w:right w:val="dashed" w:sz="8" w:space="6" w:color="7F7F7F"/>
-        </w:pBdr>
-        <w:spacing w:line="276" w:lineRule="auto"/>
-        <w:jc w:val="center"/>
-      </w:pPr>
-      <w:r>
-        <w:rPr>
-          <w:sz w:val="22"/>
-          <w:szCs w:val="22"/>
-          <w:highlight w:val="yellow"/>
-        </w:rPr>
-        <w:t xml:space="preserve">[Insert screenshot: freshness-guard error message from make tables]</w:t>
-      </w:r>
-    </w:p>
-    <w:p>
-      <w:pPr>
-        <w:keepNext/>
-        <w:pBdr>
-          <w:left w:val="dashed" w:sz="8" w:space="6" w:color="7F7F7F"/>
-          <w:right w:val="dashed" w:sz="8" w:space="6" w:color="7F7F7F"/>
-        </w:pBdr>
-        <w:spacing w:line="276" w:lineRule="auto"/>
-        <w:jc w:val="center"/>
-      </w:pPr>
-    </w:p>
-    <w:p>
-      <w:pPr>
-        <w:keepNext/>
-        <w:pBdr>
-          <w:left w:val="dashed" w:sz="8" w:space="6" w:color="7F7F7F"/>
-          <w:right w:val="dashed" w:sz="8" w:space="6" w:color="7F7F7F"/>
-        </w:pBdr>
-        <w:spacing w:line="276" w:lineRule="auto"/>
-        <w:jc w:val="center"/>
-      </w:pPr>
-    </w:p>
-    <w:p>
-      <w:pPr>
-        <w:keepNext/>
-        <w:pBdr>
-          <w:left w:val="dashed" w:sz="8" w:space="6" w:color="7F7F7F"/>
-          <w:bottom w:val="dashed" w:sz="8" w:space="6" w:color="7F7F7F"/>
-          <w:right w:val="dashed" w:sz="8" w:space="6" w:color="7F7F7F"/>
-        </w:pBdr>
-        <w:spacing w:line="276" w:lineRule="auto"/>
-        <w:jc w:val="center"/>
-      </w:pPr>
-    </w:p>
-    <w:p>
-      <w:pPr>
-        <w:spacing w:before="100" w:after="240"/>
-        <w:jc w:val="center"/>
-      </w:pPr>
-      <w:r>
-        <w:rPr>
-          <w:b/>
-          <w:bCs/>
-          <w:sz w:val="20"/>
-          <w:szCs w:val="20"/>
-        </w:rPr>
-        <w:t xml:space="preserve">Fig. 6.3 </w:t>
-      </w:r>
-      <w:r>
-        <w:rPr>
-          <w:sz w:val="20"/>
-          <w:szCs w:val="20"/>
-        </w:rPr>
-        <w:t>Freshness Guard Refusing to Run on a Stale Artifact</w:t>
-      </w:r>
-    </w:p>
-    <w:p>
-      <w:pPr>
-        <w:pStyle w:val="Heading2"/>
-        <w:keepNext/>
-        <w:spacing w:before="240" w:after="120" w:line="360" w:lineRule="auto"/>
-      </w:pPr>
-      <w:r>
-        <w:t>6.3 Corpus Dashboard</w:t>
-      </w:r>
-    </w:p>
-    <w:p>
-      <w:pPr>
-        <w:spacing w:after="120" w:line="360" w:lineRule="auto"/>
-        <w:ind w:firstLine="720"/>
-        <w:jc w:val="both"/>
-      </w:pPr>
-      <w:r>
-        <w:t xml:space="preserve">The third item is the Streamlit corpus dashboard. Its eight read-only panels summarise the corpus so that any team member can check its health without running scripts. During the demonstration the panels are used to show the size and composition of the corpus and to explain how monitoring during the harvest made it possible to notice problems, such as repositories that produce no parseable outcomes, while there was still time to act.</w:t>
-      </w:r>
-    </w:p>
-    <w:p>
-      <w:pPr>
-        <w:keepNext/>
-        <w:spacing w:before="200"/>
-      </w:pPr>
-    </w:p>
-    <w:p>
-      <w:pPr>
-        <w:keepNext/>
-        <w:pBdr>
-          <w:top w:val="dashed" w:sz="8" w:space="6" w:color="7F7F7F"/>
-          <w:left w:val="dashed" w:sz="8" w:space="6" w:color="7F7F7F"/>
-          <w:right w:val="dashed" w:sz="8" w:space="6" w:color="7F7F7F"/>
-        </w:pBdr>
-        <w:spacing w:line="276" w:lineRule="auto"/>
-        <w:jc w:val="center"/>
-      </w:pPr>
-    </w:p>
-    <w:p>
-      <w:pPr>
-        <w:keepNext/>
-        <w:pBdr>
-          <w:left w:val="dashed" w:sz="8" w:space="6" w:color="7F7F7F"/>
-          <w:right w:val="dashed" w:sz="8" w:space="6" w:color="7F7F7F"/>
-        </w:pBdr>
-        <w:spacing w:line="276" w:lineRule="auto"/>
-        <w:jc w:val="center"/>
-      </w:pPr>
-    </w:p>
-    <w:p>
-      <w:pPr>
-        <w:keepNext/>
-        <w:pBdr>
-          <w:left w:val="dashed" w:sz="8" w:space="6" w:color="7F7F7F"/>
-          <w:right w:val="dashed" w:sz="8" w:space="6" w:color="7F7F7F"/>
-        </w:pBdr>
-        <w:spacing w:line="276" w:lineRule="auto"/>
-        <w:jc w:val="center"/>
-      </w:pPr>
-    </w:p>
-    <w:p>
-      <w:pPr>
-        <w:keepNext/>
-        <w:pBdr>
-          <w:left w:val="dashed" w:sz="8" w:space="6" w:color="7F7F7F"/>
-          <w:right w:val="dashed" w:sz="8" w:space="6" w:color="7F7F7F"/>
-        </w:pBdr>
-        <w:spacing w:line="276" w:lineRule="auto"/>
-        <w:jc w:val="center"/>
-      </w:pPr>
-    </w:p>
-    <w:p>
-      <w:pPr>
-        <w:keepNext/>
-        <w:spacing w:before="200" w:after="60"/>
+        <w:spacing w:before="160" w:after="60"/>
         <w:jc w:val="center"/>
       </w:pPr>
       <w:r>
@@ -31363,9 +31024,9 @@
         </w:rPr>
         <w:drawing>
           <wp:inline distT="0" distB="0" distL="0" distR="0">
-            <wp:extent cx="4297680" cy="5924658"/>
+            <wp:extent cx="5486400" cy="3034331"/>
             <wp:effectExtent l="0" t="0" r="0" b="0"/>
-            <wp:docPr id="9400" name="fig6_4a_dashboard" descr="fig6_4a_dashboard"/>
+            <wp:docPr id="9721" name="fig6_2_make_all" descr="fig6_2_make_all"/>
             <wp:cNvGraphicFramePr>
               <a:graphicFrameLocks xmlns:a="http://schemas.openxmlformats.org/drawingml/2006/main" noChangeAspect="1"/>
             </wp:cNvGraphicFramePr>
@@ -31379,7 +31040,7 @@
                     </pic:cNvPicPr>
                   </pic:nvPicPr>
                   <pic:blipFill>
-                    <a:blip r:embed="rIdBRfig6_4a_dashboard"/>
+                    <a:blip r:embed="rIdBRfig6_2_make_all"/>
                     <a:stretch>
                       <a:fillRect/>
                     </a:stretch>
@@ -31387,7 +31048,7 @@
                   <pic:spPr>
                     <a:xfrm>
                       <a:off x="0" y="0"/>
-                      <a:ext cx="4297680" cy="5924658"/>
+                      <a:ext cx="5486400" cy="3034331"/>
                     </a:xfrm>
                     <a:prstGeom prst="rect">
                       <a:avLst/>
@@ -31402,8 +31063,78 @@
     </w:p>
     <w:p>
       <w:pPr>
+        <w:spacing w:before="100" w:after="240"/>
+        <w:jc w:val="center"/>
+      </w:pPr>
+      <w:r>
+        <w:rPr>
+          <w:b/>
+          <w:bCs/>
+          <w:sz w:val="20"/>
+          <w:szCs w:val="20"/>
+        </w:rPr>
+        <w:t xml:space="preserve">Fig. 6.2 </w:t>
+      </w:r>
+      <w:r>
+        <w:rPr>
+          <w:sz w:val="20"/>
+          <w:szCs w:val="20"/>
+        </w:rPr>
+        <w:t>Terminal Summary of make all on the Mini-Corpus</w:t>
+      </w:r>
+    </w:p>
+    <w:p>
+      <w:pPr>
+        <w:pStyle w:val="Heading2"/>
         <w:keepNext/>
-        <w:spacing w:before="200" w:after="60"/>
+        <w:spacing w:before="240" w:after="120" w:line="360" w:lineRule="auto"/>
+      </w:pPr>
+      <w:r>
+        <w:t>6.2 Regenerating Tables and the Freshness Guard</w:t>
+      </w:r>
+    </w:p>
+    <w:p>
+      <w:pPr>
+        <w:spacing w:after="120" w:line="360" w:lineRule="auto"/>
+        <w:ind w:firstLine="720"/>
+        <w:jc w:val="both"/>
+      </w:pPr>
+      <w:r>
+        <w:t xml:space="preserve">The second item shows </w:t>
+      </w:r>
+      <w:r>
+        <w:rPr>
+          <w:rFonts w:ascii="Courier New" w:eastAsia="Courier New" w:hAnsi="Courier New" w:cs="Courier New"/>
+          <w:sz w:val="21"/>
+          <w:szCs w:val="21"/>
+        </w:rPr>
+        <w:t>make tables</w:t>
+      </w:r>
+      <w:r>
+        <w:t xml:space="preserve"> regenerating every reported table from raw data, and then shows the freshness guard refusing to run. To trigger the guard, an input file is touched so that it becomes newer than a derived artifact that depends on it; the next invocation of </w:t>
+      </w:r>
+      <w:r>
+        <w:rPr>
+          <w:rFonts w:ascii="Courier New" w:eastAsia="Courier New" w:hAnsi="Courier New" w:cs="Courier New"/>
+          <w:sz w:val="21"/>
+          <w:szCs w:val="21"/>
+        </w:rPr>
+        <w:t>make tables</w:t>
+      </w:r>
+      <w:r>
+        <w:t xml:space="preserve"> stops with an error naming the stale artifact instead of printing numbers. This demonstrates the lesson of the October rebuild described in Section 7.1: a table script that silently reads a stale file produces plausible but wrong numbers, and the only defence is an explicit check.</w:t>
+      </w:r>
+    </w:p>
+    <w:p>
+      <w:pPr>
+        <w:keepNext/>
+        <w:spacing w:before="200"/>
+      </w:pPr>
+    </w:p>
+    <w:p>
+      <w:pPr>
+        <w:keepNext/>
+        <w:spacing w:before="160" w:after="60"/>
         <w:jc w:val="center"/>
       </w:pPr>
       <w:r>
@@ -31412,9 +31143,9 @@
         </w:rPr>
         <w:drawing>
           <wp:inline distT="0" distB="0" distL="0" distR="0">
-            <wp:extent cx="4297680" cy="5924658"/>
+            <wp:extent cx="5486400" cy="2586232"/>
             <wp:effectExtent l="0" t="0" r="0" b="0"/>
-            <wp:docPr id="9561" name="fig6_4b_dashboard" descr="fig6_4b_dashboard"/>
+            <wp:docPr id="9892" name="fig6_3_freshness_guard" descr="fig6_3_freshness_guard"/>
             <wp:cNvGraphicFramePr>
               <a:graphicFrameLocks xmlns:a="http://schemas.openxmlformats.org/drawingml/2006/main" noChangeAspect="1"/>
             </wp:cNvGraphicFramePr>
@@ -31428,7 +31159,7 @@
                     </pic:cNvPicPr>
                   </pic:nvPicPr>
                   <pic:blipFill>
-                    <a:blip r:embed="rIdBRfig6_4b_dashboard"/>
+                    <a:blip r:embed="rIdBRfig6_3_freshness_guard"/>
                     <a:stretch>
                       <a:fillRect/>
                     </a:stretch>
@@ -31436,7 +31167,7 @@
                   <pic:spPr>
                     <a:xfrm>
                       <a:off x="0" y="0"/>
-                      <a:ext cx="4297680" cy="5924658"/>
+                      <a:ext cx="5486400" cy="2586232"/>
                     </a:xfrm>
                     <a:prstGeom prst="rect">
                       <a:avLst/>
@@ -31451,6 +31182,358 @@
     </w:p>
     <w:p>
       <w:pPr>
+        <w:spacing w:before="100" w:after="240"/>
+        <w:jc w:val="center"/>
+      </w:pPr>
+      <w:r>
+        <w:rPr>
+          <w:b/>
+          <w:bCs/>
+          <w:sz w:val="20"/>
+          <w:szCs w:val="20"/>
+        </w:rPr>
+        <w:t xml:space="preserve">Fig. 6.3 </w:t>
+      </w:r>
+      <w:r>
+        <w:rPr>
+          <w:sz w:val="20"/>
+          <w:szCs w:val="20"/>
+        </w:rPr>
+        <w:t>Freshness Guard Refusing to Run on a Stale Artifact</w:t>
+      </w:r>
+    </w:p>
+    <w:p>
+      <w:pPr>
+        <w:pStyle w:val="Heading2"/>
+        <w:keepNext/>
+        <w:spacing w:before="240" w:after="120" w:line="360" w:lineRule="auto"/>
+      </w:pPr>
+      <w:r>
+        <w:t>6.3 Corpus Dashboard</w:t>
+      </w:r>
+    </w:p>
+    <w:p>
+      <w:pPr>
+        <w:spacing w:after="120" w:line="360" w:lineRule="auto"/>
+        <w:ind w:firstLine="720"/>
+        <w:jc w:val="both"/>
+      </w:pPr>
+      <w:r>
+        <w:t xml:space="preserve">The third item is the Streamlit corpus dashboard. Its eight read-only panels summarise the corpus so that any team member can check its health without running scripts. During the demonstration the panels are used to show the size and composition of the corpus and to explain how monitoring during the harvest made it possible to notice problems, such as repositories that produce no parseable outcomes, while there was still time to act.</w:t>
+      </w:r>
+    </w:p>
+    <w:p>
+      <w:pPr>
+        <w:keepNext/>
+        <w:spacing w:before="200"/>
+      </w:pPr>
+    </w:p>
+    <w:p>
+      <w:pPr>
+        <w:keepNext/>
+        <w:spacing w:before="160" w:after="60"/>
+        <w:jc w:val="center"/>
+      </w:pPr>
+      <w:r>
+        <w:rPr>
+          <w:noProof/>
+        </w:rPr>
+        <w:drawing>
+          <wp:inline distT="0" distB="0" distL="0" distR="0">
+            <wp:extent cx="4206240" cy="3250276"/>
+            <wp:effectExtent l="0" t="0" r="0" b="0"/>
+            <wp:docPr id="9769" name="fig6_4_dashboard_p1" descr="fig6_4_dashboard_p1"/>
+            <wp:cNvGraphicFramePr>
+              <a:graphicFrameLocks xmlns:a="http://schemas.openxmlformats.org/drawingml/2006/main" noChangeAspect="1"/>
+            </wp:cNvGraphicFramePr>
+            <a:graphic xmlns:a="http://schemas.openxmlformats.org/drawingml/2006/main">
+              <a:graphicData uri="http://schemas.openxmlformats.org/drawingml/2006/picture">
+                <pic:pic xmlns:pic="http://schemas.openxmlformats.org/drawingml/2006/picture">
+                  <pic:nvPicPr>
+                    <pic:cNvPr id="0" name=""/>
+                    <pic:cNvPicPr>
+                      <a:picLocks noChangeAspect="1"/>
+                    </pic:cNvPicPr>
+                  </pic:nvPicPr>
+                  <pic:blipFill>
+                    <a:blip r:embed="rIdBRfig6_4_dashboard_p1"/>
+                    <a:stretch>
+                      <a:fillRect/>
+                    </a:stretch>
+                  </pic:blipFill>
+                  <pic:spPr>
+                    <a:xfrm>
+                      <a:off x="0" y="0"/>
+                      <a:ext cx="4206240" cy="3250276"/>
+                    </a:xfrm>
+                    <a:prstGeom prst="rect">
+                      <a:avLst/>
+                    </a:prstGeom>
+                  </pic:spPr>
+                </pic:pic>
+              </a:graphicData>
+            </a:graphic>
+          </wp:inline>
+        </w:drawing>
+      </w:r>
+    </w:p>
+    <w:p>
+      <w:pPr>
+        <w:keepNext/>
+        <w:spacing w:before="160" w:after="60"/>
+        <w:jc w:val="center"/>
+      </w:pPr>
+      <w:r>
+        <w:rPr>
+          <w:noProof/>
+        </w:rPr>
+        <w:drawing>
+          <wp:inline distT="0" distB="0" distL="0" distR="0">
+            <wp:extent cx="4206240" cy="3250276"/>
+            <wp:effectExtent l="0" t="0" r="0" b="0"/>
+            <wp:docPr id="9934" name="fig6_4_dashboard_p2" descr="fig6_4_dashboard_p2"/>
+            <wp:cNvGraphicFramePr>
+              <a:graphicFrameLocks xmlns:a="http://schemas.openxmlformats.org/drawingml/2006/main" noChangeAspect="1"/>
+            </wp:cNvGraphicFramePr>
+            <a:graphic xmlns:a="http://schemas.openxmlformats.org/drawingml/2006/main">
+              <a:graphicData uri="http://schemas.openxmlformats.org/drawingml/2006/picture">
+                <pic:pic xmlns:pic="http://schemas.openxmlformats.org/drawingml/2006/picture">
+                  <pic:nvPicPr>
+                    <pic:cNvPr id="0" name=""/>
+                    <pic:cNvPicPr>
+                      <a:picLocks noChangeAspect="1"/>
+                    </pic:cNvPicPr>
+                  </pic:nvPicPr>
+                  <pic:blipFill>
+                    <a:blip r:embed="rIdBRfig6_4_dashboard_p2"/>
+                    <a:stretch>
+                      <a:fillRect/>
+                    </a:stretch>
+                  </pic:blipFill>
+                  <pic:spPr>
+                    <a:xfrm>
+                      <a:off x="0" y="0"/>
+                      <a:ext cx="4206240" cy="3250276"/>
+                    </a:xfrm>
+                    <a:prstGeom prst="rect">
+                      <a:avLst/>
+                    </a:prstGeom>
+                  </pic:spPr>
+                </pic:pic>
+              </a:graphicData>
+            </a:graphic>
+          </wp:inline>
+        </w:drawing>
+      </w:r>
+    </w:p>
+    <w:p>
+      <w:pPr>
+        <w:keepNext/>
+        <w:spacing w:before="160" w:after="60"/>
+        <w:jc w:val="center"/>
+      </w:pPr>
+      <w:r>
+        <w:rPr>
+          <w:noProof/>
+        </w:rPr>
+        <w:drawing>
+          <wp:inline distT="0" distB="0" distL="0" distR="0">
+            <wp:extent cx="4206240" cy="3250276"/>
+            <wp:effectExtent l="0" t="0" r="0" b="0"/>
+            <wp:docPr id="9399" name="fig6_4_dashboard_p3" descr="fig6_4_dashboard_p3"/>
+            <wp:cNvGraphicFramePr>
+              <a:graphicFrameLocks xmlns:a="http://schemas.openxmlformats.org/drawingml/2006/main" noChangeAspect="1"/>
+            </wp:cNvGraphicFramePr>
+            <a:graphic xmlns:a="http://schemas.openxmlformats.org/drawingml/2006/main">
+              <a:graphicData uri="http://schemas.openxmlformats.org/drawingml/2006/picture">
+                <pic:pic xmlns:pic="http://schemas.openxmlformats.org/drawingml/2006/picture">
+                  <pic:nvPicPr>
+                    <pic:cNvPr id="0" name=""/>
+                    <pic:cNvPicPr>
+                      <a:picLocks noChangeAspect="1"/>
+                    </pic:cNvPicPr>
+                  </pic:nvPicPr>
+                  <pic:blipFill>
+                    <a:blip r:embed="rIdBRfig6_4_dashboard_p3"/>
+                    <a:stretch>
+                      <a:fillRect/>
+                    </a:stretch>
+                  </pic:blipFill>
+                  <pic:spPr>
+                    <a:xfrm>
+                      <a:off x="0" y="0"/>
+                      <a:ext cx="4206240" cy="3250276"/>
+                    </a:xfrm>
+                    <a:prstGeom prst="rect">
+                      <a:avLst/>
+                    </a:prstGeom>
+                  </pic:spPr>
+                </pic:pic>
+              </a:graphicData>
+            </a:graphic>
+          </wp:inline>
+        </w:drawing>
+      </w:r>
+    </w:p>
+    <w:p>
+      <w:pPr>
+        <w:keepNext/>
+        <w:spacing w:before="160" w:after="60"/>
+        <w:jc w:val="center"/>
+      </w:pPr>
+      <w:r>
+        <w:rPr>
+          <w:noProof/>
+        </w:rPr>
+        <w:drawing>
+          <wp:inline distT="0" distB="0" distL="0" distR="0">
+            <wp:extent cx="4206240" cy="3250276"/>
+            <wp:effectExtent l="0" t="0" r="0" b="0"/>
+            <wp:docPr id="9564" name="fig6_4_dashboard_p4" descr="fig6_4_dashboard_p4"/>
+            <wp:cNvGraphicFramePr>
+              <a:graphicFrameLocks xmlns:a="http://schemas.openxmlformats.org/drawingml/2006/main" noChangeAspect="1"/>
+            </wp:cNvGraphicFramePr>
+            <a:graphic xmlns:a="http://schemas.openxmlformats.org/drawingml/2006/main">
+              <a:graphicData uri="http://schemas.openxmlformats.org/drawingml/2006/picture">
+                <pic:pic xmlns:pic="http://schemas.openxmlformats.org/drawingml/2006/picture">
+                  <pic:nvPicPr>
+                    <pic:cNvPr id="0" name=""/>
+                    <pic:cNvPicPr>
+                      <a:picLocks noChangeAspect="1"/>
+                    </pic:cNvPicPr>
+                  </pic:nvPicPr>
+                  <pic:blipFill>
+                    <a:blip r:embed="rIdBRfig6_4_dashboard_p4"/>
+                    <a:stretch>
+                      <a:fillRect/>
+                    </a:stretch>
+                  </pic:blipFill>
+                  <pic:spPr>
+                    <a:xfrm>
+                      <a:off x="0" y="0"/>
+                      <a:ext cx="4206240" cy="3250276"/>
+                    </a:xfrm>
+                    <a:prstGeom prst="rect">
+                      <a:avLst/>
+                    </a:prstGeom>
+                  </pic:spPr>
+                </pic:pic>
+              </a:graphicData>
+            </a:graphic>
+          </wp:inline>
+        </w:drawing>
+      </w:r>
+    </w:p>
+    <w:p>
+      <w:pPr>
+        <w:spacing w:before="100" w:after="240"/>
+        <w:jc w:val="center"/>
+      </w:pPr>
+      <w:r>
+        <w:rPr>
+          <w:b/>
+          <w:bCs/>
+          <w:sz w:val="20"/>
+          <w:szCs w:val="20"/>
+        </w:rPr>
+        <w:t xml:space="preserve">Fig. 6.4 </w:t>
+      </w:r>
+      <w:r>
+        <w:rPr>
+          <w:sz w:val="20"/>
+          <w:szCs w:val="20"/>
+        </w:rPr>
+        <w:t xml:space="preserve">Streamlit Corpus Dashboard Panels</w:t>
+      </w:r>
+    </w:p>
+    <w:p>
+      <w:pPr>
+        <w:pStyle w:val="Heading2"/>
+        <w:keepNext/>
+        <w:spacing w:before="240" w:after="120" w:line="360" w:lineRule="auto"/>
+      </w:pPr>
+      <w:r>
+        <w:t>6.4 Graph Layer</w:t>
+      </w:r>
+    </w:p>
+    <w:p>
+      <w:pPr>
+        <w:spacing w:after="120" w:line="360" w:lineRule="auto"/>
+        <w:ind w:firstLine="720"/>
+        <w:jc w:val="both"/>
+      </w:pPr>
+      <w:r>
+        <w:t xml:space="preserve">The fourth item demonstrates the graph layer. A commit-pinned graph is built for one commit of a mini-corpus repository, producing a compressed node-link JSON file named by repository and SHA. The query primitives are then run against it: a k-hop neighbourhood around a source method, and the minimum distance from a test node to the changed code. The bound test nodes are shown with their canonical </w:t>
+      </w:r>
+      <w:r>
+        <w:rPr>
+          <w:rFonts w:ascii="Courier New" w:eastAsia="Courier New" w:hAnsi="Courier New" w:cs="Courier New"/>
+          <w:sz w:val="21"/>
+          <w:szCs w:val="21"/>
+        </w:rPr>
+        <w:t>test_id</w:t>
+      </w:r>
+      <w:r>
+        <w:t xml:space="preserve"> values and the type of edge that connects them to source code, which makes visible the difference between direct, convention-based and layout-based bindings.</w:t>
+      </w:r>
+    </w:p>
+    <w:p>
+      <w:pPr>
+        <w:keepNext/>
+        <w:spacing w:before="200"/>
+      </w:pPr>
+    </w:p>
+    <w:p>
+      <w:pPr>
+        <w:keepNext/>
+        <w:spacing w:before="160" w:after="60"/>
+        <w:jc w:val="center"/>
+      </w:pPr>
+      <w:r>
+        <w:rPr>
+          <w:noProof/>
+        </w:rPr>
+        <w:drawing>
+          <wp:inline distT="0" distB="0" distL="0" distR="0">
+            <wp:extent cx="5486400" cy="1339312"/>
+            <wp:effectExtent l="0" t="0" r="0" b="0"/>
+            <wp:docPr id="9359" name="fig6_5_graph_listing" descr="fig6_5_graph_listing"/>
+            <wp:cNvGraphicFramePr>
+              <a:graphicFrameLocks xmlns:a="http://schemas.openxmlformats.org/drawingml/2006/main" noChangeAspect="1"/>
+            </wp:cNvGraphicFramePr>
+            <a:graphic xmlns:a="http://schemas.openxmlformats.org/drawingml/2006/main">
+              <a:graphicData uri="http://schemas.openxmlformats.org/drawingml/2006/picture">
+                <pic:pic xmlns:pic="http://schemas.openxmlformats.org/drawingml/2006/picture">
+                  <pic:nvPicPr>
+                    <pic:cNvPr id="0" name=""/>
+                    <pic:cNvPicPr>
+                      <a:picLocks noChangeAspect="1"/>
+                    </pic:cNvPicPr>
+                  </pic:nvPicPr>
+                  <pic:blipFill>
+                    <a:blip r:embed="rIdBRfig6_5_graph_listing"/>
+                    <a:stretch>
+                      <a:fillRect/>
+                    </a:stretch>
+                  </pic:blipFill>
+                  <pic:spPr>
+                    <a:xfrm>
+                      <a:off x="0" y="0"/>
+                      <a:ext cx="5486400" cy="1339312"/>
+                    </a:xfrm>
+                    <a:prstGeom prst="rect">
+                      <a:avLst/>
+                    </a:prstGeom>
+                  </pic:spPr>
+                </pic:pic>
+              </a:graphicData>
+            </a:graphic>
+          </wp:inline>
+        </w:drawing>
+      </w:r>
+    </w:p>
+    <w:p>
+      <w:pPr>
         <w:keepNext/>
         <w:pBdr>
           <w:left w:val="dashed" w:sz="8" w:space="6" w:color="7F7F7F"/>
@@ -31459,6 +31542,14 @@
         <w:spacing w:line="276" w:lineRule="auto"/>
         <w:jc w:val="center"/>
       </w:pPr>
+      <w:r>
+        <w:rPr>
+          <w:sz w:val="22"/>
+          <w:szCs w:val="22"/>
+          <w:highlight w:val="yellow"/>
+        </w:rPr>
+        <w:t>[Still needed: first lines of the decompressed graph JSON showing typed nodes (node_type) and typed edges (edge_type, confidence).]</w:t>
+      </w:r>
     </w:p>
     <w:p>
       <w:pPr>
@@ -31506,45 +31597,14 @@
           <w:sz w:val="20"/>
           <w:szCs w:val="20"/>
         </w:rPr>
-        <w:t xml:space="preserve">Fig. 6.4 </w:t>
+        <w:t xml:space="preserve">Fig. 6.5 </w:t>
       </w:r>
       <w:r>
         <w:rPr>
           <w:sz w:val="20"/>
           <w:szCs w:val="20"/>
         </w:rPr>
-        <w:t xml:space="preserve">Streamlit Corpus Dashboard Panels</w:t>
-      </w:r>
-    </w:p>
-    <w:p>
-      <w:pPr>
-        <w:pStyle w:val="Heading2"/>
-        <w:keepNext/>
-        <w:spacing w:before="240" w:after="120" w:line="360" w:lineRule="auto"/>
-      </w:pPr>
-      <w:r>
-        <w:t>6.4 Graph Layer</w:t>
-      </w:r>
-    </w:p>
-    <w:p>
-      <w:pPr>
-        <w:spacing w:after="120" w:line="360" w:lineRule="auto"/>
-        <w:ind w:firstLine="720"/>
-        <w:jc w:val="both"/>
-      </w:pPr>
-      <w:r>
-        <w:t xml:space="preserve">The fourth item demonstrates the graph layer. A commit-pinned graph is built for one commit of a mini-corpus repository, producing a compressed node-link JSON file named by repository and SHA. The query primitives are then run against it: a k-hop neighbourhood around a source method, and the minimum distance from a test node to the changed code. The bound test nodes are shown with their canonical </w:t>
-      </w:r>
-      <w:r>
-        <w:rPr>
-          <w:rFonts w:ascii="Courier New" w:eastAsia="Courier New" w:hAnsi="Courier New" w:cs="Courier New"/>
-          <w:sz w:val="21"/>
-          <w:szCs w:val="21"/>
-        </w:rPr>
-        <w:t>test_id</w:t>
-      </w:r>
-      <w:r>
-        <w:t xml:space="preserve"> values and the type of edge that connects them to source code, which makes visible the difference between direct, convention-based and layout-based bindings.</w:t>
+        <w:t>Excerpt of a Commit-Pinned Graph File</w:t>
       </w:r>
     </w:p>
     <w:p>
@@ -31603,7 +31663,7 @@
           <w:szCs w:val="22"/>
           <w:highlight w:val="yellow"/>
         </w:rPr>
-        <w:t>[Insert screenshot: graph JSON snippet showing typed nodes and edges]</w:t>
+        <w:t xml:space="preserve">[Insert screenshot: query output: k-hop neighbourhood and distance to changed code]</w:t>
       </w:r>
     </w:p>
     <w:p>
@@ -31652,14 +31712,34 @@
           <w:sz w:val="20"/>
           <w:szCs w:val="20"/>
         </w:rPr>
-        <w:t xml:space="preserve">Fig. 6.5 </w:t>
+        <w:t xml:space="preserve">Fig. 6.6 </w:t>
       </w:r>
       <w:r>
         <w:rPr>
           <w:sz w:val="20"/>
           <w:szCs w:val="20"/>
         </w:rPr>
-        <w:t>Excerpt of a Commit-Pinned Graph File</w:t>
+        <w:t>Output of the Graph Query Primitives</w:t>
+      </w:r>
+    </w:p>
+    <w:p>
+      <w:pPr>
+        <w:pStyle w:val="Heading2"/>
+        <w:keepNext/>
+        <w:spacing w:before="240" w:after="120" w:line="360" w:lineRule="auto"/>
+      </w:pPr>
+      <w:r>
+        <w:t>6.5 Release Bundle</w:t>
+      </w:r>
+    </w:p>
+    <w:p>
+      <w:pPr>
+        <w:spacing w:after="120" w:line="360" w:lineRule="auto"/>
+        <w:ind w:firstLine="720"/>
+        <w:jc w:val="both"/>
+      </w:pPr>
+      <w:r>
+        <w:t xml:space="preserve">The fifth item opens the local release bundle. It shows the SHA-256 checksum manifest, the pseudonymised author column in which logins are replaced by keyed hashes, and the results of the secret scan and the canary check. It also shows that the build refuses to run when the pseudonymisation key is absent, which is the guard added after an earlier unpublished build had included live logins.</w:t>
       </w:r>
     </w:p>
     <w:p>
@@ -31671,14 +31751,51 @@
     <w:p>
       <w:pPr>
         <w:keepNext/>
-        <w:pBdr>
-          <w:top w:val="dashed" w:sz="8" w:space="6" w:color="7F7F7F"/>
-          <w:left w:val="dashed" w:sz="8" w:space="6" w:color="7F7F7F"/>
-          <w:right w:val="dashed" w:sz="8" w:space="6" w:color="7F7F7F"/>
-        </w:pBdr>
-        <w:spacing w:line="276" w:lineRule="auto"/>
+        <w:spacing w:before="160" w:after="60"/>
         <w:jc w:val="center"/>
       </w:pPr>
+      <w:r>
+        <w:rPr>
+          <w:noProof/>
+        </w:rPr>
+        <w:drawing>
+          <wp:inline distT="0" distB="0" distL="0" distR="0">
+            <wp:extent cx="2194560" cy="1122281"/>
+            <wp:effectExtent l="0" t="0" r="0" b="0"/>
+            <wp:docPr id="9524" name="fig6_7_release_tree" descr="fig6_7_release_tree"/>
+            <wp:cNvGraphicFramePr>
+              <a:graphicFrameLocks xmlns:a="http://schemas.openxmlformats.org/drawingml/2006/main" noChangeAspect="1"/>
+            </wp:cNvGraphicFramePr>
+            <a:graphic xmlns:a="http://schemas.openxmlformats.org/drawingml/2006/main">
+              <a:graphicData uri="http://schemas.openxmlformats.org/drawingml/2006/picture">
+                <pic:pic xmlns:pic="http://schemas.openxmlformats.org/drawingml/2006/picture">
+                  <pic:nvPicPr>
+                    <pic:cNvPr id="0" name=""/>
+                    <pic:cNvPicPr>
+                      <a:picLocks noChangeAspect="1"/>
+                    </pic:cNvPicPr>
+                  </pic:nvPicPr>
+                  <pic:blipFill>
+                    <a:blip r:embed="rIdBRfig6_7_release_tree"/>
+                    <a:stretch>
+                      <a:fillRect/>
+                    </a:stretch>
+                  </pic:blipFill>
+                  <pic:spPr>
+                    <a:xfrm>
+                      <a:off x="0" y="0"/>
+                      <a:ext cx="2194560" cy="1122281"/>
+                    </a:xfrm>
+                    <a:prstGeom prst="rect">
+                      <a:avLst/>
+                    </a:prstGeom>
+                  </pic:spPr>
+                </pic:pic>
+              </a:graphicData>
+            </a:graphic>
+          </wp:inline>
+        </w:drawing>
+      </w:r>
     </w:p>
     <w:p>
       <w:pPr>
@@ -31690,35 +31807,13 @@
         <w:spacing w:line="276" w:lineRule="auto"/>
         <w:jc w:val="center"/>
       </w:pPr>
-    </w:p>
-    <w:p>
-      <w:pPr>
-        <w:keepNext/>
-        <w:pBdr>
-          <w:left w:val="dashed" w:sz="8" w:space="6" w:color="7F7F7F"/>
-          <w:right w:val="dashed" w:sz="8" w:space="6" w:color="7F7F7F"/>
-        </w:pBdr>
-        <w:spacing w:line="276" w:lineRule="auto"/>
-        <w:jc w:val="center"/>
-      </w:pPr>
-    </w:p>
-    <w:p>
-      <w:pPr>
-        <w:keepNext/>
-        <w:pBdr>
-          <w:left w:val="dashed" w:sz="8" w:space="6" w:color="7F7F7F"/>
-          <w:right w:val="dashed" w:sz="8" w:space="6" w:color="7F7F7F"/>
-        </w:pBdr>
-        <w:spacing w:line="276" w:lineRule="auto"/>
-        <w:jc w:val="center"/>
-      </w:pPr>
       <w:r>
         <w:rPr>
           <w:sz w:val="22"/>
           <w:szCs w:val="22"/>
           <w:highlight w:val="yellow"/>
         </w:rPr>
-        <w:t xml:space="preserve">[Insert screenshot: query output: k-hop neighbourhood and distance to changed code]</w:t>
+        <w:t>[Still needed: output of cat release/v0.1/CHECKSUMS.sha256.]</w:t>
       </w:r>
     </w:p>
     <w:p>
@@ -31767,141 +31862,6 @@
           <w:sz w:val="20"/>
           <w:szCs w:val="20"/>
         </w:rPr>
-        <w:t xml:space="preserve">Fig. 6.6 </w:t>
-      </w:r>
-      <w:r>
-        <w:rPr>
-          <w:sz w:val="20"/>
-          <w:szCs w:val="20"/>
-        </w:rPr>
-        <w:t>Output of the Graph Query Primitives</w:t>
-      </w:r>
-    </w:p>
-    <w:p>
-      <w:pPr>
-        <w:pStyle w:val="Heading2"/>
-        <w:keepNext/>
-        <w:spacing w:before="240" w:after="120" w:line="360" w:lineRule="auto"/>
-      </w:pPr>
-      <w:r>
-        <w:t>6.5 Release Bundle</w:t>
-      </w:r>
-    </w:p>
-    <w:p>
-      <w:pPr>
-        <w:spacing w:after="120" w:line="360" w:lineRule="auto"/>
-        <w:ind w:firstLine="720"/>
-        <w:jc w:val="both"/>
-      </w:pPr>
-      <w:r>
-        <w:t xml:space="preserve">The fifth item opens the local release bundle. It shows the SHA-256 checksum manifest, the pseudonymised author column in which logins are replaced by keyed hashes, and the results of the secret scan and the canary check. It also shows that the build refuses to run when the pseudonymisation key is absent, which is the guard added after an earlier unpublished build had included live logins.</w:t>
-      </w:r>
-    </w:p>
-    <w:p>
-      <w:pPr>
-        <w:keepNext/>
-        <w:spacing w:before="200"/>
-      </w:pPr>
-    </w:p>
-    <w:p>
-      <w:pPr>
-        <w:keepNext/>
-        <w:pBdr>
-          <w:top w:val="dashed" w:sz="8" w:space="6" w:color="7F7F7F"/>
-          <w:left w:val="dashed" w:sz="8" w:space="6" w:color="7F7F7F"/>
-          <w:right w:val="dashed" w:sz="8" w:space="6" w:color="7F7F7F"/>
-        </w:pBdr>
-        <w:spacing w:line="276" w:lineRule="auto"/>
-        <w:jc w:val="center"/>
-      </w:pPr>
-    </w:p>
-    <w:p>
-      <w:pPr>
-        <w:keepNext/>
-        <w:pBdr>
-          <w:left w:val="dashed" w:sz="8" w:space="6" w:color="7F7F7F"/>
-          <w:right w:val="dashed" w:sz="8" w:space="6" w:color="7F7F7F"/>
-        </w:pBdr>
-        <w:spacing w:line="276" w:lineRule="auto"/>
-        <w:jc w:val="center"/>
-      </w:pPr>
-    </w:p>
-    <w:p>
-      <w:pPr>
-        <w:keepNext/>
-        <w:pBdr>
-          <w:left w:val="dashed" w:sz="8" w:space="6" w:color="7F7F7F"/>
-          <w:right w:val="dashed" w:sz="8" w:space="6" w:color="7F7F7F"/>
-        </w:pBdr>
-        <w:spacing w:line="276" w:lineRule="auto"/>
-        <w:jc w:val="center"/>
-      </w:pPr>
-    </w:p>
-    <w:p>
-      <w:pPr>
-        <w:keepNext/>
-        <w:pBdr>
-          <w:left w:val="dashed" w:sz="8" w:space="6" w:color="7F7F7F"/>
-          <w:right w:val="dashed" w:sz="8" w:space="6" w:color="7F7F7F"/>
-        </w:pBdr>
-        <w:spacing w:line="276" w:lineRule="auto"/>
-        <w:jc w:val="center"/>
-      </w:pPr>
-      <w:r>
-        <w:rPr>
-          <w:sz w:val="22"/>
-          <w:szCs w:val="22"/>
-          <w:highlight w:val="yellow"/>
-        </w:rPr>
-        <w:t>[Insert screenshot: release checksum manifest]</w:t>
-      </w:r>
-    </w:p>
-    <w:p>
-      <w:pPr>
-        <w:keepNext/>
-        <w:pBdr>
-          <w:left w:val="dashed" w:sz="8" w:space="6" w:color="7F7F7F"/>
-          <w:right w:val="dashed" w:sz="8" w:space="6" w:color="7F7F7F"/>
-        </w:pBdr>
-        <w:spacing w:line="276" w:lineRule="auto"/>
-        <w:jc w:val="center"/>
-      </w:pPr>
-    </w:p>
-    <w:p>
-      <w:pPr>
-        <w:keepNext/>
-        <w:pBdr>
-          <w:left w:val="dashed" w:sz="8" w:space="6" w:color="7F7F7F"/>
-          <w:right w:val="dashed" w:sz="8" w:space="6" w:color="7F7F7F"/>
-        </w:pBdr>
-        <w:spacing w:line="276" w:lineRule="auto"/>
-        <w:jc w:val="center"/>
-      </w:pPr>
-    </w:p>
-    <w:p>
-      <w:pPr>
-        <w:keepNext/>
-        <w:pBdr>
-          <w:left w:val="dashed" w:sz="8" w:space="6" w:color="7F7F7F"/>
-          <w:bottom w:val="dashed" w:sz="8" w:space="6" w:color="7F7F7F"/>
-          <w:right w:val="dashed" w:sz="8" w:space="6" w:color="7F7F7F"/>
-        </w:pBdr>
-        <w:spacing w:line="276" w:lineRule="auto"/>
-        <w:jc w:val="center"/>
-      </w:pPr>
-    </w:p>
-    <w:p>
-      <w:pPr>
-        <w:spacing w:before="100" w:after="240"/>
-        <w:jc w:val="center"/>
-      </w:pPr>
-      <w:r>
-        <w:rPr>
-          <w:b/>
-          <w:bCs/>
-          <w:sz w:val="20"/>
-          <w:szCs w:val="20"/>
-        </w:rPr>
         <w:t xml:space="preserve">Fig. 6.7 </w:t>
       </w:r>
       <w:r>
@@ -32088,7 +32048,7 @@
         <w:jc w:val="both"/>
       </w:pPr>
       <w:r>
-        <w:t xml:space="preserve">Finally, the test-suite summary is shown. The main suite grew from 451 passing tests at the graph-layer handover to 655 at the end of the October run and to 782 passing at the final freeze (paper-numbers-v1). Every data-touching function is tested against real fixtures checked into the repository rather than against mocks.</w:t>
+        <w:t xml:space="preserve">Finally, the test-suite summary is shown. The main suite grew from 451 passing tests at the graph-layer baseline to 655 at the end of the October run, to 782 at the paper-numbers-v1 freeze and to 787 passing (1 skipped) on the latest full run (8 October 2026). Every data-touching function is tested against real fixtures checked into the repository rather than against mocks.</w:t>
       </w:r>
     </w:p>
     <w:p>
@@ -32100,78 +32060,51 @@
     <w:p>
       <w:pPr>
         <w:keepNext/>
-        <w:pBdr>
-          <w:top w:val="dashed" w:sz="8" w:space="6" w:color="7F7F7F"/>
-          <w:left w:val="dashed" w:sz="8" w:space="6" w:color="7F7F7F"/>
-          <w:right w:val="dashed" w:sz="8" w:space="6" w:color="7F7F7F"/>
-        </w:pBdr>
-        <w:spacing w:line="276" w:lineRule="auto"/>
+        <w:spacing w:before="160" w:after="60"/>
         <w:jc w:val="center"/>
       </w:pPr>
-    </w:p>
-    <w:p>
-      <w:pPr>
-        <w:keepNext/>
-        <w:pBdr>
-          <w:left w:val="dashed" w:sz="8" w:space="6" w:color="7F7F7F"/>
-          <w:right w:val="dashed" w:sz="8" w:space="6" w:color="7F7F7F"/>
-        </w:pBdr>
-        <w:spacing w:line="276" w:lineRule="auto"/>
-        <w:jc w:val="center"/>
-      </w:pPr>
-    </w:p>
-    <w:p>
-      <w:pPr>
-        <w:keepNext/>
-        <w:pBdr>
-          <w:left w:val="dashed" w:sz="8" w:space="6" w:color="7F7F7F"/>
-          <w:right w:val="dashed" w:sz="8" w:space="6" w:color="7F7F7F"/>
-        </w:pBdr>
-        <w:spacing w:line="276" w:lineRule="auto"/>
-        <w:jc w:val="center"/>
-      </w:pPr>
-    </w:p>
-    <w:p>
-      <w:pPr>
-        <w:keepNext/>
-        <w:pBdr>
-          <w:left w:val="dashed" w:sz="8" w:space="6" w:color="7F7F7F"/>
-          <w:right w:val="dashed" w:sz="8" w:space="6" w:color="7F7F7F"/>
-        </w:pBdr>
-        <w:spacing w:line="276" w:lineRule="auto"/>
-        <w:jc w:val="center"/>
-      </w:pPr>
-      <w:r>
-        <w:rPr>
-          <w:sz w:val="22"/>
-          <w:szCs w:val="22"/>
-          <w:highlight w:val="yellow"/>
-        </w:rPr>
-        <w:t xml:space="preserve">[Insert screenshot: test-suite summary (782 passed)]</w:t>
-      </w:r>
-    </w:p>
-    <w:p>
-      <w:pPr>
-        <w:keepNext/>
-        <w:pBdr>
-          <w:left w:val="dashed" w:sz="8" w:space="6" w:color="7F7F7F"/>
-          <w:right w:val="dashed" w:sz="8" w:space="6" w:color="7F7F7F"/>
-        </w:pBdr>
-        <w:spacing w:line="276" w:lineRule="auto"/>
-        <w:jc w:val="center"/>
-      </w:pPr>
-    </w:p>
-    <w:p>
-      <w:pPr>
-        <w:keepNext/>
-        <w:pBdr>
-          <w:left w:val="dashed" w:sz="8" w:space="6" w:color="7F7F7F"/>
-          <w:bottom w:val="dashed" w:sz="8" w:space="6" w:color="7F7F7F"/>
-          <w:right w:val="dashed" w:sz="8" w:space="6" w:color="7F7F7F"/>
-        </w:pBdr>
-        <w:spacing w:line="276" w:lineRule="auto"/>
-        <w:jc w:val="center"/>
-      </w:pPr>
+      <w:r>
+        <w:rPr>
+          <w:noProof/>
+        </w:rPr>
+        <w:drawing>
+          <wp:inline distT="0" distB="0" distL="0" distR="0">
+            <wp:extent cx="5486400" cy="844369"/>
+            <wp:effectExtent l="0" t="0" r="0" b="0"/>
+            <wp:docPr id="9685" name="fig6_8_test_suite" descr="fig6_8_test_suite"/>
+            <wp:cNvGraphicFramePr>
+              <a:graphicFrameLocks xmlns:a="http://schemas.openxmlformats.org/drawingml/2006/main" noChangeAspect="1"/>
+            </wp:cNvGraphicFramePr>
+            <a:graphic xmlns:a="http://schemas.openxmlformats.org/drawingml/2006/main">
+              <a:graphicData uri="http://schemas.openxmlformats.org/drawingml/2006/picture">
+                <pic:pic xmlns:pic="http://schemas.openxmlformats.org/drawingml/2006/picture">
+                  <pic:nvPicPr>
+                    <pic:cNvPr id="0" name=""/>
+                    <pic:cNvPicPr>
+                      <a:picLocks noChangeAspect="1"/>
+                    </pic:cNvPicPr>
+                  </pic:nvPicPr>
+                  <pic:blipFill>
+                    <a:blip r:embed="rIdBRfig6_8_test_suite"/>
+                    <a:stretch>
+                      <a:fillRect/>
+                    </a:stretch>
+                  </pic:blipFill>
+                  <pic:spPr>
+                    <a:xfrm>
+                      <a:off x="0" y="0"/>
+                      <a:ext cx="5486400" cy="844369"/>
+                    </a:xfrm>
+                    <a:prstGeom prst="rect">
+                      <a:avLst/>
+                    </a:prstGeom>
+                  </pic:spPr>
+                </pic:pic>
+              </a:graphicData>
+            </a:graphic>
+          </wp:inline>
+        </w:drawing>
+      </w:r>
     </w:p>
     <w:p>
       <w:pPr>
@@ -37419,7 +37352,7 @@
           <w:sz w:val="21"/>
           <w:szCs w:val="21"/>
         </w:rPr>
-        <w:t xml:space="preserve">make all on the mini-corpus completed with exit code 0 in </w:t>
+        <w:t xml:space="preserve">make all exited 0. On the latest run (8 October 2026) the mini-corpus reproduction took </w:t>
       </w:r>
       <w:r>
         <w:rPr>
@@ -37428,7 +37361,7 @@
           <w:sz w:val="21"/>
           <w:szCs w:val="21"/>
         </w:rPr>
-        <w:t xml:space="preserve">9 min 47.23 s</w:t>
+        <w:t xml:space="preserve">511.09 s</w:t>
       </w:r>
       <w:r>
         <w:rPr>
@@ -37436,7 +37369,7 @@
           <w:sz w:val="21"/>
           <w:szCs w:val="21"/>
         </w:rPr>
-        <w:t xml:space="preserve">, against a target of under 15 minutes, with 655 tests passed and 1 skipped; the first run, before a graph-query performance fix, took 13 min 59.96 s with 632 passed and 12 skipped. At the final freeze the main suite stands at 782 passing tests with 1 skipped, and make tables regenerates every reported number offline in 7 min 43 s on the final code commit. This is the strongest single piece of evidence for the reproducibility claim: the full pipeline, from raw data to tables, runs with one command on a laptop within the budget.</w:t>
+        <w:t xml:space="preserve"> against its 900 s budget (T5.6b met) and the whole command took 16 min 35 s including the test suite (787 passed, 1 skipped). Earlier runs on another machine took 9 min 47.23 s in total (655 passed, 1 skipped) and, before a graph-query performance fix, 13 min 59.96 s (632 passed, 12 skipped). make tables regenerates every reported number offline in 7 min 43 s on the final code commit. This is the strongest single piece of evidence for the reproducibility claim: the full pipeline, from raw data to tables, runs with one command on a laptop, with the reproduction step inside its budget.</w:t>
       </w:r>
     </w:p>
     <w:p>
@@ -39192,7 +39125,7 @@
         <w:jc w:val="both"/>
       </w:pPr>
       <w:r>
-        <w:t xml:space="preserve">The implementation is evaluated not only by its outputs but by the evidence that those outputs are correct. The main suite grew from 451 passing tests at the graph-layer handover to 655 at the end of the October run and to 782 passing at the final freeze (Fig. 7.10). Every data-touching function is tested against real checked-in fixtures rather than mocks, so a test fails when the code mishandles real data and not merely when it deviates from a mocked expectation.</w:t>
+        <w:t xml:space="preserve">The implementation is evaluated not only by its outputs but by the evidence that those outputs are correct. The main suite grew from 451 passing tests at the graph-layer baseline to 655 at the end of the October run, to 782 at the paper-numbers-v1 freeze and to 787 passing (1 skipped) on the latest full run (Fig. 7.10). Every data-touching function is tested against real checked-in fixtures rather than mocks, so a test fails when the code mishandles real data and not merely when it deviates from a mocked expectation.</w:t>
       </w:r>
     </w:p>
     <w:p>
@@ -39832,7 +39765,7 @@
         <w:t xml:space="preserve">One-command reproduction</w:t>
       </w:r>
       <w:r>
-        <w:t xml:space="preserve">: make all in 9 min 47.23 s against a 15-minute target (655 passed, 1 skipped); the main suite now stands at 782 passing tests, and make tables regenerates every reported number offline in about eight minutes.</w:t>
+        <w:t xml:space="preserve">: make all exits 0; the mini-corpus reproduction took 511.09 s of its 900 s budget and the whole command 16 min 35 s including 787 passing tests (1 skipped); make tables regenerates every reported number offline in about eight minutes.</w:t>
       </w:r>
     </w:p>
     <w:p>

</xml_diff>

<commit_message>
paper: embed remaining real screenshots and correct the ICSME 2016 reference authors
</commit_message>
<xml_diff>
--- a/BlastRadius_Project1_Report.docx
+++ b/BlastRadius_Project1_Report.docx
@@ -11665,7 +11665,7 @@
         <w:spacing w:before="180" w:after="100" w:line="360" w:lineRule="auto"/>
       </w:pPr>
       <w:r>
-        <w:t xml:space="preserve">2.1.5 Hunsen, Lochau, Schaefer and Schulze (2016)</w:t>
+        <w:t xml:space="preserve">2.1.5 Angerer, Prähofer and Grünbacher (2016)</w:t>
       </w:r>
     </w:p>
     <w:p>
@@ -11675,7 +11675,7 @@
         <w:jc w:val="both"/>
       </w:pPr>
       <w:r>
-        <w:t xml:space="preserve">Hunsen et al. address change impact analysis for configurable software, in which a single code base yields many product variants depending on configuration options. A change can affect some variants and not others, so impact must be computed over the configuration space as well as over code. The authors propose a modular, variability-aware analysis that avoids analysing every variant separately.</w:t>
+        <w:t xml:space="preserve">Angerer et al. address change impact analysis for configurable software, in which a single code base yields many product variants depending on configuration options. A change can affect some variants and not others, so impact must be computed over the configuration space as well as over code. The authors propose a modular, variability-aware analysis that avoids analysing every variant separately.</w:t>
       </w:r>
     </w:p>
     <w:p>
@@ -12570,7 +12570,7 @@
                 <w:sz w:val="20"/>
                 <w:szCs w:val="20"/>
               </w:rPr>
-              <w:t xml:space="preserve">Hunsen et al. (2016), ICSME</w:t>
+              <w:t xml:space="preserve">Angerer et al. (2016), ICSME</w:t>
             </w:r>
           </w:p>
         </w:tc>
@@ -31535,55 +31535,51 @@
     <w:p>
       <w:pPr>
         <w:keepNext/>
-        <w:pBdr>
-          <w:left w:val="dashed" w:sz="8" w:space="6" w:color="7F7F7F"/>
-          <w:right w:val="dashed" w:sz="8" w:space="6" w:color="7F7F7F"/>
-        </w:pBdr>
-        <w:spacing w:line="276" w:lineRule="auto"/>
+        <w:spacing w:before="160" w:after="60"/>
         <w:jc w:val="center"/>
       </w:pPr>
       <w:r>
         <w:rPr>
-          <w:sz w:val="22"/>
-          <w:szCs w:val="22"/>
-          <w:highlight w:val="yellow"/>
-        </w:rPr>
-        <w:t>[Still needed: first lines of the decompressed graph JSON showing typed nodes (node_type) and typed edges (edge_type, confidence).]</w:t>
-      </w:r>
-    </w:p>
-    <w:p>
-      <w:pPr>
-        <w:keepNext/>
-        <w:pBdr>
-          <w:left w:val="dashed" w:sz="8" w:space="6" w:color="7F7F7F"/>
-          <w:right w:val="dashed" w:sz="8" w:space="6" w:color="7F7F7F"/>
-        </w:pBdr>
-        <w:spacing w:line="276" w:lineRule="auto"/>
-        <w:jc w:val="center"/>
-      </w:pPr>
-    </w:p>
-    <w:p>
-      <w:pPr>
-        <w:keepNext/>
-        <w:pBdr>
-          <w:left w:val="dashed" w:sz="8" w:space="6" w:color="7F7F7F"/>
-          <w:right w:val="dashed" w:sz="8" w:space="6" w:color="7F7F7F"/>
-        </w:pBdr>
-        <w:spacing w:line="276" w:lineRule="auto"/>
-        <w:jc w:val="center"/>
-      </w:pPr>
-    </w:p>
-    <w:p>
-      <w:pPr>
-        <w:keepNext/>
-        <w:pBdr>
-          <w:left w:val="dashed" w:sz="8" w:space="6" w:color="7F7F7F"/>
-          <w:bottom w:val="dashed" w:sz="8" w:space="6" w:color="7F7F7F"/>
-          <w:right w:val="dashed" w:sz="8" w:space="6" w:color="7F7F7F"/>
-        </w:pBdr>
-        <w:spacing w:line="276" w:lineRule="auto"/>
-        <w:jc w:val="center"/>
-      </w:pPr>
+          <w:noProof/>
+        </w:rPr>
+        <w:drawing>
+          <wp:inline distT="0" distB="0" distL="0" distR="0">
+            <wp:extent cx="5486400" cy="2802960"/>
+            <wp:effectExtent l="0" t="0" r="0" b="0"/>
+            <wp:docPr id="9936" name="fig6_5_graph_json" descr="fig6_5_graph_json"/>
+            <wp:cNvGraphicFramePr>
+              <a:graphicFrameLocks xmlns:a="http://schemas.openxmlformats.org/drawingml/2006/main" noChangeAspect="1"/>
+            </wp:cNvGraphicFramePr>
+            <a:graphic xmlns:a="http://schemas.openxmlformats.org/drawingml/2006/main">
+              <a:graphicData uri="http://schemas.openxmlformats.org/drawingml/2006/picture">
+                <pic:pic xmlns:pic="http://schemas.openxmlformats.org/drawingml/2006/picture">
+                  <pic:nvPicPr>
+                    <pic:cNvPr id="0" name=""/>
+                    <pic:cNvPicPr>
+                      <a:picLocks noChangeAspect="1"/>
+                    </pic:cNvPicPr>
+                  </pic:nvPicPr>
+                  <pic:blipFill>
+                    <a:blip r:embed="rIdBRfig6_5_graph_json"/>
+                    <a:stretch>
+                      <a:fillRect/>
+                    </a:stretch>
+                  </pic:blipFill>
+                  <pic:spPr>
+                    <a:xfrm>
+                      <a:off x="0" y="0"/>
+                      <a:ext cx="5486400" cy="2802960"/>
+                    </a:xfrm>
+                    <a:prstGeom prst="rect">
+                      <a:avLst/>
+                    </a:prstGeom>
+                  </pic:spPr>
+                </pic:pic>
+              </a:graphicData>
+            </a:graphic>
+          </wp:inline>
+        </w:drawing>
+      </w:r>
     </w:p>
     <w:p>
       <w:pPr>
@@ -31616,89 +31612,51 @@
     <w:p>
       <w:pPr>
         <w:keepNext/>
-        <w:pBdr>
-          <w:top w:val="dashed" w:sz="8" w:space="6" w:color="7F7F7F"/>
-          <w:left w:val="dashed" w:sz="8" w:space="6" w:color="7F7F7F"/>
-          <w:right w:val="dashed" w:sz="8" w:space="6" w:color="7F7F7F"/>
-        </w:pBdr>
-        <w:spacing w:line="276" w:lineRule="auto"/>
+        <w:spacing w:before="160" w:after="60"/>
         <w:jc w:val="center"/>
       </w:pPr>
-    </w:p>
-    <w:p>
-      <w:pPr>
-        <w:keepNext/>
-        <w:pBdr>
-          <w:left w:val="dashed" w:sz="8" w:space="6" w:color="7F7F7F"/>
-          <w:right w:val="dashed" w:sz="8" w:space="6" w:color="7F7F7F"/>
-        </w:pBdr>
-        <w:spacing w:line="276" w:lineRule="auto"/>
-        <w:jc w:val="center"/>
-      </w:pPr>
-    </w:p>
-    <w:p>
-      <w:pPr>
-        <w:keepNext/>
-        <w:pBdr>
-          <w:left w:val="dashed" w:sz="8" w:space="6" w:color="7F7F7F"/>
-          <w:right w:val="dashed" w:sz="8" w:space="6" w:color="7F7F7F"/>
-        </w:pBdr>
-        <w:spacing w:line="276" w:lineRule="auto"/>
-        <w:jc w:val="center"/>
-      </w:pPr>
-    </w:p>
-    <w:p>
-      <w:pPr>
-        <w:keepNext/>
-        <w:pBdr>
-          <w:left w:val="dashed" w:sz="8" w:space="6" w:color="7F7F7F"/>
-          <w:right w:val="dashed" w:sz="8" w:space="6" w:color="7F7F7F"/>
-        </w:pBdr>
-        <w:spacing w:line="276" w:lineRule="auto"/>
-        <w:jc w:val="center"/>
-      </w:pPr>
-      <w:r>
-        <w:rPr>
-          <w:sz w:val="22"/>
-          <w:szCs w:val="22"/>
-          <w:highlight w:val="yellow"/>
-        </w:rPr>
-        <w:t xml:space="preserve">[Insert screenshot: query output: k-hop neighbourhood and distance to changed code]</w:t>
-      </w:r>
-    </w:p>
-    <w:p>
-      <w:pPr>
-        <w:keepNext/>
-        <w:pBdr>
-          <w:left w:val="dashed" w:sz="8" w:space="6" w:color="7F7F7F"/>
-          <w:right w:val="dashed" w:sz="8" w:space="6" w:color="7F7F7F"/>
-        </w:pBdr>
-        <w:spacing w:line="276" w:lineRule="auto"/>
-        <w:jc w:val="center"/>
-      </w:pPr>
-    </w:p>
-    <w:p>
-      <w:pPr>
-        <w:keepNext/>
-        <w:pBdr>
-          <w:left w:val="dashed" w:sz="8" w:space="6" w:color="7F7F7F"/>
-          <w:right w:val="dashed" w:sz="8" w:space="6" w:color="7F7F7F"/>
-        </w:pBdr>
-        <w:spacing w:line="276" w:lineRule="auto"/>
-        <w:jc w:val="center"/>
-      </w:pPr>
-    </w:p>
-    <w:p>
-      <w:pPr>
-        <w:keepNext/>
-        <w:pBdr>
-          <w:left w:val="dashed" w:sz="8" w:space="6" w:color="7F7F7F"/>
-          <w:bottom w:val="dashed" w:sz="8" w:space="6" w:color="7F7F7F"/>
-          <w:right w:val="dashed" w:sz="8" w:space="6" w:color="7F7F7F"/>
-        </w:pBdr>
-        <w:spacing w:line="276" w:lineRule="auto"/>
-        <w:jc w:val="center"/>
-      </w:pPr>
+      <w:r>
+        <w:rPr>
+          <w:noProof/>
+        </w:rPr>
+        <w:drawing>
+          <wp:inline distT="0" distB="0" distL="0" distR="0">
+            <wp:extent cx="5486400" cy="1379898"/>
+            <wp:effectExtent l="0" t="0" r="0" b="0"/>
+            <wp:docPr id="9909" name="fig6_6_graph_query" descr="fig6_6_graph_query"/>
+            <wp:cNvGraphicFramePr>
+              <a:graphicFrameLocks xmlns:a="http://schemas.openxmlformats.org/drawingml/2006/main" noChangeAspect="1"/>
+            </wp:cNvGraphicFramePr>
+            <a:graphic xmlns:a="http://schemas.openxmlformats.org/drawingml/2006/main">
+              <a:graphicData uri="http://schemas.openxmlformats.org/drawingml/2006/picture">
+                <pic:pic xmlns:pic="http://schemas.openxmlformats.org/drawingml/2006/picture">
+                  <pic:nvPicPr>
+                    <pic:cNvPr id="0" name=""/>
+                    <pic:cNvPicPr>
+                      <a:picLocks noChangeAspect="1"/>
+                    </pic:cNvPicPr>
+                  </pic:nvPicPr>
+                  <pic:blipFill>
+                    <a:blip r:embed="rIdBRfig6_6_graph_query"/>
+                    <a:stretch>
+                      <a:fillRect/>
+                    </a:stretch>
+                  </pic:blipFill>
+                  <pic:spPr>
+                    <a:xfrm>
+                      <a:off x="0" y="0"/>
+                      <a:ext cx="5486400" cy="1379898"/>
+                    </a:xfrm>
+                    <a:prstGeom prst="rect">
+                      <a:avLst/>
+                    </a:prstGeom>
+                  </pic:spPr>
+                </pic:pic>
+              </a:graphicData>
+            </a:graphic>
+          </wp:inline>
+        </w:drawing>
+      </w:r>
     </w:p>
     <w:p>
       <w:pPr>
@@ -31800,55 +31758,51 @@
     <w:p>
       <w:pPr>
         <w:keepNext/>
-        <w:pBdr>
-          <w:left w:val="dashed" w:sz="8" w:space="6" w:color="7F7F7F"/>
-          <w:right w:val="dashed" w:sz="8" w:space="6" w:color="7F7F7F"/>
-        </w:pBdr>
-        <w:spacing w:line="276" w:lineRule="auto"/>
+        <w:spacing w:before="160" w:after="60"/>
         <w:jc w:val="center"/>
       </w:pPr>
       <w:r>
         <w:rPr>
-          <w:sz w:val="22"/>
-          <w:szCs w:val="22"/>
-          <w:highlight w:val="yellow"/>
-        </w:rPr>
-        <w:t>[Still needed: output of cat release/v0.1/CHECKSUMS.sha256.]</w:t>
-      </w:r>
-    </w:p>
-    <w:p>
-      <w:pPr>
-        <w:keepNext/>
-        <w:pBdr>
-          <w:left w:val="dashed" w:sz="8" w:space="6" w:color="7F7F7F"/>
-          <w:right w:val="dashed" w:sz="8" w:space="6" w:color="7F7F7F"/>
-        </w:pBdr>
-        <w:spacing w:line="276" w:lineRule="auto"/>
-        <w:jc w:val="center"/>
-      </w:pPr>
-    </w:p>
-    <w:p>
-      <w:pPr>
-        <w:keepNext/>
-        <w:pBdr>
-          <w:left w:val="dashed" w:sz="8" w:space="6" w:color="7F7F7F"/>
-          <w:right w:val="dashed" w:sz="8" w:space="6" w:color="7F7F7F"/>
-        </w:pBdr>
-        <w:spacing w:line="276" w:lineRule="auto"/>
-        <w:jc w:val="center"/>
-      </w:pPr>
-    </w:p>
-    <w:p>
-      <w:pPr>
-        <w:keepNext/>
-        <w:pBdr>
-          <w:left w:val="dashed" w:sz="8" w:space="6" w:color="7F7F7F"/>
-          <w:bottom w:val="dashed" w:sz="8" w:space="6" w:color="7F7F7F"/>
-          <w:right w:val="dashed" w:sz="8" w:space="6" w:color="7F7F7F"/>
-        </w:pBdr>
-        <w:spacing w:line="276" w:lineRule="auto"/>
-        <w:jc w:val="center"/>
-      </w:pPr>
+          <w:noProof/>
+        </w:rPr>
+        <w:drawing>
+          <wp:inline distT="0" distB="0" distL="0" distR="0">
+            <wp:extent cx="5486400" cy="1198179"/>
+            <wp:effectExtent l="0" t="0" r="0" b="0"/>
+            <wp:docPr id="9892" name="fig6_7_release_manifest" descr="fig6_7_release_manifest"/>
+            <wp:cNvGraphicFramePr>
+              <a:graphicFrameLocks xmlns:a="http://schemas.openxmlformats.org/drawingml/2006/main" noChangeAspect="1"/>
+            </wp:cNvGraphicFramePr>
+            <a:graphic xmlns:a="http://schemas.openxmlformats.org/drawingml/2006/main">
+              <a:graphicData uri="http://schemas.openxmlformats.org/drawingml/2006/picture">
+                <pic:pic xmlns:pic="http://schemas.openxmlformats.org/drawingml/2006/picture">
+                  <pic:nvPicPr>
+                    <pic:cNvPr id="0" name=""/>
+                    <pic:cNvPicPr>
+                      <a:picLocks noChangeAspect="1"/>
+                    </pic:cNvPicPr>
+                  </pic:nvPicPr>
+                  <pic:blipFill>
+                    <a:blip r:embed="rIdBRfig6_7_release_manifest"/>
+                    <a:stretch>
+                      <a:fillRect/>
+                    </a:stretch>
+                  </pic:blipFill>
+                  <pic:spPr>
+                    <a:xfrm>
+                      <a:off x="0" y="0"/>
+                      <a:ext cx="5486400" cy="1198179"/>
+                    </a:xfrm>
+                    <a:prstGeom prst="rect">
+                      <a:avLst/>
+                    </a:prstGeom>
+                  </pic:spPr>
+                </pic:pic>
+              </a:graphicData>
+            </a:graphic>
+          </wp:inline>
+        </w:drawing>
+      </w:r>
     </w:p>
     <w:p>
       <w:pPr>
@@ -40149,6 +40103,24 @@
         <w:ind w:left="720" w:hanging="720"/>
       </w:pPr>
       <w:r>
+        <w:t xml:space="preserve">Angerer, F., Prähofer, H., &amp; Grünbacher, P. (2016). Modular change impact analysis for configurable software. In </w:t>
+      </w:r>
+      <w:r>
+        <w:rPr>
+          <w:i/>
+        </w:rPr>
+        <w:t xml:space="preserve">Proceedings of the IEEE International Conference on Software Maintenance and Evolution (ICSME)</w:t>
+      </w:r>
+      <w:r>
+        <w:t xml:space="preserve"> (pp. 468–472). IEEE.</w:t>
+      </w:r>
+    </w:p>
+    <w:p>
+      <w:pPr>
+        <w:spacing w:after="120" w:line="360" w:lineRule="auto"/>
+        <w:ind w:left="720" w:hanging="720"/>
+      </w:pPr>
+      <w:r>
         <w:t xml:space="preserve">Bell, J., Legunsen, O., Hilton, M., Eloussi, L., Yung, T., &amp; Marinov, D. (2018). DeFlaker: Automatically detecting flaky tests. In </w:t>
       </w:r>
       <w:r>
@@ -40312,31 +40284,6 @@
       </w:r>
       <w:r>
         <w:t>(7), 2376–2398. https://doi.org/10.1109/TSE.2021.3059481</w:t>
-      </w:r>
-    </w:p>
-    <w:p>
-      <w:pPr>
-        <w:spacing w:after="120" w:line="360" w:lineRule="auto"/>
-        <w:ind w:left="720" w:hanging="720"/>
-      </w:pPr>
-      <w:r>
-        <w:t xml:space="preserve">Hunsen, C., Lochau, M., Schaefer, I., &amp; Schulze, S. (2016). Modular change impact analysis for configurable software. In </w:t>
-      </w:r>
-      <w:r>
-        <w:rPr>
-          <w:i/>
-          <w:iCs/>
-        </w:rPr>
-        <w:t>Proceedings of the IEEE International Conference on Software Maintenance and Evolution (ICSME)</w:t>
-      </w:r>
-      <w:r>
-        <w:t xml:space="preserve">. IEEE. </w:t>
-      </w:r>
-      <w:r>
-        <w:rPr>
-          <w:highlight w:val="yellow"/>
-        </w:rPr>
-        <w:t>[VERIFY: these authors could not be confirmed; ICSME 2016 lists this title under Angerer, Prähofer and Grünbacher. Check IEEE Xplore or DBLP, then correct authors and pages, or delete this reference and its survey entry]</w:t>
       </w:r>
     </w:p>
     <w:p>
@@ -42386,10 +42333,249 @@
         <w:jc w:val="both"/>
       </w:pPr>
       <w:r>
-        <w:rPr>
-          <w:highlight w:val="yellow"/>
-        </w:rPr>
-        <w:t xml:space="preserve">[Insert a short usage example of min_distance_to_any_changed() or k_hop_neighborhood() on one mini-corpus commit, with its real output.]</w:t>
+        <w:t xml:space="preserve">Listing A.5b runs the two query primitives on one commit-pinned graph of fla-org/flash-linear-attention, for two changed nodes and one failing test of a real instance. The output was produced on the authors' machine (Fig. 6.6 shows the same run).</w:t>
+      </w:r>
+    </w:p>
+    <w:p>
+      <w:pPr>
+        <w:keepNext/>
+        <w:spacing w:before="160" w:after="60"/>
+      </w:pPr>
+      <w:r>
+        <w:rPr>
+          <w:i/>
+          <w:iCs/>
+          <w:sz w:val="20"/>
+          <w:szCs w:val="20"/>
+        </w:rPr>
+        <w:t>Listing A.5b k_hop_neighborhood() and min_distance_to_any_changed() on one mini-corpus graph</w:t>
+      </w:r>
+    </w:p>
+    <w:p>
+      <w:pPr>
+        <w:keepNext/>
+        <w:keepLines/>
+        <w:pBdr>
+          <w:left w:val="single" w:sz="12" w:space="8" w:color="1F3A5F"/>
+        </w:pBdr>
+        <w:shd w:val="clear" w:color="auto" w:fill="F4F6F8"/>
+        <w:ind w:left="200"/>
+      </w:pPr>
+      <w:r>
+        <w:rPr>
+          <w:rFonts w:ascii="Courier New" w:eastAsia="Courier New" w:hAnsi="Courier New" w:cs="Courier New"/>
+          <w:sz w:val="18"/>
+          <w:szCs w:val="18"/>
+        </w:rPr>
+        <w:t xml:space="preserve">from pathlib import Path</w:t>
+      </w:r>
+    </w:p>
+    <w:p>
+      <w:pPr>
+        <w:keepNext/>
+        <w:keepLines/>
+        <w:pBdr>
+          <w:left w:val="single" w:sz="12" w:space="8" w:color="1F3A5F"/>
+        </w:pBdr>
+        <w:shd w:val="clear" w:color="auto" w:fill="F4F6F8"/>
+        <w:ind w:left="200"/>
+      </w:pPr>
+      <w:r>
+        <w:rPr>
+          <w:rFonts w:ascii="Courier New" w:eastAsia="Courier New" w:hAnsi="Courier New" w:cs="Courier New"/>
+          <w:sz w:val="18"/>
+          <w:szCs w:val="18"/>
+        </w:rPr>
+        <w:t xml:space="preserve">from src.graph.build import load_graph</w:t>
+      </w:r>
+    </w:p>
+    <w:p>
+      <w:pPr>
+        <w:keepNext/>
+        <w:keepLines/>
+        <w:pBdr>
+          <w:left w:val="single" w:sz="12" w:space="8" w:color="1F3A5F"/>
+        </w:pBdr>
+        <w:shd w:val="clear" w:color="auto" w:fill="F4F6F8"/>
+        <w:ind w:left="200"/>
+      </w:pPr>
+      <w:r>
+        <w:rPr>
+          <w:rFonts w:ascii="Courier New" w:eastAsia="Courier New" w:hAnsi="Courier New" w:cs="Courier New"/>
+          <w:sz w:val="18"/>
+          <w:szCs w:val="18"/>
+        </w:rPr>
+        <w:t xml:space="preserve">from src.graph.query import GraphQuery</w:t>
+      </w:r>
+    </w:p>
+    <w:p>
+      <w:pPr>
+        <w:keepNext/>
+        <w:keepLines/>
+        <w:pBdr>
+          <w:left w:val="single" w:sz="12" w:space="8" w:color="1F3A5F"/>
+        </w:pBdr>
+        <w:shd w:val="clear" w:color="auto" w:fill="F4F6F8"/>
+        <w:ind w:left="200"/>
+      </w:pPr>
+      <w:r>
+        <w:rPr>
+          <w:rFonts w:ascii="Courier New" w:eastAsia="Courier New" w:hAnsi="Courier New" w:cs="Courier New"/>
+          <w:sz w:val="18"/>
+          <w:szCs w:val="18"/>
+        </w:rPr>
+        <w:t xml:space="preserve">p = Path("data/graphs/graph_fla-org__flash-linear-attention_366a4ae3155fa0de562ee997c00d0a88fb7c4804.json.gz")</w:t>
+      </w:r>
+    </w:p>
+    <w:p>
+      <w:pPr>
+        <w:keepNext/>
+        <w:keepLines/>
+        <w:pBdr>
+          <w:left w:val="single" w:sz="12" w:space="8" w:color="1F3A5F"/>
+        </w:pBdr>
+        <w:shd w:val="clear" w:color="auto" w:fill="F4F6F8"/>
+        <w:ind w:left="200"/>
+      </w:pPr>
+      <w:r>
+        <w:rPr>
+          <w:rFonts w:ascii="Courier New" w:eastAsia="Courier New" w:hAnsi="Courier New" w:cs="Courier New"/>
+          <w:sz w:val="18"/>
+          <w:szCs w:val="18"/>
+        </w:rPr>
+        <w:t xml:space="preserve">q = GraphQuery(load_graph(p))</w:t>
+      </w:r>
+    </w:p>
+    <w:p>
+      <w:pPr>
+        <w:keepNext/>
+        <w:keepLines/>
+        <w:pBdr>
+          <w:left w:val="single" w:sz="12" w:space="8" w:color="1F3A5F"/>
+        </w:pBdr>
+        <w:shd w:val="clear" w:color="auto" w:fill="F4F6F8"/>
+        <w:ind w:left="200"/>
+      </w:pPr>
+      <w:r>
+        <w:rPr>
+          <w:rFonts w:ascii="Courier New" w:eastAsia="Courier New" w:hAnsi="Courier New" w:cs="Courier New"/>
+          <w:sz w:val="18"/>
+          <w:szCs w:val="18"/>
+        </w:rPr>
+        <w:t xml:space="preserve">changed = ["fla_layers_nsa_py_longtensor", "fla_layers_nsa_py_tensor"]</w:t>
+      </w:r>
+    </w:p>
+    <w:p>
+      <w:pPr>
+        <w:keepNext/>
+        <w:keepLines/>
+        <w:pBdr>
+          <w:left w:val="single" w:sz="12" w:space="8" w:color="1F3A5F"/>
+        </w:pBdr>
+        <w:shd w:val="clear" w:color="auto" w:fill="F4F6F8"/>
+        <w:ind w:left="200"/>
+      </w:pPr>
+      <w:r>
+        <w:rPr>
+          <w:rFonts w:ascii="Courier New" w:eastAsia="Courier New" w:hAnsi="Courier New" w:cs="Courier New"/>
+          <w:sz w:val="18"/>
+          <w:szCs w:val="18"/>
+        </w:rPr>
+        <w:t xml:space="preserve">test = "tests_ops_test_nsa_test_parallel"</w:t>
+      </w:r>
+    </w:p>
+    <w:p>
+      <w:pPr>
+        <w:keepNext/>
+        <w:keepLines/>
+        <w:pBdr>
+          <w:left w:val="single" w:sz="12" w:space="8" w:color="1F3A5F"/>
+        </w:pBdr>
+        <w:shd w:val="clear" w:color="auto" w:fill="F4F6F8"/>
+        <w:ind w:left="200"/>
+      </w:pPr>
+      <w:r>
+        <w:rPr>
+          <w:rFonts w:ascii="Courier New" w:eastAsia="Courier New" w:hAnsi="Courier New" w:cs="Courier New"/>
+          <w:sz w:val="18"/>
+          <w:szCs w:val="18"/>
+        </w:rPr>
+        <w:t xml:space="preserve">print("k_hop_neighborhood(k=2) size:", len(q.k_hop_neighborhood(changed, k=2)))</w:t>
+      </w:r>
+    </w:p>
+    <w:p>
+      <w:pPr>
+        <w:keepNext/>
+        <w:keepLines/>
+        <w:pBdr>
+          <w:left w:val="single" w:sz="12" w:space="8" w:color="1F3A5F"/>
+        </w:pBdr>
+        <w:shd w:val="clear" w:color="auto" w:fill="F4F6F8"/>
+        <w:ind w:left="200"/>
+      </w:pPr>
+      <w:r>
+        <w:rPr>
+          <w:rFonts w:ascii="Courier New" w:eastAsia="Courier New" w:hAnsi="Courier New" w:cs="Courier New"/>
+          <w:sz w:val="18"/>
+          <w:szCs w:val="18"/>
+        </w:rPr>
+        <w:t xml:space="preserve">print("min_distance_to_any_changed:", q.min_distance_to_any_changed(test, changed))</w:t>
+      </w:r>
+    </w:p>
+    <w:p>
+      <w:pPr>
+        <w:keepNext/>
+        <w:keepLines/>
+        <w:pBdr>
+          <w:left w:val="single" w:sz="12" w:space="8" w:color="1F3A5F"/>
+        </w:pBdr>
+        <w:shd w:val="clear" w:color="auto" w:fill="F4F6F8"/>
+        <w:ind w:left="200"/>
+      </w:pPr>
+      <w:r>
+        <w:rPr>
+          <w:rFonts w:ascii="Courier New" w:eastAsia="Courier New" w:hAnsi="Courier New" w:cs="Courier New"/>
+          <w:sz w:val="18"/>
+          <w:szCs w:val="18"/>
+        </w:rPr>
+        <w:t xml:space="preserve"># output:</w:t>
+      </w:r>
+    </w:p>
+    <w:p>
+      <w:pPr>
+        <w:keepNext/>
+        <w:keepLines/>
+        <w:pBdr>
+          <w:left w:val="single" w:sz="12" w:space="8" w:color="1F3A5F"/>
+        </w:pBdr>
+        <w:shd w:val="clear" w:color="auto" w:fill="F4F6F8"/>
+        <w:ind w:left="200"/>
+      </w:pPr>
+      <w:r>
+        <w:rPr>
+          <w:rFonts w:ascii="Courier New" w:eastAsia="Courier New" w:hAnsi="Courier New" w:cs="Courier New"/>
+          <w:sz w:val="18"/>
+          <w:szCs w:val="18"/>
+        </w:rPr>
+        <w:t xml:space="preserve"># k_hop_neighborhood(k=2) size: 11</w:t>
+      </w:r>
+    </w:p>
+    <w:p>
+      <w:pPr>
+        <w:keepLines/>
+        <w:pBdr>
+          <w:left w:val="single" w:sz="12" w:space="8" w:color="1F3A5F"/>
+        </w:pBdr>
+        <w:shd w:val="clear" w:color="auto" w:fill="F4F6F8"/>
+        <w:ind w:left="200"/>
+      </w:pPr>
+      <w:r>
+        <w:rPr>
+          <w:rFonts w:ascii="Courier New" w:eastAsia="Courier New" w:hAnsi="Courier New" w:cs="Courier New"/>
+          <w:sz w:val="18"/>
+          <w:szCs w:val="18"/>
+        </w:rPr>
+        <w:t xml:space="preserve"># min_distance_to_any_changed: 3</w:t>
       </w:r>
     </w:p>
     <w:p>

</xml_diff>

<commit_message>
paper: embed live-run captures, record CC BY 4.0, reserved DOI and v0.1 schema limits in the report
</commit_message>
<xml_diff>
--- a/BlastRadius_Project1_Report.docx
+++ b/BlastRadius_Project1_Report.docx
@@ -25189,7 +25189,7 @@
                 <w:sz w:val="20"/>
                 <w:szCs w:val="20"/>
               </w:rPr>
-              <w:t xml:space="preserve">Code MIT (planned); data CC-BY 4.0 (planned) [to be confirmed by the team]; vendored Graphify Apache-2.0 with MIT portions</w:t>
+              <w:t xml:space="preserve">Code MIT; data CC BY 4.0 (decided 9 October 2026); vendored Graphify Apache-2.0 with MIT portions</w:t>
             </w:r>
           </w:p>
         </w:tc>
@@ -32989,7 +32989,7 @@
         <w:jc w:val="both"/>
       </w:pPr>
       <w:r>
-        <w:t xml:space="preserve">The final review also includes a demo site that replays one real instance through the pipeline stages. Its Overview view shows the scale of the corpus and the headline RQ1 finding, and its Live run view draws the code-graph neighbourhood of a change (changed files at the centre, dependants in rings by distance) with the tests that actually failed and the files each predictor selected marked on it. It is a static replay of exported data, so every number on it is read from the same generated tables as this report; make demo runs the same walkthrough live in the terminal.</w:t>
+        <w:t xml:space="preserve">The final review also includes a demo site that replays one real instance through the pipeline stages. Its Overview view shows the scale of the corpus and the headline RQ1 finding, and its Live run view draws the code-graph neighbourhood of a change (changed files at the centre, dependants in rings by distance) with the tests that actually failed and the files each predictor selected marked on it. It is a static replay of exported data (Figs. A.1 to A.3 in Appendix A show it), so every number on it is read from the same generated tables as this report; make demo runs the same walkthrough live in the terminal.</w:t>
       </w:r>
     </w:p>
     <w:p>
@@ -37456,17 +37456,26 @@
         <w:jc w:val="both"/>
       </w:pPr>
       <w:r>
-        <w:t xml:space="preserve">The build now refuses to run without the pseudonymisation key. This guard was added after an earlier build had shipped live logins in the local bundle; that build was never published. The public upload to Zenodo, which assigns a DOI, and to HuggingFace is </w:t>
+        <w:t xml:space="preserve">The build now refuses to run without the pseudonymisation key. This guard was added after an earlier build had shipped live logins in the local bundle; that build was never published. The Zenodo deposit has a reserved DOI, 10.5281/zenodo.23250262, and the release bundle is licensed CC BY 4.0 (the source code is MIT); the deposit is to be published after the final checks, and the upload to HuggingFace is </w:t>
       </w:r>
       <w:r>
         <w:rPr>
           <w:b/>
-          <w:bCs/>
-        </w:rPr>
-        <w:t>pending</w:t>
-      </w:r>
-      <w:r>
-        <w:t>. It is a one-way step, because a DOI cannot be withdrawn, and it is performed manually after the remaining checks.</w:t>
+        </w:rPr>
+        <w:t xml:space="preserve">pending</w:t>
+      </w:r>
+      <w:r>
+        <w:t xml:space="preserve">. Publishing is one-way, because a DOI cannot be withdrawn and the files cannot change afterwards.</w:t>
+      </w:r>
+    </w:p>
+    <w:p>
+      <w:pPr>
+        <w:spacing w:after="120" w:line="360" w:lineRule="auto"/>
+        <w:ind w:firstLine="720"/>
+        <w:jc w:val="both"/>
+      </w:pPr>
+      <w:r>
+        <w:t xml:space="preserve">The shipped schema is narrower than the design specification. In release v0.1 the instances table carries the base commit (base_sha) but base_run_id is null for all 165,349 rows, and the outcomes table carries only run_id, test_id and split, plus a leaked pandas index column. Base-run resolution, per-test head and base statuses, same-commit flip flags and the bound test file are computed by the pipeline and regenerated by make tables, but they are not shipped as columns; the datasheet records this as a limitation.</w:t>
       </w:r>
     </w:p>
     <w:p>
@@ -39905,12 +39914,11 @@
       <w:r>
         <w:rPr>
           <w:b/>
-          <w:bCs/>
-        </w:rPr>
-        <w:t>Publish the dataset</w:t>
-      </w:r>
-      <w:r>
-        <w:t xml:space="preserve">: upload BR-Bench to Zenodo with a DOI and to HuggingFace, with the datasheet.</w:t>
+        </w:rPr>
+        <w:t xml:space="preserve">Publish the dataset</w:t>
+      </w:r>
+      <w:r>
+        <w:t xml:space="preserve">: publish the Zenodo deposit (reserved DOI 10.5281/zenodo.23250262, CC BY 4.0) and add a HuggingFace card, with the datasheet; ship the base run, per-test statuses and test-file binding as columns in a later version.</w:t>
       </w:r>
     </w:p>
     <w:p>
@@ -43515,15 +43523,144 @@
     </w:p>
     <w:p>
       <w:pPr>
-        <w:spacing w:after="120" w:line="360" w:lineRule="auto"/>
-        <w:ind w:firstLine="720"/>
-        <w:jc w:val="both"/>
-      </w:pPr>
-      <w:r>
-        <w:rPr>
-          <w:highlight w:val="yellow"/>
-        </w:rPr>
-        <w:t>[Insert screenshot: demo site Live run (recapture from the upgraded site, file docs/screenshots/figA8_demo_liverun.png).]</w:t>
+        <w:keepNext/>
+        <w:spacing w:before="160" w:after="60"/>
+        <w:jc w:val="center"/>
+      </w:pPr>
+      <w:r>
+        <w:rPr>
+          <w:noProof/>
+        </w:rPr>
+        <w:drawing>
+          <wp:inline distT="0" distB="0" distL="0" distR="0">
+            <wp:extent cx="5120640" cy="3541000"/>
+            <wp:effectExtent l="0" t="0" r="0" b="0"/>
+            <wp:docPr id="9994" name="figA8_live_blast" descr="figA8_live_blast"/>
+            <wp:cNvGraphicFramePr>
+              <a:graphicFrameLocks xmlns:a="http://schemas.openxmlformats.org/drawingml/2006/main" noChangeAspect="1"/>
+            </wp:cNvGraphicFramePr>
+            <a:graphic xmlns:a="http://schemas.openxmlformats.org/drawingml/2006/main">
+              <a:graphicData uri="http://schemas.openxmlformats.org/drawingml/2006/picture">
+                <pic:pic xmlns:pic="http://schemas.openxmlformats.org/drawingml/2006/picture">
+                  <pic:nvPicPr>
+                    <pic:cNvPr id="0" name=""/>
+                    <pic:cNvPicPr>
+                      <a:picLocks noChangeAspect="1"/>
+                    </pic:cNvPicPr>
+                  </pic:nvPicPr>
+                  <pic:blipFill>
+                    <a:blip r:embed="rIdBRfigA8_live_blast"/>
+                    <a:stretch>
+                      <a:fillRect/>
+                    </a:stretch>
+                  </pic:blipFill>
+                  <pic:spPr>
+                    <a:xfrm>
+                      <a:off x="0" y="0"/>
+                      <a:ext cx="5120640" cy="3541000"/>
+                    </a:xfrm>
+                    <a:prstGeom prst="rect">
+                      <a:avLst/>
+                    </a:prstGeom>
+                  </pic:spPr>
+                </pic:pic>
+              </a:graphicData>
+            </a:graphic>
+          </wp:inline>
+        </w:drawing>
+      </w:r>
+    </w:p>
+    <w:p>
+      <w:pPr>
+        <w:spacing w:before="100" w:after="240"/>
+        <w:jc w:val="center"/>
+      </w:pPr>
+      <w:r>
+        <w:rPr>
+          <w:b/>
+          <w:bCs/>
+          <w:sz w:val="20"/>
+          <w:szCs w:val="20"/>
+        </w:rPr>
+        <w:t xml:space="preserve">Fig. A.2 </w:t>
+      </w:r>
+      <w:r>
+        <w:rPr>
+          <w:sz w:val="20"/>
+          <w:szCs w:val="20"/>
+        </w:rPr>
+        <w:t xml:space="preserve">Demo site, Live run, stage 7: blast-radius picture of the change (changed files at the centre, rings by hop distance, failing test files in red, co-change picks in orange, history picks in blue)</w:t>
+      </w:r>
+    </w:p>
+    <w:p>
+      <w:pPr>
+        <w:keepNext/>
+        <w:spacing w:before="160" w:after="60"/>
+        <w:jc w:val="center"/>
+      </w:pPr>
+      <w:r>
+        <w:rPr>
+          <w:noProof/>
+        </w:rPr>
+        <w:drawing>
+          <wp:inline distT="0" distB="0" distL="0" distR="0">
+            <wp:extent cx="5120640" cy="3817204"/>
+            <wp:effectExtent l="0" t="0" r="0" b="0"/>
+            <wp:docPr id="9993" name="figA8_live_stage8" descr="figA8_live_stage8"/>
+            <wp:cNvGraphicFramePr>
+              <a:graphicFrameLocks xmlns:a="http://schemas.openxmlformats.org/drawingml/2006/main" noChangeAspect="1"/>
+            </wp:cNvGraphicFramePr>
+            <a:graphic xmlns:a="http://schemas.openxmlformats.org/drawingml/2006/main">
+              <a:graphicData uri="http://schemas.openxmlformats.org/drawingml/2006/picture">
+                <pic:pic xmlns:pic="http://schemas.openxmlformats.org/drawingml/2006/picture">
+                  <pic:nvPicPr>
+                    <pic:cNvPr id="0" name=""/>
+                    <pic:cNvPicPr>
+                      <a:picLocks noChangeAspect="1"/>
+                    </pic:cNvPicPr>
+                  </pic:nvPicPr>
+                  <pic:blipFill>
+                    <a:blip r:embed="rIdBRfigA8_live_stage8"/>
+                    <a:stretch>
+                      <a:fillRect/>
+                    </a:stretch>
+                  </pic:blipFill>
+                  <pic:spPr>
+                    <a:xfrm>
+                      <a:off x="0" y="0"/>
+                      <a:ext cx="5120640" cy="3817204"/>
+                    </a:xfrm>
+                    <a:prstGeom prst="rect">
+                      <a:avLst/>
+                    </a:prstGeom>
+                  </pic:spPr>
+                </pic:pic>
+              </a:graphicData>
+            </a:graphic>
+          </wp:inline>
+        </w:drawing>
+      </w:r>
+    </w:p>
+    <w:p>
+      <w:pPr>
+        <w:spacing w:before="100" w:after="240"/>
+        <w:jc w:val="center"/>
+      </w:pPr>
+      <w:r>
+        <w:rPr>
+          <w:b/>
+          <w:bCs/>
+          <w:sz w:val="20"/>
+          <w:szCs w:val="20"/>
+        </w:rPr>
+        <w:t xml:space="preserve">Fig. A.3 </w:t>
+      </w:r>
+      <w:r>
+        <w:rPr>
+          <w:sz w:val="20"/>
+          <w:szCs w:val="20"/>
+        </w:rPr>
+        <w:t xml:space="preserve">Demo site, Live run, stage 8: overlap of the failing test files with the co-change and historical-frequency picks, and the two prediction lists</w:t>
       </w:r>
     </w:p>
     <w:sectPr>

</xml_diff>

<commit_message>
paper: report records published Zenodo dataset and code DOIs
</commit_message>
<xml_diff>
--- a/BlastRadius_Project1_Report.docx
+++ b/BlastRadius_Project1_Report.docx
@@ -37456,7 +37456,7 @@
         <w:jc w:val="both"/>
       </w:pPr>
       <w:r>
-        <w:t xml:space="preserve">The build now refuses to run without the pseudonymisation key. This guard was added after an earlier build had shipped live logins in the local bundle; that build was never published. The Zenodo deposit has a reserved DOI, 10.5281/zenodo.23250262, and the release bundle is licensed CC BY 4.0 (the source code is MIT); the deposit is to be published after the final checks, and the upload to HuggingFace is </w:t>
+        <w:t xml:space="preserve">The build now refuses to run without the pseudonymisation key. This guard was added after an earlier build had shipped live logins in the local bundle; that build was never published. The release bundle was published on Zenodo on 9 October 2026 under DOI 10.5281/zenodo.23250262 and is licensed CC BY 4.0; the source code is MIT and is archived on Zenodo as release v1.0.0 under DOI 10.5281/zenodo.23250690. The upload to HuggingFace is </w:t>
       </w:r>
       <w:r>
         <w:rPr>
@@ -37465,7 +37465,7 @@
         <w:t xml:space="preserve">pending</w:t>
       </w:r>
       <w:r>
-        <w:t xml:space="preserve">. Publishing is one-way, because a DOI cannot be withdrawn and the files cannot change afterwards.</w:t>
+        <w:t xml:space="preserve">. Publishing is one-way, because a DOI cannot be withdrawn and the files in the record cannot change; corrections ship as a new version.</w:t>
       </w:r>
     </w:p>
     <w:p>
@@ -39915,10 +39915,10 @@
         <w:rPr>
           <w:b/>
         </w:rPr>
-        <w:t xml:space="preserve">Publish the dataset</w:t>
-      </w:r>
-      <w:r>
-        <w:t xml:space="preserve">: publish the Zenodo deposit (reserved DOI 10.5281/zenodo.23250262, CC BY 4.0) and add a HuggingFace card, with the datasheet; ship the base run, per-test statuses and test-file binding as columns in a later version.</w:t>
+        <w:t xml:space="preserve">Extend the published dataset</w:t>
+      </w:r>
+      <w:r>
+        <w:t xml:space="preserve">: add a HuggingFace card with the datasheet (the Zenodo record 10.5281/zenodo.23250262 is already published under CC BY 4.0); ship the base run, per-test statuses and test-file binding as columns in a later version.</w:t>
       </w:r>
     </w:p>
     <w:p>

</xml_diff>

<commit_message>
docs: report section 6.9 on the agent workflow; contents page numbers refreshed
</commit_message>
<xml_diff>
--- a/BlastRadius_Project1_Report.docx
+++ b/BlastRadius_Project1_Report.docx
@@ -323,21 +323,7 @@
           <w:b/>
           <w:bCs/>
         </w:rPr>
-        <w:t xml:space="preserve">Dr. Yoga Raja C A, </w:t>
-      </w:r>
-      <w:r>
-        <w:rPr>
-          <w:b/>
-          <w:bCs/>
-        </w:rPr>
-        <w:t>Assistant Professor Sr. Grade 1</w:t>
-      </w:r>
-      <w:r>
-        <w:rPr>
-          <w:b/>
-          <w:bCs/>
-        </w:rPr>
-        <w:t>, SCORE, VIT, Vellore.</w:t>
+        <w:t xml:space="preserve">Dr. Yoga Raja C A, Assistant Professor Sr. Grade 1, SCORE, VIT, Vellore.</w:t>
       </w:r>
     </w:p>
     <w:p>
@@ -599,14 +585,7 @@
           <w:b/>
           <w:bCs/>
         </w:rPr>
-        <w:t xml:space="preserve">Dr. Yoga Raja C A, </w:t>
-      </w:r>
-      <w:r>
-        <w:rPr>
-          <w:b/>
-          <w:bCs/>
-        </w:rPr>
-        <w:t>Assistant Professor Sr. Grade 1</w:t>
+        <w:t xml:space="preserve">Dr. Yoga Raja C A, Assistant Professor Sr. Grade 1</w:t>
       </w:r>
       <w:r>
         <w:t xml:space="preserve">, School of Computer Science Engineering and Information Systems, Vellore Institute of Technology, Vellore for the constant guidance and continual encouragement in our endeavour. Our association with our guide is not confined to academics only, but it is a great opportunity on our part to work with an intellectual and an expert in the field of </w:t>
@@ -882,7 +861,7 @@
         </w:rPr>
         <w:t>Acknowledgement</w:t>
         <w:tab/>
-        <w:t>v</w:t>
+        <w:t>iv</w:t>
       </w:r>
     </w:p>
     <w:p>
@@ -899,7 +878,7 @@
         </w:rPr>
         <w:t>Executive Summary</w:t>
         <w:tab/>
-        <w:t>vi</w:t>
+        <w:t>v</w:t>
       </w:r>
     </w:p>
     <w:p>
@@ -916,7 +895,7 @@
         </w:rPr>
         <w:t>Table of Contents</w:t>
         <w:tab/>
-        <w:t>vii</w:t>
+        <w:t>vi</w:t>
       </w:r>
     </w:p>
     <w:p>
@@ -1074,7 +1053,7 @@
         </w:rPr>
         <w:t>2    LITERATURE SURVEY, PROJECT DESCRIPTION AND GOALS</w:t>
         <w:tab/>
-        <w:t>8</w:t>
+        <w:t>9</w:t>
       </w:r>
     </w:p>
     <w:p>
@@ -1088,7 +1067,7 @@
       <w:r>
         <w:t>2.1 Literature Survey</w:t>
         <w:tab/>
-        <w:t>8</w:t>
+        <w:t>9</w:t>
       </w:r>
     </w:p>
     <w:p>
@@ -1102,7 +1081,7 @@
       <w:r>
         <w:t>2.2 Closest Related Work Beyond the Approved List</w:t>
         <w:tab/>
-        <w:t>11</w:t>
+        <w:t>13</w:t>
       </w:r>
     </w:p>
     <w:p>
@@ -1116,7 +1095,7 @@
       <w:r>
         <w:t>2.3 Research Gap (Problem Definition)</w:t>
         <w:tab/>
-        <w:t>14</w:t>
+        <w:t>15</w:t>
       </w:r>
     </w:p>
     <w:p>
@@ -1130,7 +1109,7 @@
       <w:r>
         <w:t>2.4 Project Description</w:t>
         <w:tab/>
-        <w:t>14</w:t>
+        <w:t>16</w:t>
       </w:r>
     </w:p>
     <w:p>
@@ -1144,7 +1123,7 @@
       <w:r>
         <w:t>2.5 Research Questions</w:t>
         <w:tab/>
-        <w:t>15</w:t>
+        <w:t>16</w:t>
       </w:r>
     </w:p>
     <w:p>
@@ -1158,7 +1137,7 @@
       <w:r>
         <w:t>2.6 Goals and Their Status</w:t>
         <w:tab/>
-        <w:t>16</w:t>
+        <w:t>17</w:t>
       </w:r>
     </w:p>
     <w:p>
@@ -1175,7 +1154,7 @@
         </w:rPr>
         <w:t>3    TECHNICAL SPECIFICATION</w:t>
         <w:tab/>
-        <w:t>17</w:t>
+        <w:t>19</w:t>
       </w:r>
     </w:p>
     <w:p>
@@ -1189,7 +1168,7 @@
       <w:r>
         <w:t>3.1 Software Stack</w:t>
         <w:tab/>
-        <w:t>17</w:t>
+        <w:t>19</w:t>
       </w:r>
     </w:p>
     <w:p>
@@ -1203,7 +1182,7 @@
       <w:r>
         <w:t>3.2 Hardware and Resource Constraints</w:t>
         <w:tab/>
-        <w:t>19</w:t>
+        <w:t>21</w:t>
       </w:r>
     </w:p>
     <w:p>
@@ -1217,7 +1196,7 @@
       <w:r>
         <w:t>3.3 External Interface: The GitHub REST API</w:t>
         <w:tab/>
-        <w:t>20</w:t>
+        <w:t>22</w:t>
       </w:r>
     </w:p>
     <w:p>
@@ -1231,7 +1210,7 @@
       <w:r>
         <w:t>3.4 Scope Constraints</w:t>
         <w:tab/>
-        <w:t>20</w:t>
+        <w:t>23</w:t>
       </w:r>
     </w:p>
     <w:p>
@@ -1245,7 +1224,7 @@
       <w:r>
         <w:t>3.5 Data Artifacts</w:t>
         <w:tab/>
-        <w:t>21</w:t>
+        <w:t>24</w:t>
       </w:r>
     </w:p>
     <w:p>
@@ -1259,7 +1238,7 @@
       <w:r>
         <w:t>3.6 Requirements</w:t>
         <w:tab/>
-        <w:t>22</w:t>
+        <w:t>25</w:t>
       </w:r>
     </w:p>
     <w:p>
@@ -1276,7 +1255,7 @@
         </w:rPr>
         <w:t>4    DESIGN APPROACH AND DETAILS</w:t>
         <w:tab/>
-        <w:t>24</w:t>
+        <w:t>27</w:t>
       </w:r>
     </w:p>
     <w:p>
@@ -1290,7 +1269,7 @@
       <w:r>
         <w:t>4.1 Design Approach / Materials and Methods</w:t>
         <w:tab/>
-        <w:t>24</w:t>
+        <w:t>27</w:t>
       </w:r>
     </w:p>
     <w:p>
@@ -1304,7 +1283,7 @@
       <w:r>
         <w:t>4.2 Codes and Standards</w:t>
         <w:tab/>
-        <w:t>39</w:t>
+        <w:t>43</w:t>
       </w:r>
     </w:p>
     <w:p>
@@ -1318,7 +1297,7 @@
       <w:r>
         <w:t>4.3 Constraints, Alternatives and Trade-offs</w:t>
         <w:tab/>
-        <w:t>39</w:t>
+        <w:t>44</w:t>
       </w:r>
     </w:p>
     <w:p>
@@ -1336,7 +1315,7 @@
         <w:lastRenderedPageBreak/>
         <w:t>5    SCHEDULE, TASKS AND MILESTONES</w:t>
         <w:tab/>
-        <w:t>41</w:t>
+        <w:t>46</w:t>
       </w:r>
     </w:p>
     <w:p>
@@ -1350,7 +1329,7 @@
       <w:r>
         <w:t>5.1 Timeline</w:t>
         <w:tab/>
-        <w:t>41</w:t>
+        <w:t>46</w:t>
       </w:r>
     </w:p>
     <w:p>
@@ -1364,7 +1343,7 @@
       <w:r>
         <w:t>5.2 Phases of Work</w:t>
         <w:tab/>
-        <w:t>42</w:t>
+        <w:t>47</w:t>
       </w:r>
     </w:p>
     <w:p>
@@ -1378,7 +1357,7 @@
       <w:r>
         <w:t>5.3 Go/No-Go Gates</w:t>
         <w:tab/>
-        <w:t>43</w:t>
+        <w:t>48</w:t>
       </w:r>
     </w:p>
     <w:p>
@@ -1392,7 +1371,7 @@
       <w:r>
         <w:t>5.4 Team Responsibilities</w:t>
         <w:tab/>
-        <w:t>43</w:t>
+        <w:t>48</w:t>
       </w:r>
     </w:p>
     <w:p>
@@ -1406,7 +1385,7 @@
       <w:r>
         <w:t>5.5 Recorded Decisions During the Semester</w:t>
         <w:tab/>
-        <w:t>44</w:t>
+        <w:t>49</w:t>
       </w:r>
     </w:p>
     <w:p>
@@ -1420,7 +1399,7 @@
       <w:r>
         <w:t>5.6 Risks and Their Treatment</w:t>
         <w:tab/>
-        <w:t>44</w:t>
+        <w:t>50</w:t>
       </w:r>
     </w:p>
     <w:p>
@@ -1437,7 +1416,7 @@
         </w:rPr>
         <w:t>6    PROJECT DEMONSTRATION</w:t>
         <w:tab/>
-        <w:t>46</w:t>
+        <w:t>51</w:t>
       </w:r>
     </w:p>
     <w:p>
@@ -1451,7 +1430,7 @@
       <w:r>
         <w:t>6.1 One-Command Reproduction</w:t>
         <w:tab/>
-        <w:t>46</w:t>
+        <w:t>51</w:t>
       </w:r>
     </w:p>
     <w:p>
@@ -1465,7 +1444,7 @@
       <w:r>
         <w:t>6.2 Regenerating Tables and the Freshness Guard</w:t>
         <w:tab/>
-        <w:t>47</w:t>
+        <w:t>52</w:t>
       </w:r>
     </w:p>
     <w:p>
@@ -1479,7 +1458,7 @@
       <w:r>
         <w:t>6.3 Corpus Dashboard</w:t>
         <w:tab/>
-        <w:t>47</w:t>
+        <w:t>53</w:t>
       </w:r>
     </w:p>
     <w:p>
@@ -1493,7 +1472,7 @@
       <w:r>
         <w:t>6.4 Graph Layer</w:t>
         <w:tab/>
-        <w:t>48</w:t>
+        <w:t>55</w:t>
       </w:r>
     </w:p>
     <w:p>
@@ -1507,7 +1486,7 @@
       <w:r>
         <w:t>6.5 Release Bundle</w:t>
         <w:tab/>
-        <w:t>49</w:t>
+        <w:t>56</w:t>
       </w:r>
     </w:p>
     <w:p>
@@ -1521,7 +1500,7 @@
       <w:r>
         <w:t>6.6 Worked Example: From Log Line to Label</w:t>
         <w:tab/>
-        <w:t>49</w:t>
+        <w:t>57</w:t>
       </w:r>
     </w:p>
     <w:p>
@@ -1535,7 +1514,7 @@
       <w:r>
         <w:t>6.7 Test Suite</w:t>
         <w:tab/>
-        <w:t>50</w:t>
+        <w:t>58</w:t>
       </w:r>
     </w:p>
     <w:p>
@@ -1549,24 +1528,7 @@
       <w:r>
         <w:t>6.8 Demonstration Logistics</w:t>
         <w:tab/>
-        <w:t>50</w:t>
-      </w:r>
-    </w:p>
-    <w:p>
-      <w:pPr>
-        <w:tabs>
-          <w:tab w:val="right" w:leader="dot" w:pos="8306"/>
-        </w:tabs>
-        <w:spacing w:before="160" w:after="60" w:line="300" w:lineRule="auto"/>
-      </w:pPr>
-      <w:r>
-        <w:rPr>
-          <w:b/>
-          <w:bCs/>
-        </w:rPr>
-        <w:t>7    RESULT AND DISCUSSION</w:t>
-        <w:tab/>
-        <w:t>51</w:t>
+        <w:t>58</w:t>
       </w:r>
     </w:p>
     <w:p>
@@ -1578,9 +1540,26 @@
         <w:ind w:left="560"/>
       </w:pPr>
       <w:r>
-        <w:t>7.1 Dataset Figures</w:t>
+        <w:t>6.9 Agentic Workflow: From User Story to Deployment</w:t>
         <w:tab/>
-        <w:t>51</w:t>
+        <w:t>59</w:t>
+      </w:r>
+    </w:p>
+    <w:p>
+      <w:pPr>
+        <w:tabs>
+          <w:tab w:val="right" w:leader="dot" w:pos="8306"/>
+        </w:tabs>
+        <w:spacing w:before="160" w:after="60" w:line="300" w:lineRule="auto"/>
+      </w:pPr>
+      <w:r>
+        <w:rPr>
+          <w:b/>
+          <w:bCs/>
+        </w:rPr>
+        <w:t>7    RESULT AND DISCUSSION</w:t>
+        <w:tab/>
+        <w:t>62</w:t>
       </w:r>
     </w:p>
     <w:p>
@@ -1592,9 +1571,9 @@
         <w:ind w:left="560"/>
       </w:pPr>
       <w:r>
-        <w:t>7.2 Parser Defect and Fix</w:t>
+        <w:t>7.1 Dataset Figures</w:t>
         <w:tab/>
-        <w:t>53</w:t>
+        <w:t>62</w:t>
       </w:r>
     </w:p>
     <w:p>
@@ -1606,9 +1585,9 @@
         <w:ind w:left="560"/>
       </w:pPr>
       <w:r>
-        <w:t>7.3 Test-Identifier Binding</w:t>
+        <w:t>7.2 Parser Defect and Fix</w:t>
         <w:tab/>
-        <w:t>54</w:t>
+        <w:t>64</w:t>
       </w:r>
     </w:p>
     <w:p>
@@ -1620,9 +1599,9 @@
         <w:ind w:left="560"/>
       </w:pPr>
       <w:r>
-        <w:t>7.4 Graph Layer Results</w:t>
+        <w:t>7.3 Test-Identifier Binding</w:t>
         <w:tab/>
-        <w:t>55</w:t>
+        <w:t>65</w:t>
       </w:r>
     </w:p>
     <w:p>
@@ -1634,9 +1613,9 @@
         <w:ind w:left="560"/>
       </w:pPr>
       <w:r>
-        <w:t>7.5 Reproducibility and Release</w:t>
+        <w:t>7.4 Graph Layer Results</w:t>
         <w:tab/>
-        <w:t>58</w:t>
+        <w:t>67</w:t>
       </w:r>
     </w:p>
     <w:p>
@@ -1648,9 +1627,9 @@
         <w:ind w:left="560"/>
       </w:pPr>
       <w:r>
-        <w:t>7.6 Parser Precision</w:t>
+        <w:t>7.5 Reproducibility and Release</w:t>
         <w:tab/>
-        <w:t>59</w:t>
+        <w:t>70</w:t>
       </w:r>
     </w:p>
     <w:p>
@@ -1662,9 +1641,9 @@
         <w:ind w:left="560"/>
       </w:pPr>
       <w:r>
-        <w:t>7.7 RQ1: Divergence Measurement</w:t>
+        <w:t>7.6 Parser Precision</w:t>
         <w:tab/>
-        <w:t>60</w:t>
+        <w:t>72</w:t>
       </w:r>
     </w:p>
     <w:p>
@@ -1676,9 +1655,9 @@
         <w:ind w:left="560"/>
       </w:pPr>
       <w:r>
-        <w:t>7.8 Engineering Quality</w:t>
+        <w:t>7.7 RQ1: Divergence Measurement</w:t>
         <w:tab/>
-        <w:t>60</w:t>
+        <w:t>73</w:t>
       </w:r>
     </w:p>
     <w:p>
@@ -1690,9 +1669,9 @@
         <w:ind w:left="560"/>
       </w:pPr>
       <w:r>
-        <w:t>7.9 Gate Summary</w:t>
+        <w:t>7.8 Engineering Quality</w:t>
         <w:tab/>
-        <w:t>61</w:t>
+        <w:t>74</w:t>
       </w:r>
     </w:p>
     <w:p>
@@ -1704,9 +1683,9 @@
         <w:ind w:left="560"/>
       </w:pPr>
       <w:r>
-        <w:t>7.10 Threats to Validity</w:t>
+        <w:t>7.9 Gate Summary</w:t>
         <w:tab/>
-        <w:t>62</w:t>
+        <w:t>75</w:t>
       </w:r>
     </w:p>
     <w:p>
@@ -1718,26 +1697,9 @@
         <w:ind w:left="560"/>
       </w:pPr>
       <w:r>
-        <w:t>7.11 Lessons Learned</w:t>
+        <w:t>7.10 Threats to Validity</w:t>
         <w:tab/>
-        <w:t>63</w:t>
-      </w:r>
-    </w:p>
-    <w:p>
-      <w:pPr>
-        <w:tabs>
-          <w:tab w:val="right" w:leader="dot" w:pos="8306"/>
-        </w:tabs>
-        <w:spacing w:before="160" w:after="60" w:line="300" w:lineRule="auto"/>
-      </w:pPr>
-      <w:r>
-        <w:rPr>
-          <w:b/>
-          <w:bCs/>
-        </w:rPr>
-        <w:t>8    SUMMARY</w:t>
-        <w:tab/>
-        <w:t>64</w:t>
+        <w:t>76</w:t>
       </w:r>
     </w:p>
     <w:p>
@@ -1749,9 +1711,26 @@
         <w:ind w:left="560"/>
       </w:pPr>
       <w:r>
-        <w:t>8.1 Key Results</w:t>
+        <w:t>7.11 Lessons Learned</w:t>
         <w:tab/>
-        <w:t>64</w:t>
+        <w:t>77</w:t>
+      </w:r>
+    </w:p>
+    <w:p>
+      <w:pPr>
+        <w:tabs>
+          <w:tab w:val="right" w:leader="dot" w:pos="8306"/>
+        </w:tabs>
+        <w:spacing w:before="160" w:after="60" w:line="300" w:lineRule="auto"/>
+      </w:pPr>
+      <w:r>
+        <w:rPr>
+          <w:b/>
+          <w:bCs/>
+        </w:rPr>
+        <w:t>8    SUMMARY</w:t>
+        <w:tab/>
+        <w:t>78</w:t>
       </w:r>
     </w:p>
     <w:p>
@@ -1763,9 +1742,9 @@
         <w:ind w:left="560"/>
       </w:pPr>
       <w:r>
-        <w:t>8.2 Honest Negatives</w:t>
+        <w:t>8.1 Key Results</w:t>
         <w:tab/>
-        <w:t>64</w:t>
+        <w:t>78</w:t>
       </w:r>
     </w:p>
     <w:p>
@@ -1777,9 +1756,9 @@
         <w:ind w:left="560"/>
       </w:pPr>
       <w:r>
-        <w:t>8.3 Lessons</w:t>
+        <w:t>8.2 Honest Negatives</w:t>
         <w:tab/>
-        <w:t>65</w:t>
+        <w:t>79</w:t>
       </w:r>
     </w:p>
     <w:p>
@@ -1791,9 +1770,23 @@
         <w:ind w:left="560"/>
       </w:pPr>
       <w:r>
+        <w:t>8.3 Lessons</w:t>
+        <w:tab/>
+        <w:t>79</w:t>
+      </w:r>
+    </w:p>
+    <w:p>
+      <w:pPr>
+        <w:tabs>
+          <w:tab w:val="right" w:leader="dot" w:pos="8306"/>
+        </w:tabs>
+        <w:spacing w:after="60" w:line="300" w:lineRule="auto"/>
+        <w:ind w:left="560"/>
+      </w:pPr>
+      <w:r>
         <w:t>8.4 Recommendations and Future Work</w:t>
         <w:tab/>
-        <w:t>65</w:t>
+        <w:t>79</w:t>
       </w:r>
     </w:p>
     <w:p>
@@ -1811,7 +1804,7 @@
         <w:lastRenderedPageBreak/>
         <w:t>9    REFERENCES</w:t>
         <w:tab/>
-        <w:t>67</w:t>
+        <w:t>81</w:t>
       </w:r>
     </w:p>
     <w:p>
@@ -2175,7 +2168,7 @@
                 <w:sz w:val="22"/>
                 <w:szCs w:val="22"/>
               </w:rPr>
-              <w:t>5</w:t>
+              <w:t>6</w:t>
             </w:r>
           </w:p>
         </w:tc>
@@ -2275,7 +2268,7 @@
                 <w:sz w:val="22"/>
                 <w:szCs w:val="22"/>
               </w:rPr>
-              <w:t>12</w:t>
+              <w:t>13</w:t>
             </w:r>
           </w:p>
         </w:tc>
@@ -2475,7 +2468,7 @@
                 <w:sz w:val="22"/>
                 <w:szCs w:val="22"/>
               </w:rPr>
-              <w:t>22</w:t>
+              <w:t>24</w:t>
             </w:r>
           </w:p>
         </w:tc>
@@ -2675,7 +2668,7 @@
                 <w:sz w:val="22"/>
                 <w:szCs w:val="22"/>
               </w:rPr>
-              <w:t>27</w:t>
+              <w:t>30</w:t>
             </w:r>
           </w:p>
         </w:tc>
@@ -2775,7 +2768,7 @@
                 <w:sz w:val="22"/>
                 <w:szCs w:val="22"/>
               </w:rPr>
-              <w:t>28</w:t>
+              <w:t>31</w:t>
             </w:r>
           </w:p>
         </w:tc>
@@ -2875,7 +2868,7 @@
                 <w:sz w:val="22"/>
                 <w:szCs w:val="22"/>
               </w:rPr>
-              <w:t>28</w:t>
+              <w:t>32</w:t>
             </w:r>
           </w:p>
         </w:tc>
@@ -2975,7 +2968,7 @@
                 <w:sz w:val="22"/>
                 <w:szCs w:val="22"/>
               </w:rPr>
-              <w:t>29</w:t>
+              <w:t>33</w:t>
             </w:r>
           </w:p>
         </w:tc>
@@ -3075,7 +3068,7 @@
                 <w:sz w:val="22"/>
                 <w:szCs w:val="22"/>
               </w:rPr>
-              <w:t>30</w:t>
+              <w:t>34</w:t>
             </w:r>
           </w:p>
         </w:tc>
@@ -3175,7 +3168,7 @@
                 <w:sz w:val="22"/>
                 <w:szCs w:val="22"/>
               </w:rPr>
-              <w:t>31</w:t>
+              <w:t>35</w:t>
             </w:r>
           </w:p>
         </w:tc>
@@ -3275,7 +3268,7 @@
                 <w:sz w:val="22"/>
                 <w:szCs w:val="22"/>
               </w:rPr>
-              <w:t>34</w:t>
+              <w:t>38</w:t>
             </w:r>
           </w:p>
         </w:tc>
@@ -3375,7 +3368,7 @@
                 <w:sz w:val="22"/>
                 <w:szCs w:val="22"/>
               </w:rPr>
-              <w:t>36</w:t>
+              <w:t>40</w:t>
             </w:r>
           </w:p>
         </w:tc>
@@ -3475,7 +3468,7 @@
                 <w:sz w:val="22"/>
                 <w:szCs w:val="22"/>
               </w:rPr>
-              <w:t>37</w:t>
+              <w:t>41</w:t>
             </w:r>
           </w:p>
         </w:tc>
@@ -3575,7 +3568,7 @@
                 <w:sz w:val="22"/>
                 <w:szCs w:val="22"/>
               </w:rPr>
-              <w:t>37</w:t>
+              <w:t>42</w:t>
             </w:r>
           </w:p>
         </w:tc>
@@ -3675,7 +3668,7 @@
                 <w:sz w:val="22"/>
                 <w:szCs w:val="22"/>
               </w:rPr>
-              <w:t>42</w:t>
+              <w:t>47</w:t>
             </w:r>
           </w:p>
         </w:tc>
@@ -3775,7 +3768,7 @@
                 <w:sz w:val="22"/>
                 <w:szCs w:val="22"/>
               </w:rPr>
-              <w:t>46</w:t>
+              <w:t>51</w:t>
             </w:r>
           </w:p>
         </w:tc>
@@ -3875,7 +3868,7 @@
                 <w:sz w:val="22"/>
                 <w:szCs w:val="22"/>
               </w:rPr>
-              <w:t>47</w:t>
+              <w:t>52</w:t>
             </w:r>
           </w:p>
         </w:tc>
@@ -3975,7 +3968,7 @@
                 <w:sz w:val="22"/>
                 <w:szCs w:val="22"/>
               </w:rPr>
-              <w:t>47</w:t>
+              <w:t>53</w:t>
             </w:r>
           </w:p>
         </w:tc>
@@ -4175,7 +4168,7 @@
                 <w:sz w:val="22"/>
                 <w:szCs w:val="22"/>
               </w:rPr>
-              <w:t>48</w:t>
+              <w:t>56</w:t>
             </w:r>
           </w:p>
         </w:tc>
@@ -4275,7 +4268,7 @@
                 <w:sz w:val="22"/>
                 <w:szCs w:val="22"/>
               </w:rPr>
-              <w:t>48</w:t>
+              <w:t>56</w:t>
             </w:r>
           </w:p>
         </w:tc>
@@ -4375,7 +4368,7 @@
                 <w:sz w:val="22"/>
                 <w:szCs w:val="22"/>
               </w:rPr>
-              <w:t>49</w:t>
+              <w:t>57</w:t>
             </w:r>
           </w:p>
         </w:tc>
@@ -4475,7 +4468,7 @@
                 <w:sz w:val="22"/>
                 <w:szCs w:val="22"/>
               </w:rPr>
-              <w:t>50</w:t>
+              <w:t>58</w:t>
             </w:r>
           </w:p>
         </w:tc>
@@ -4516,7 +4509,7 @@
                 <w:sz w:val="22"/>
                 <w:szCs w:val="22"/>
               </w:rPr>
-              <w:t>7.1</w:t>
+              <w:t>6.9</w:t>
             </w:r>
           </w:p>
         </w:tc>
@@ -4545,7 +4538,7 @@
                 <w:sz w:val="22"/>
                 <w:szCs w:val="22"/>
               </w:rPr>
-              <w:t>Positives Before and After the Canonical Rebuild</w:t>
+              <w:t>Agents Tab of the Demo Site: Five Agents and Three Scenarios</w:t>
             </w:r>
           </w:p>
         </w:tc>
@@ -4575,7 +4568,7 @@
                 <w:sz w:val="22"/>
                 <w:szCs w:val="22"/>
               </w:rPr>
-              <w:t>51</w:t>
+              <w:t>60</w:t>
             </w:r>
           </w:p>
         </w:tc>
@@ -4616,7 +4609,7 @@
                 <w:sz w:val="22"/>
                 <w:szCs w:val="22"/>
               </w:rPr>
-              <w:t>7.2</w:t>
+              <w:t>6.10</w:t>
             </w:r>
           </w:p>
         </w:tc>
@@ -4645,7 +4638,7 @@
                 <w:sz w:val="22"/>
                 <w:szCs w:val="22"/>
               </w:rPr>
-              <w:t>Gate 1: Positives Against the 5,000 Threshold</w:t>
+              <w:t>Build Failure, Notification and Regression Report in the Third Scenario</w:t>
             </w:r>
           </w:p>
         </w:tc>
@@ -4675,7 +4668,7 @@
                 <w:sz w:val="22"/>
                 <w:szCs w:val="22"/>
               </w:rPr>
-              <w:t>52</w:t>
+              <w:t>61</w:t>
             </w:r>
           </w:p>
         </w:tc>
@@ -4716,7 +4709,7 @@
                 <w:sz w:val="22"/>
                 <w:szCs w:val="22"/>
               </w:rPr>
-              <w:t>7.3</w:t>
+              <w:t>7.1</w:t>
             </w:r>
           </w:p>
         </w:tc>
@@ -4745,7 +4738,7 @@
                 <w:sz w:val="22"/>
                 <w:szCs w:val="22"/>
               </w:rPr>
-              <w:t>Affected Test IDs by Repository</w:t>
+              <w:t>Positives Before and After the Canonical Rebuild</w:t>
             </w:r>
           </w:p>
         </w:tc>
@@ -4775,7 +4768,7 @@
                 <w:sz w:val="22"/>
                 <w:szCs w:val="22"/>
               </w:rPr>
-              <w:t>53</w:t>
+              <w:t>62</w:t>
             </w:r>
           </w:p>
         </w:tc>
@@ -4816,7 +4809,7 @@
                 <w:sz w:val="22"/>
                 <w:szCs w:val="22"/>
               </w:rPr>
-              <w:t>7.4</w:t>
+              <w:t>7.2</w:t>
             </w:r>
           </w:p>
         </w:tc>
@@ -4845,7 +4838,7 @@
                 <w:sz w:val="22"/>
                 <w:szCs w:val="22"/>
               </w:rPr>
-              <w:t>Binding Rates Against the Gate 1.5 Threshold</w:t>
+              <w:t>Gate 1: Positives Against the 5,000 Threshold</w:t>
             </w:r>
           </w:p>
         </w:tc>
@@ -4875,7 +4868,7 @@
                 <w:sz w:val="22"/>
                 <w:szCs w:val="22"/>
               </w:rPr>
-              <w:t>54</w:t>
+              <w:t>63</w:t>
             </w:r>
           </w:p>
         </w:tc>
@@ -4916,7 +4909,7 @@
                 <w:sz w:val="22"/>
                 <w:szCs w:val="22"/>
               </w:rPr>
-              <w:t>7.5</w:t>
+              <w:t>7.3</w:t>
             </w:r>
           </w:p>
         </w:tc>
@@ -4945,7 +4938,7 @@
                 <w:sz w:val="22"/>
                 <w:szCs w:val="22"/>
               </w:rPr>
-              <w:t>Commit-Pinned Graphs Built per Repository</w:t>
+              <w:t>Affected Test IDs by Repository</w:t>
             </w:r>
           </w:p>
         </w:tc>
@@ -4975,7 +4968,7 @@
                 <w:sz w:val="22"/>
                 <w:szCs w:val="22"/>
               </w:rPr>
-              <w:t>55</w:t>
+              <w:t>65</w:t>
             </w:r>
           </w:p>
         </w:tc>
@@ -5016,7 +5009,7 @@
                 <w:sz w:val="22"/>
                 <w:szCs w:val="22"/>
               </w:rPr>
-              <w:t>7.6</w:t>
+              <w:t>7.4</w:t>
             </w:r>
           </w:p>
         </w:tc>
@@ -5045,7 +5038,7 @@
                 <w:sz w:val="22"/>
                 <w:szCs w:val="22"/>
               </w:rPr>
-              <w:t>Incremental-Versus-Cold Divergence and Its Fix</w:t>
+              <w:t>Binding Rates Against the Gate 1.5 Threshold</w:t>
             </w:r>
           </w:p>
         </w:tc>
@@ -5075,7 +5068,7 @@
                 <w:sz w:val="22"/>
                 <w:szCs w:val="22"/>
               </w:rPr>
-              <w:t>56</w:t>
+              <w:t>66</w:t>
             </w:r>
           </w:p>
         </w:tc>
@@ -5116,7 +5109,7 @@
                 <w:sz w:val="22"/>
                 <w:szCs w:val="22"/>
               </w:rPr>
-              <w:t>7.7</w:t>
+              <w:t>7.5</w:t>
             </w:r>
           </w:p>
         </w:tc>
@@ -5145,7 +5138,7 @@
                 <w:sz w:val="22"/>
                 <w:szCs w:val="22"/>
               </w:rPr>
-              <w:t>Graph-Node Binding by Repository</w:t>
+              <w:t>Commit-Pinned Graphs Built per Repository</w:t>
             </w:r>
           </w:p>
         </w:tc>
@@ -5175,7 +5168,7 @@
                 <w:sz w:val="22"/>
                 <w:szCs w:val="22"/>
               </w:rPr>
-              <w:t>57</w:t>
+              <w:t>67</w:t>
             </w:r>
           </w:p>
         </w:tc>
@@ -5216,8 +5209,7 @@
                 <w:sz w:val="22"/>
                 <w:szCs w:val="22"/>
               </w:rPr>
-              <w:lastRenderedPageBreak/>
-              <w:t>7.8</w:t>
+              <w:t>7.6</w:t>
             </w:r>
           </w:p>
         </w:tc>
@@ -5246,7 +5238,7 @@
                 <w:sz w:val="22"/>
                 <w:szCs w:val="22"/>
               </w:rPr>
-              <w:t xml:space="preserve">Graph Query Latency per Repository Against the 100 ms Budget</w:t>
+              <w:t>Incremental-Versus-Cold Divergence and Its Fix</w:t>
             </w:r>
           </w:p>
         </w:tc>
@@ -5276,7 +5268,7 @@
                 <w:sz w:val="22"/>
                 <w:szCs w:val="22"/>
               </w:rPr>
-              <w:t>58</w:t>
+              <w:t>68</w:t>
             </w:r>
           </w:p>
         </w:tc>
@@ -5317,7 +5309,7 @@
                 <w:sz w:val="22"/>
                 <w:szCs w:val="22"/>
               </w:rPr>
-              <w:t>7.9</w:t>
+              <w:t>7.7</w:t>
             </w:r>
           </w:p>
         </w:tc>
@@ -5346,7 +5338,7 @@
                 <w:sz w:val="22"/>
                 <w:szCs w:val="22"/>
               </w:rPr>
-              <w:t>Release Bundle Checks</w:t>
+              <w:t>Graph-Node Binding by Repository</w:t>
             </w:r>
           </w:p>
         </w:tc>
@@ -5376,7 +5368,7 @@
                 <w:sz w:val="22"/>
                 <w:szCs w:val="22"/>
               </w:rPr>
-              <w:t>59</w:t>
+              <w:t>69</w:t>
             </w:r>
           </w:p>
         </w:tc>
@@ -5417,7 +5409,8 @@
                 <w:sz w:val="22"/>
                 <w:szCs w:val="22"/>
               </w:rPr>
-              <w:t>7.10</w:t>
+              <w:lastRenderedPageBreak/>
+              <w:t>7.8</w:t>
             </w:r>
           </w:p>
         </w:tc>
@@ -5446,7 +5439,7 @@
                 <w:sz w:val="22"/>
                 <w:szCs w:val="22"/>
               </w:rPr>
-              <w:t>Growth of the Main Test Suite</w:t>
+              <w:t xml:space="preserve">Graph Query Latency per Repository Against the 100 ms Budget</w:t>
             </w:r>
           </w:p>
         </w:tc>
@@ -5476,7 +5469,7 @@
                 <w:sz w:val="22"/>
                 <w:szCs w:val="22"/>
               </w:rPr>
-              <w:t>61</w:t>
+              <w:t>58</w:t>
             </w:r>
           </w:p>
         </w:tc>
@@ -5517,7 +5510,7 @@
                 <w:sz w:val="22"/>
                 <w:szCs w:val="22"/>
               </w:rPr>
-              <w:t>7.11</w:t>
+              <w:t>7.9</w:t>
             </w:r>
           </w:p>
         </w:tc>
@@ -5546,7 +5539,7 @@
                 <w:sz w:val="22"/>
                 <w:szCs w:val="22"/>
               </w:rPr>
-              <w:t>Summary of Go/No-Go Gate Outcomes</w:t>
+              <w:t>Release Bundle Checks</w:t>
             </w:r>
           </w:p>
         </w:tc>
@@ -5576,7 +5569,207 @@
                 <w:sz w:val="22"/>
                 <w:szCs w:val="22"/>
               </w:rPr>
-              <w:t>62</w:t>
+              <w:t>71</w:t>
+            </w:r>
+          </w:p>
+        </w:tc>
+      </w:tr>
+      <w:tr>
+        <w:tblPrEx>
+          <w:tblCellMar>
+            <w:top w:w="0" w:type="dxa"/>
+            <w:bottom w:w="0" w:type="dxa"/>
+          </w:tblCellMar>
+        </w:tblPrEx>
+        <w:trPr>
+          <w:cantSplit/>
+        </w:trPr>
+        <w:tc>
+          <w:tcPr>
+            <w:tcW w:w="1300" w:type="dxa"/>
+            <w:tcBorders>
+              <w:top w:val="single" w:sz="4" w:space="0" w:color="808080"/>
+              <w:left w:val="single" w:sz="4" w:space="0" w:color="808080"/>
+              <w:bottom w:val="single" w:sz="4" w:space="0" w:color="808080"/>
+              <w:right w:val="single" w:sz="4" w:space="0" w:color="808080"/>
+            </w:tcBorders>
+            <w:tcMar>
+              <w:top w:w="40" w:type="dxa"/>
+              <w:left w:w="100" w:type="dxa"/>
+              <w:bottom w:w="40" w:type="dxa"/>
+              <w:right w:w="100" w:type="dxa"/>
+            </w:tcMar>
+          </w:tcPr>
+          <w:p>
+            <w:pPr>
+              <w:spacing w:line="276" w:lineRule="auto"/>
+              <w:jc w:val="center"/>
+            </w:pPr>
+            <w:r>
+              <w:rPr>
+                <w:sz w:val="22"/>
+                <w:szCs w:val="22"/>
+              </w:rPr>
+              <w:t>7.10</w:t>
+            </w:r>
+          </w:p>
+        </w:tc>
+        <w:tc>
+          <w:tcPr>
+            <w:tcW w:w="5906" w:type="dxa"/>
+            <w:tcBorders>
+              <w:top w:val="single" w:sz="4" w:space="0" w:color="808080"/>
+              <w:left w:val="single" w:sz="4" w:space="0" w:color="808080"/>
+              <w:bottom w:val="single" w:sz="4" w:space="0" w:color="808080"/>
+              <w:right w:val="single" w:sz="4" w:space="0" w:color="808080"/>
+            </w:tcBorders>
+            <w:tcMar>
+              <w:top w:w="40" w:type="dxa"/>
+              <w:left w:w="100" w:type="dxa"/>
+              <w:bottom w:w="40" w:type="dxa"/>
+              <w:right w:w="100" w:type="dxa"/>
+            </w:tcMar>
+          </w:tcPr>
+          <w:p>
+            <w:pPr>
+              <w:spacing w:line="276" w:lineRule="auto"/>
+            </w:pPr>
+            <w:r>
+              <w:rPr>
+                <w:sz w:val="22"/>
+                <w:szCs w:val="22"/>
+              </w:rPr>
+              <w:t>Growth of the Main Test Suite</w:t>
+            </w:r>
+          </w:p>
+        </w:tc>
+        <w:tc>
+          <w:tcPr>
+            <w:tcW w:w="1100" w:type="dxa"/>
+            <w:tcBorders>
+              <w:top w:val="single" w:sz="4" w:space="0" w:color="808080"/>
+              <w:left w:val="single" w:sz="4" w:space="0" w:color="808080"/>
+              <w:bottom w:val="single" w:sz="4" w:space="0" w:color="808080"/>
+              <w:right w:val="single" w:sz="4" w:space="0" w:color="808080"/>
+            </w:tcBorders>
+            <w:tcMar>
+              <w:top w:w="40" w:type="dxa"/>
+              <w:left w:w="100" w:type="dxa"/>
+              <w:bottom w:w="40" w:type="dxa"/>
+              <w:right w:w="100" w:type="dxa"/>
+            </w:tcMar>
+          </w:tcPr>
+          <w:p>
+            <w:pPr>
+              <w:spacing w:line="276" w:lineRule="auto"/>
+              <w:jc w:val="center"/>
+            </w:pPr>
+            <w:r>
+              <w:rPr>
+                <w:sz w:val="22"/>
+                <w:szCs w:val="22"/>
+              </w:rPr>
+              <w:t>74</w:t>
+            </w:r>
+          </w:p>
+        </w:tc>
+      </w:tr>
+      <w:tr>
+        <w:tblPrEx>
+          <w:tblCellMar>
+            <w:top w:w="0" w:type="dxa"/>
+            <w:bottom w:w="0" w:type="dxa"/>
+          </w:tblCellMar>
+        </w:tblPrEx>
+        <w:trPr>
+          <w:cantSplit/>
+        </w:trPr>
+        <w:tc>
+          <w:tcPr>
+            <w:tcW w:w="1300" w:type="dxa"/>
+            <w:tcBorders>
+              <w:top w:val="single" w:sz="4" w:space="0" w:color="808080"/>
+              <w:left w:val="single" w:sz="4" w:space="0" w:color="808080"/>
+              <w:bottom w:val="single" w:sz="4" w:space="0" w:color="808080"/>
+              <w:right w:val="single" w:sz="4" w:space="0" w:color="808080"/>
+            </w:tcBorders>
+            <w:tcMar>
+              <w:top w:w="40" w:type="dxa"/>
+              <w:left w:w="100" w:type="dxa"/>
+              <w:bottom w:w="40" w:type="dxa"/>
+              <w:right w:w="100" w:type="dxa"/>
+            </w:tcMar>
+          </w:tcPr>
+          <w:p>
+            <w:pPr>
+              <w:spacing w:line="276" w:lineRule="auto"/>
+              <w:jc w:val="center"/>
+            </w:pPr>
+            <w:r>
+              <w:rPr>
+                <w:sz w:val="22"/>
+                <w:szCs w:val="22"/>
+              </w:rPr>
+              <w:t>7.11</w:t>
+            </w:r>
+          </w:p>
+        </w:tc>
+        <w:tc>
+          <w:tcPr>
+            <w:tcW w:w="5906" w:type="dxa"/>
+            <w:tcBorders>
+              <w:top w:val="single" w:sz="4" w:space="0" w:color="808080"/>
+              <w:left w:val="single" w:sz="4" w:space="0" w:color="808080"/>
+              <w:bottom w:val="single" w:sz="4" w:space="0" w:color="808080"/>
+              <w:right w:val="single" w:sz="4" w:space="0" w:color="808080"/>
+            </w:tcBorders>
+            <w:tcMar>
+              <w:top w:w="40" w:type="dxa"/>
+              <w:left w:w="100" w:type="dxa"/>
+              <w:bottom w:w="40" w:type="dxa"/>
+              <w:right w:w="100" w:type="dxa"/>
+            </w:tcMar>
+          </w:tcPr>
+          <w:p>
+            <w:pPr>
+              <w:spacing w:line="276" w:lineRule="auto"/>
+            </w:pPr>
+            <w:r>
+              <w:rPr>
+                <w:sz w:val="22"/>
+                <w:szCs w:val="22"/>
+              </w:rPr>
+              <w:t>Summary of Go/No-Go Gate Outcomes</w:t>
+            </w:r>
+          </w:p>
+        </w:tc>
+        <w:tc>
+          <w:tcPr>
+            <w:tcW w:w="1100" w:type="dxa"/>
+            <w:tcBorders>
+              <w:top w:val="single" w:sz="4" w:space="0" w:color="808080"/>
+              <w:left w:val="single" w:sz="4" w:space="0" w:color="808080"/>
+              <w:bottom w:val="single" w:sz="4" w:space="0" w:color="808080"/>
+              <w:right w:val="single" w:sz="4" w:space="0" w:color="808080"/>
+            </w:tcBorders>
+            <w:tcMar>
+              <w:top w:w="40" w:type="dxa"/>
+              <w:left w:w="100" w:type="dxa"/>
+              <w:bottom w:w="40" w:type="dxa"/>
+              <w:right w:w="100" w:type="dxa"/>
+            </w:tcMar>
+          </w:tcPr>
+          <w:p>
+            <w:pPr>
+              <w:spacing w:line="276" w:lineRule="auto"/>
+              <w:jc w:val="center"/>
+            </w:pPr>
+            <w:r>
+              <w:rPr>
+                <w:sz w:val="22"/>
+                <w:szCs w:val="22"/>
+              </w:rPr>
+              <w:t>75</w:t>
             </w:r>
           </w:p>
         </w:tc>
@@ -5927,7 +6120,7 @@
                 <w:sz w:val="22"/>
                 <w:szCs w:val="22"/>
               </w:rPr>
-              <w:t>13</w:t>
+              <w:t>14</w:t>
             </w:r>
           </w:p>
         </w:tc>
@@ -6027,7 +6220,7 @@
                 <w:sz w:val="22"/>
                 <w:szCs w:val="22"/>
               </w:rPr>
-              <w:t>16</w:t>
+              <w:t>17</w:t>
             </w:r>
           </w:p>
         </w:tc>
@@ -6127,7 +6320,7 @@
                 <w:sz w:val="22"/>
                 <w:szCs w:val="22"/>
               </w:rPr>
-              <w:t>17</w:t>
+              <w:t>19</w:t>
             </w:r>
           </w:p>
         </w:tc>
@@ -6227,7 +6420,7 @@
                 <w:sz w:val="22"/>
                 <w:szCs w:val="22"/>
               </w:rPr>
-              <w:t>20</w:t>
+              <w:t>22</w:t>
             </w:r>
           </w:p>
         </w:tc>
@@ -6327,7 +6520,7 @@
                 <w:sz w:val="22"/>
                 <w:szCs w:val="22"/>
               </w:rPr>
-              <w:t>21</w:t>
+              <w:t>24</w:t>
             </w:r>
           </w:p>
         </w:tc>
@@ -6427,7 +6620,7 @@
                 <w:sz w:val="22"/>
                 <w:szCs w:val="22"/>
               </w:rPr>
-              <w:t>23</w:t>
+              <w:t>25</w:t>
             </w:r>
           </w:p>
         </w:tc>
@@ -6527,7 +6720,7 @@
                 <w:sz w:val="22"/>
                 <w:szCs w:val="22"/>
               </w:rPr>
-              <w:t>32</w:t>
+              <w:t>36</w:t>
             </w:r>
           </w:p>
         </w:tc>
@@ -6627,7 +6820,7 @@
                 <w:sz w:val="22"/>
                 <w:szCs w:val="22"/>
               </w:rPr>
-              <w:t>34</w:t>
+              <w:t>38</w:t>
             </w:r>
           </w:p>
         </w:tc>
@@ -6727,7 +6920,7 @@
                 <w:sz w:val="22"/>
                 <w:szCs w:val="22"/>
               </w:rPr>
-              <w:t>38</w:t>
+              <w:t>42</w:t>
             </w:r>
           </w:p>
         </w:tc>
@@ -6827,7 +7020,7 @@
                 <w:sz w:val="22"/>
                 <w:szCs w:val="22"/>
               </w:rPr>
-              <w:t>39</w:t>
+              <w:t>43</w:t>
             </w:r>
           </w:p>
         </w:tc>
@@ -6927,7 +7120,7 @@
                 <w:sz w:val="22"/>
                 <w:szCs w:val="22"/>
               </w:rPr>
-              <w:t>39</w:t>
+              <w:t>44</w:t>
             </w:r>
           </w:p>
         </w:tc>
@@ -7027,7 +7220,7 @@
                 <w:sz w:val="22"/>
                 <w:szCs w:val="22"/>
               </w:rPr>
-              <w:t>41</w:t>
+              <w:t>46</w:t>
             </w:r>
           </w:p>
         </w:tc>
@@ -7127,7 +7320,7 @@
                 <w:sz w:val="22"/>
                 <w:szCs w:val="22"/>
               </w:rPr>
-              <w:t>43</w:t>
+              <w:t>48</w:t>
             </w:r>
           </w:p>
         </w:tc>
@@ -7227,7 +7420,7 @@
                 <w:sz w:val="22"/>
                 <w:szCs w:val="22"/>
               </w:rPr>
-              <w:t>43</w:t>
+              <w:t>49</w:t>
             </w:r>
           </w:p>
         </w:tc>
@@ -7327,7 +7520,7 @@
                 <w:sz w:val="22"/>
                 <w:szCs w:val="22"/>
               </w:rPr>
-              <w:t>44</w:t>
+              <w:t>49</w:t>
             </w:r>
           </w:p>
         </w:tc>
@@ -7427,7 +7620,7 @@
                 <w:sz w:val="22"/>
                 <w:szCs w:val="22"/>
               </w:rPr>
-              <w:t>45</w:t>
+              <w:t>50</w:t>
             </w:r>
           </w:p>
         </w:tc>
@@ -7527,7 +7720,7 @@
                 <w:sz w:val="22"/>
                 <w:szCs w:val="22"/>
               </w:rPr>
-              <w:t>50</w:t>
+              <w:t>58</w:t>
             </w:r>
           </w:p>
         </w:tc>
@@ -7568,7 +7761,7 @@
                 <w:sz w:val="22"/>
                 <w:szCs w:val="22"/>
               </w:rPr>
-              <w:t>7.1</w:t>
+              <w:t>6.2</w:t>
             </w:r>
           </w:p>
         </w:tc>
@@ -7597,7 +7790,7 @@
                 <w:sz w:val="22"/>
                 <w:szCs w:val="22"/>
               </w:rPr>
-              <w:t>Dataset Figures Before and After the Canonical Rebuild</w:t>
+              <w:t>The Five Agents of the Workflow</w:t>
             </w:r>
           </w:p>
         </w:tc>
@@ -7627,7 +7820,7 @@
                 <w:sz w:val="22"/>
                 <w:szCs w:val="22"/>
               </w:rPr>
-              <w:t>51</w:t>
+              <w:t>59</w:t>
             </w:r>
           </w:p>
         </w:tc>
@@ -7668,7 +7861,7 @@
                 <w:sz w:val="22"/>
                 <w:szCs w:val="22"/>
               </w:rPr>
-              <w:t>7.2</w:t>
+              <w:t>7.1</w:t>
             </w:r>
           </w:p>
         </w:tc>
@@ -7697,7 +7890,7 @@
                 <w:sz w:val="22"/>
                 <w:szCs w:val="22"/>
               </w:rPr>
-              <w:t>Scope of the Parameter-Type Parsing Defect</w:t>
+              <w:t>Dataset Figures Before and After the Canonical Rebuild</w:t>
             </w:r>
           </w:p>
         </w:tc>
@@ -7727,7 +7920,7 @@
                 <w:sz w:val="22"/>
                 <w:szCs w:val="22"/>
               </w:rPr>
-              <w:t>53</w:t>
+              <w:t>62</w:t>
             </w:r>
           </w:p>
         </w:tc>
@@ -7768,7 +7961,7 @@
                 <w:sz w:val="22"/>
                 <w:szCs w:val="22"/>
               </w:rPr>
-              <w:t>7.3</w:t>
+              <w:t>7.2</w:t>
             </w:r>
           </w:p>
         </w:tc>
@@ -7797,7 +7990,7 @@
                 <w:sz w:val="22"/>
                 <w:szCs w:val="22"/>
               </w:rPr>
-              <w:t>Test-Identifier Binding</w:t>
+              <w:t>Scope of the Parameter-Type Parsing Defect</w:t>
             </w:r>
           </w:p>
         </w:tc>
@@ -7827,7 +8020,7 @@
                 <w:sz w:val="22"/>
                 <w:szCs w:val="22"/>
               </w:rPr>
-              <w:t>54</w:t>
+              <w:t>64</w:t>
             </w:r>
           </w:p>
         </w:tc>
@@ -7868,7 +8061,7 @@
                 <w:sz w:val="22"/>
                 <w:szCs w:val="22"/>
               </w:rPr>
-              <w:t>7.4</w:t>
+              <w:t>7.3</w:t>
             </w:r>
           </w:p>
         </w:tc>
@@ -7897,7 +8090,7 @@
                 <w:sz w:val="22"/>
                 <w:szCs w:val="22"/>
               </w:rPr>
-              <w:t>Graph Layer Mini-Corpus</w:t>
+              <w:t>Test-Identifier Binding</w:t>
             </w:r>
           </w:p>
         </w:tc>
@@ -7927,7 +8120,7 @@
                 <w:sz w:val="22"/>
                 <w:szCs w:val="22"/>
               </w:rPr>
-              <w:t>55</w:t>
+              <w:t>65</w:t>
             </w:r>
           </w:p>
         </w:tc>
@@ -7968,7 +8161,7 @@
                 <w:sz w:val="22"/>
                 <w:szCs w:val="22"/>
               </w:rPr>
-              <w:t>7.5</w:t>
+              <w:t>7.4</w:t>
             </w:r>
           </w:p>
         </w:tc>
@@ -7997,7 +8190,7 @@
                 <w:sz w:val="22"/>
                 <w:szCs w:val="22"/>
               </w:rPr>
-              <w:t>Graph-Node Binding Rate per Repository</w:t>
+              <w:t>Graph Layer Mini-Corpus</w:t>
             </w:r>
           </w:p>
         </w:tc>
@@ -8027,7 +8220,7 @@
                 <w:sz w:val="22"/>
                 <w:szCs w:val="22"/>
               </w:rPr>
-              <w:t>56</w:t>
+              <w:t>67</w:t>
             </w:r>
           </w:p>
         </w:tc>
@@ -8068,7 +8261,7 @@
                 <w:sz w:val="22"/>
                 <w:szCs w:val="22"/>
               </w:rPr>
-              <w:t>7.6</w:t>
+              <w:t>7.5</w:t>
             </w:r>
           </w:p>
         </w:tc>
@@ -8097,7 +8290,7 @@
                 <w:sz w:val="22"/>
                 <w:szCs w:val="22"/>
               </w:rPr>
-              <w:t>Graph Layer Performance Against Budgets</w:t>
+              <w:t>Graph-Node Binding Rate per Repository</w:t>
             </w:r>
           </w:p>
         </w:tc>
@@ -8127,7 +8320,7 @@
                 <w:sz w:val="22"/>
                 <w:szCs w:val="22"/>
               </w:rPr>
-              <w:t>57</w:t>
+              <w:t>68</w:t>
             </w:r>
           </w:p>
         </w:tc>
@@ -8168,7 +8361,7 @@
                 <w:sz w:val="22"/>
                 <w:szCs w:val="22"/>
               </w:rPr>
-              <w:t>7.7</w:t>
+              <w:t>7.6</w:t>
             </w:r>
           </w:p>
         </w:tc>
@@ -8197,7 +8390,7 @@
                 <w:sz w:val="22"/>
                 <w:szCs w:val="22"/>
               </w:rPr>
-              <w:t>Parser Precision on Development Corpora (Holdout v5 Not Scored)</w:t>
+              <w:t>Graph Layer Performance Against Budgets</w:t>
             </w:r>
           </w:p>
         </w:tc>
@@ -8227,7 +8420,7 @@
                 <w:sz w:val="22"/>
                 <w:szCs w:val="22"/>
               </w:rPr>
-              <w:t>59</w:t>
+              <w:t>69</w:t>
             </w:r>
           </w:p>
         </w:tc>
@@ -8268,7 +8461,7 @@
                 <w:sz w:val="22"/>
                 <w:szCs w:val="22"/>
               </w:rPr>
-              <w:t>7.8</w:t>
+              <w:t>7.7</w:t>
             </w:r>
           </w:p>
         </w:tc>
@@ -8297,7 +8490,7 @@
                 <w:sz w:val="22"/>
                 <w:szCs w:val="22"/>
               </w:rPr>
-              <w:t>RQ1 at k = 10 over 576 Instances</w:t>
+              <w:t>Parser Precision on Development Corpora (Holdout v5 Not Scored)</w:t>
             </w:r>
           </w:p>
         </w:tc>
@@ -8327,7 +8520,107 @@
                 <w:sz w:val="22"/>
                 <w:szCs w:val="22"/>
               </w:rPr>
-              <w:t>60</w:t>
+              <w:t>72</w:t>
+            </w:r>
+          </w:p>
+        </w:tc>
+      </w:tr>
+      <w:tr>
+        <w:tblPrEx>
+          <w:tblCellMar>
+            <w:top w:w="0" w:type="dxa"/>
+            <w:bottom w:w="0" w:type="dxa"/>
+          </w:tblCellMar>
+        </w:tblPrEx>
+        <w:trPr>
+          <w:cantSplit/>
+        </w:trPr>
+        <w:tc>
+          <w:tcPr>
+            <w:tcW w:w="1300" w:type="dxa"/>
+            <w:tcBorders>
+              <w:top w:val="single" w:sz="4" w:space="0" w:color="808080"/>
+              <w:left w:val="single" w:sz="4" w:space="0" w:color="808080"/>
+              <w:bottom w:val="single" w:sz="4" w:space="0" w:color="808080"/>
+              <w:right w:val="single" w:sz="4" w:space="0" w:color="808080"/>
+            </w:tcBorders>
+            <w:tcMar>
+              <w:top w:w="40" w:type="dxa"/>
+              <w:left w:w="100" w:type="dxa"/>
+              <w:bottom w:w="40" w:type="dxa"/>
+              <w:right w:w="100" w:type="dxa"/>
+            </w:tcMar>
+          </w:tcPr>
+          <w:p>
+            <w:pPr>
+              <w:spacing w:line="276" w:lineRule="auto"/>
+              <w:jc w:val="center"/>
+            </w:pPr>
+            <w:r>
+              <w:rPr>
+                <w:sz w:val="22"/>
+                <w:szCs w:val="22"/>
+              </w:rPr>
+              <w:t>7.8</w:t>
+            </w:r>
+          </w:p>
+        </w:tc>
+        <w:tc>
+          <w:tcPr>
+            <w:tcW w:w="5906" w:type="dxa"/>
+            <w:tcBorders>
+              <w:top w:val="single" w:sz="4" w:space="0" w:color="808080"/>
+              <w:left w:val="single" w:sz="4" w:space="0" w:color="808080"/>
+              <w:bottom w:val="single" w:sz="4" w:space="0" w:color="808080"/>
+              <w:right w:val="single" w:sz="4" w:space="0" w:color="808080"/>
+            </w:tcBorders>
+            <w:tcMar>
+              <w:top w:w="40" w:type="dxa"/>
+              <w:left w:w="100" w:type="dxa"/>
+              <w:bottom w:w="40" w:type="dxa"/>
+              <w:right w:w="100" w:type="dxa"/>
+            </w:tcMar>
+          </w:tcPr>
+          <w:p>
+            <w:pPr>
+              <w:spacing w:line="276" w:lineRule="auto"/>
+            </w:pPr>
+            <w:r>
+              <w:rPr>
+                <w:sz w:val="22"/>
+                <w:szCs w:val="22"/>
+              </w:rPr>
+              <w:t>RQ1 at k = 10 over 576 Instances</w:t>
+            </w:r>
+          </w:p>
+        </w:tc>
+        <w:tc>
+          <w:tcPr>
+            <w:tcW w:w="1100" w:type="dxa"/>
+            <w:tcBorders>
+              <w:top w:val="single" w:sz="4" w:space="0" w:color="808080"/>
+              <w:left w:val="single" w:sz="4" w:space="0" w:color="808080"/>
+              <w:bottom w:val="single" w:sz="4" w:space="0" w:color="808080"/>
+              <w:right w:val="single" w:sz="4" w:space="0" w:color="808080"/>
+            </w:tcBorders>
+            <w:tcMar>
+              <w:top w:w="40" w:type="dxa"/>
+              <w:left w:w="100" w:type="dxa"/>
+              <w:bottom w:w="40" w:type="dxa"/>
+              <w:right w:w="100" w:type="dxa"/>
+            </w:tcMar>
+          </w:tcPr>
+          <w:p>
+            <w:pPr>
+              <w:spacing w:line="276" w:lineRule="auto"/>
+              <w:jc w:val="center"/>
+            </w:pPr>
+            <w:r>
+              <w:rPr>
+                <w:sz w:val="22"/>
+                <w:szCs w:val="22"/>
+              </w:rPr>
+              <w:t>73</w:t>
             </w:r>
           </w:p>
         </w:tc>
@@ -32990,6 +33283,1094 @@
       </w:pPr>
       <w:r>
         <w:t xml:space="preserve">The final review also includes a demo site that replays one real instance through the pipeline stages. Its Overview view shows the scale of the corpus and the headline RQ1 finding, and its Live run view draws the code-graph neighbourhood of a change (changed files at the centre, dependants in rings by distance) with the tests that actually failed and the files each predictor selected marked on it. It is a static replay of exported data (Figs. A.1 to A.3 in Appendix A show it), so every number on it is read from the same generated tables as this report; make demo runs the same walkthrough live in the terminal.</w:t>
+      </w:r>
+    </w:p>
+    <w:p>
+      <w:pPr>
+        <w:pStyle w:val="Heading2"/>
+        <w:keepNext/>
+        <w:spacing w:before="240" w:after="120" w:line="360" w:lineRule="auto"/>
+      </w:pPr>
+      <w:r>
+        <w:t>6.9 Agentic Workflow: From User Story to Deployment</w:t>
+      </w:r>
+    </w:p>
+    <w:p>
+      <w:pPr>
+        <w:spacing w:after="120" w:line="360" w:lineRule="auto"/>
+        <w:ind w:firstLine="720"/>
+        <w:jc w:val="both"/>
+      </w:pPr>
+      <w:r>
+        <w:t xml:space="preserve">After the pre-final review the project gained an agentic workflow that carries the impact analysis into the everyday path of a change. Five agents hand work to each other, from a user story to a deployed, regression-tested change (Table 6.2). The workflow lives in src/agents/ and is a separate demonstration path (decision D-55): the agents may call a language model, so nothing in the reproducible pipeline imports them, and no number they produce appears in Chapter 7, in the release bundle or in the paper.</w:t>
+      </w:r>
+    </w:p>
+    <w:p>
+      <w:pPr>
+        <w:keepNext/>
+        <w:spacing w:before="200" w:after="80"/>
+        <w:jc w:val="center"/>
+      </w:pPr>
+      <w:r>
+        <w:rPr>
+          <w:b/>
+          <w:bCs/>
+          <w:sz w:val="20"/>
+          <w:szCs w:val="20"/>
+        </w:rPr>
+        <w:t xml:space="preserve">Table 6.2 </w:t>
+      </w:r>
+      <w:r>
+        <w:rPr>
+          <w:sz w:val="20"/>
+          <w:szCs w:val="20"/>
+        </w:rPr>
+        <w:t>The Five Agents of the Workflow</w:t>
+      </w:r>
+    </w:p>
+    <w:tbl>
+      <w:tblPr>
+        <w:tblW w:w="8306" w:type="dxa"/>
+        <w:jc w:val="center"/>
+        <w:tblBorders>
+          <w:top w:val="single" w:sz="4" w:space="0" w:color="auto"/>
+          <w:left w:val="single" w:sz="4" w:space="0" w:color="auto"/>
+          <w:bottom w:val="single" w:sz="4" w:space="0" w:color="auto"/>
+          <w:right w:val="single" w:sz="4" w:space="0" w:color="auto"/>
+          <w:insideH w:val="single" w:sz="4" w:space="0" w:color="auto"/>
+          <w:insideV w:val="single" w:sz="4" w:space="0" w:color="auto"/>
+        </w:tblBorders>
+        <w:tblCellMar>
+          <w:left w:w="10" w:type="dxa"/>
+          <w:right w:w="10" w:type="dxa"/>
+        </w:tblCellMar>
+        <w:tblLook w:val="0000" w:firstRow="0" w:lastRow="0" w:firstColumn="0" w:lastColumn="0" w:noHBand="0" w:noVBand="0"/>
+      </w:tblPr>
+      <w:tblGrid>
+        <w:gridCol w:w="1500"/>
+        <w:gridCol w:w="1900"/>
+        <w:gridCol w:w="2906"/>
+        <w:gridCol w:w="2000"/>
+      </w:tblGrid>
+      <w:tr>
+        <w:trPr>
+          <w:tblHeader/>
+          <w:jc w:val="center"/>
+        </w:trPr>
+        <w:tc>
+          <w:tcPr>
+            <w:tcW w:w="1500" w:type="dxa"/>
+            <w:tcBorders>
+              <w:top w:val="single" w:sz="4" w:space="0" w:color="808080"/>
+              <w:left w:val="single" w:sz="4" w:space="0" w:color="808080"/>
+              <w:bottom w:val="single" w:sz="4" w:space="0" w:color="808080"/>
+              <w:right w:val="single" w:sz="4" w:space="0" w:color="808080"/>
+            </w:tcBorders>
+            <w:shd w:val="clear" w:color="auto" w:fill="DCE4EE"/>
+            <w:tcMar>
+              <w:top w:w="50" w:type="dxa"/>
+              <w:left w:w="90" w:type="dxa"/>
+              <w:bottom w:w="50" w:type="dxa"/>
+              <w:right w:w="90" w:type="dxa"/>
+            </w:tcMar>
+            <w:vAlign w:val="center"/>
+          </w:tcPr>
+          <w:p>
+            <w:pPr>
+              <w:spacing w:line="252" w:lineRule="auto"/>
+              <w:jc w:val="center"/>
+            </w:pPr>
+            <w:r>
+              <w:rPr>
+                <w:b/>
+                <w:bCs/>
+                <w:sz w:val="20"/>
+                <w:szCs w:val="20"/>
+              </w:rPr>
+              <w:t xml:space="preserve">Agent</w:t>
+            </w:r>
+          </w:p>
+        </w:tc>
+        <w:tc>
+          <w:tcPr>
+            <w:tcW w:w="1900" w:type="dxa"/>
+            <w:tcBorders>
+              <w:top w:val="single" w:sz="4" w:space="0" w:color="808080"/>
+              <w:left w:val="single" w:sz="4" w:space="0" w:color="808080"/>
+              <w:bottom w:val="single" w:sz="4" w:space="0" w:color="808080"/>
+              <w:right w:val="single" w:sz="4" w:space="0" w:color="808080"/>
+            </w:tcBorders>
+            <w:shd w:val="clear" w:color="auto" w:fill="DCE4EE"/>
+            <w:tcMar>
+              <w:top w:w="50" w:type="dxa"/>
+              <w:left w:w="90" w:type="dxa"/>
+              <w:bottom w:w="50" w:type="dxa"/>
+              <w:right w:w="90" w:type="dxa"/>
+            </w:tcMar>
+            <w:vAlign w:val="center"/>
+          </w:tcPr>
+          <w:p>
+            <w:pPr>
+              <w:spacing w:line="252" w:lineRule="auto"/>
+              <w:jc w:val="center"/>
+            </w:pPr>
+            <w:r>
+              <w:rPr>
+                <w:b/>
+                <w:bCs/>
+                <w:sz w:val="20"/>
+                <w:szCs w:val="20"/>
+              </w:rPr>
+              <w:t xml:space="preserve">Input</w:t>
+            </w:r>
+          </w:p>
+        </w:tc>
+        <w:tc>
+          <w:tcPr>
+            <w:tcW w:w="2906" w:type="dxa"/>
+            <w:tcBorders>
+              <w:top w:val="single" w:sz="4" w:space="0" w:color="808080"/>
+              <w:left w:val="single" w:sz="4" w:space="0" w:color="808080"/>
+              <w:bottom w:val="single" w:sz="4" w:space="0" w:color="808080"/>
+              <w:right w:val="single" w:sz="4" w:space="0" w:color="808080"/>
+            </w:tcBorders>
+            <w:shd w:val="clear" w:color="auto" w:fill="DCE4EE"/>
+            <w:tcMar>
+              <w:top w:w="50" w:type="dxa"/>
+              <w:left w:w="90" w:type="dxa"/>
+              <w:bottom w:w="50" w:type="dxa"/>
+              <w:right w:w="90" w:type="dxa"/>
+            </w:tcMar>
+            <w:vAlign w:val="center"/>
+          </w:tcPr>
+          <w:p>
+            <w:pPr>
+              <w:spacing w:line="252" w:lineRule="auto"/>
+              <w:jc w:val="center"/>
+            </w:pPr>
+            <w:r>
+              <w:rPr>
+                <w:b/>
+                <w:bCs/>
+                <w:sz w:val="20"/>
+                <w:szCs w:val="20"/>
+              </w:rPr>
+              <w:t xml:space="preserve">What it does</w:t>
+            </w:r>
+          </w:p>
+        </w:tc>
+        <w:tc>
+          <w:tcPr>
+            <w:tcW w:w="2000" w:type="dxa"/>
+            <w:tcBorders>
+              <w:top w:val="single" w:sz="4" w:space="0" w:color="808080"/>
+              <w:left w:val="single" w:sz="4" w:space="0" w:color="808080"/>
+              <w:bottom w:val="single" w:sz="4" w:space="0" w:color="808080"/>
+              <w:right w:val="single" w:sz="4" w:space="0" w:color="808080"/>
+            </w:tcBorders>
+            <w:shd w:val="clear" w:color="auto" w:fill="DCE4EE"/>
+            <w:tcMar>
+              <w:top w:w="50" w:type="dxa"/>
+              <w:left w:w="90" w:type="dxa"/>
+              <w:bottom w:w="50" w:type="dxa"/>
+              <w:right w:w="90" w:type="dxa"/>
+            </w:tcMar>
+            <w:vAlign w:val="center"/>
+          </w:tcPr>
+          <w:p>
+            <w:pPr>
+              <w:spacing w:line="252" w:lineRule="auto"/>
+              <w:jc w:val="center"/>
+            </w:pPr>
+            <w:r>
+              <w:rPr>
+                <w:b/>
+                <w:bCs/>
+                <w:sz w:val="20"/>
+                <w:szCs w:val="20"/>
+              </w:rPr>
+              <w:t xml:space="preserve">Output</w:t>
+            </w:r>
+          </w:p>
+        </w:tc>
+      </w:tr>
+      <w:tr>
+        <w:trPr>
+          <w:cantSplit/>
+          <w:jc w:val="center"/>
+        </w:trPr>
+        <w:tc>
+          <w:tcPr>
+            <w:tcW w:w="1500" w:type="dxa"/>
+            <w:tcBorders>
+              <w:top w:val="single" w:sz="4" w:space="0" w:color="808080"/>
+              <w:left w:val="single" w:sz="4" w:space="0" w:color="808080"/>
+              <w:bottom w:val="single" w:sz="4" w:space="0" w:color="808080"/>
+              <w:right w:val="single" w:sz="4" w:space="0" w:color="808080"/>
+            </w:tcBorders>
+            <w:tcMar>
+              <w:top w:w="50" w:type="dxa"/>
+              <w:left w:w="90" w:type="dxa"/>
+              <w:bottom w:w="50" w:type="dxa"/>
+              <w:right w:w="90" w:type="dxa"/>
+            </w:tcMar>
+            <w:vAlign w:val="center"/>
+          </w:tcPr>
+          <w:p>
+            <w:pPr>
+              <w:spacing w:line="252" w:lineRule="auto"/>
+              <w:jc w:val="left"/>
+            </w:pPr>
+            <w:r>
+              <w:rPr>
+                <w:sz w:val="20"/>
+                <w:szCs w:val="20"/>
+              </w:rPr>
+              <w:t xml:space="preserve">1. Impact Analysis</w:t>
+            </w:r>
+          </w:p>
+        </w:tc>
+        <w:tc>
+          <w:tcPr>
+            <w:tcW w:w="1900" w:type="dxa"/>
+            <w:tcBorders>
+              <w:top w:val="single" w:sz="4" w:space="0" w:color="808080"/>
+              <w:left w:val="single" w:sz="4" w:space="0" w:color="808080"/>
+              <w:bottom w:val="single" w:sz="4" w:space="0" w:color="808080"/>
+              <w:right w:val="single" w:sz="4" w:space="0" w:color="808080"/>
+            </w:tcBorders>
+            <w:tcMar>
+              <w:top w:w="50" w:type="dxa"/>
+              <w:left w:w="90" w:type="dxa"/>
+              <w:bottom w:w="50" w:type="dxa"/>
+              <w:right w:w="90" w:type="dxa"/>
+            </w:tcMar>
+            <w:vAlign w:val="center"/>
+          </w:tcPr>
+          <w:p>
+            <w:pPr>
+              <w:spacing w:line="252" w:lineRule="auto"/>
+              <w:jc w:val="left"/>
+            </w:pPr>
+            <w:r>
+              <w:rPr>
+                <w:sz w:val="20"/>
+                <w:szCs w:val="20"/>
+              </w:rPr>
+              <w:t xml:space="preserve">User story, codebase</w:t>
+            </w:r>
+          </w:p>
+        </w:tc>
+        <w:tc>
+          <w:tcPr>
+            <w:tcW w:w="2906" w:type="dxa"/>
+            <w:tcBorders>
+              <w:top w:val="single" w:sz="4" w:space="0" w:color="808080"/>
+              <w:left w:val="single" w:sz="4" w:space="0" w:color="808080"/>
+              <w:bottom w:val="single" w:sz="4" w:space="0" w:color="808080"/>
+              <w:right w:val="single" w:sz="4" w:space="0" w:color="808080"/>
+            </w:tcBorders>
+            <w:tcMar>
+              <w:top w:w="50" w:type="dxa"/>
+              <w:left w:w="90" w:type="dxa"/>
+              <w:bottom w:w="50" w:type="dxa"/>
+              <w:right w:w="90" w:type="dxa"/>
+            </w:tcMar>
+            <w:vAlign w:val="center"/>
+          </w:tcPr>
+          <w:p>
+            <w:pPr>
+              <w:spacing w:line="252" w:lineRule="auto"/>
+              <w:jc w:val="left"/>
+            </w:pPr>
+            <w:r>
+              <w:rPr>
+                <w:sz w:val="20"/>
+                <w:szCs w:val="20"/>
+              </w:rPr>
+              <w:t xml:space="preserve">Matches the story to source files, builds the commit-pinned code graph (Section 4.1.12) and finds the tests that depend on those files by reverse reachability; raises the risk of tests that failed before</w:t>
+            </w:r>
+          </w:p>
+        </w:tc>
+        <w:tc>
+          <w:tcPr>
+            <w:tcW w:w="2000" w:type="dxa"/>
+            <w:tcBorders>
+              <w:top w:val="single" w:sz="4" w:space="0" w:color="808080"/>
+              <w:left w:val="single" w:sz="4" w:space="0" w:color="808080"/>
+              <w:bottom w:val="single" w:sz="4" w:space="0" w:color="808080"/>
+              <w:right w:val="single" w:sz="4" w:space="0" w:color="808080"/>
+            </w:tcBorders>
+            <w:tcMar>
+              <w:top w:w="50" w:type="dxa"/>
+              <w:left w:w="90" w:type="dxa"/>
+              <w:bottom w:w="50" w:type="dxa"/>
+              <w:right w:w="90" w:type="dxa"/>
+            </w:tcMar>
+            <w:vAlign w:val="center"/>
+          </w:tcPr>
+          <w:p>
+            <w:pPr>
+              <w:spacing w:line="252" w:lineRule="auto"/>
+              <w:jc w:val="left"/>
+            </w:pPr>
+            <w:r>
+              <w:rPr>
+                <w:sz w:val="20"/>
+                <w:szCs w:val="20"/>
+              </w:rPr>
+              <w:t xml:space="preserve">Impact analysis document (impact.md) and impact.json</w:t>
+            </w:r>
+          </w:p>
+        </w:tc>
+      </w:tr>
+      <w:tr>
+        <w:trPr>
+          <w:cantSplit/>
+          <w:jc w:val="center"/>
+        </w:trPr>
+        <w:tc>
+          <w:tcPr>
+            <w:tcW w:w="1500" w:type="dxa"/>
+            <w:tcBorders>
+              <w:top w:val="single" w:sz="4" w:space="0" w:color="808080"/>
+              <w:left w:val="single" w:sz="4" w:space="0" w:color="808080"/>
+              <w:bottom w:val="single" w:sz="4" w:space="0" w:color="808080"/>
+              <w:right w:val="single" w:sz="4" w:space="0" w:color="808080"/>
+            </w:tcBorders>
+            <w:tcMar>
+              <w:top w:w="50" w:type="dxa"/>
+              <w:left w:w="90" w:type="dxa"/>
+              <w:bottom w:w="50" w:type="dxa"/>
+              <w:right w:w="90" w:type="dxa"/>
+            </w:tcMar>
+            <w:vAlign w:val="center"/>
+          </w:tcPr>
+          <w:p>
+            <w:pPr>
+              <w:spacing w:line="252" w:lineRule="auto"/>
+              <w:jc w:val="left"/>
+            </w:pPr>
+            <w:r>
+              <w:rPr>
+                <w:sz w:val="20"/>
+                <w:szCs w:val="20"/>
+              </w:rPr>
+              <w:t xml:space="preserve">2. Coding</w:t>
+            </w:r>
+          </w:p>
+        </w:tc>
+        <w:tc>
+          <w:tcPr>
+            <w:tcW w:w="1900" w:type="dxa"/>
+            <w:tcBorders>
+              <w:top w:val="single" w:sz="4" w:space="0" w:color="808080"/>
+              <w:left w:val="single" w:sz="4" w:space="0" w:color="808080"/>
+              <w:bottom w:val="single" w:sz="4" w:space="0" w:color="808080"/>
+              <w:right w:val="single" w:sz="4" w:space="0" w:color="808080"/>
+            </w:tcBorders>
+            <w:tcMar>
+              <w:top w:w="50" w:type="dxa"/>
+              <w:left w:w="90" w:type="dxa"/>
+              <w:bottom w:w="50" w:type="dxa"/>
+              <w:right w:w="90" w:type="dxa"/>
+            </w:tcMar>
+            <w:vAlign w:val="center"/>
+          </w:tcPr>
+          <w:p>
+            <w:pPr>
+              <w:spacing w:line="252" w:lineRule="auto"/>
+              <w:jc w:val="left"/>
+            </w:pPr>
+            <w:r>
+              <w:rPr>
+                <w:sz w:val="20"/>
+                <w:szCs w:val="20"/>
+              </w:rPr>
+              <w:t xml:space="preserve">Impact analysis, codebase</w:t>
+            </w:r>
+          </w:p>
+        </w:tc>
+        <w:tc>
+          <w:tcPr>
+            <w:tcW w:w="2906" w:type="dxa"/>
+            <w:tcBorders>
+              <w:top w:val="single" w:sz="4" w:space="0" w:color="808080"/>
+              <w:left w:val="single" w:sz="4" w:space="0" w:color="808080"/>
+              <w:bottom w:val="single" w:sz="4" w:space="0" w:color="808080"/>
+              <w:right w:val="single" w:sz="4" w:space="0" w:color="808080"/>
+            </w:tcBorders>
+            <w:tcMar>
+              <w:top w:w="50" w:type="dxa"/>
+              <w:left w:w="90" w:type="dxa"/>
+              <w:bottom w:w="50" w:type="dxa"/>
+              <w:right w:w="90" w:type="dxa"/>
+            </w:tcMar>
+            <w:vAlign w:val="center"/>
+          </w:tcPr>
+          <w:p>
+            <w:pPr>
+              <w:spacing w:line="252" w:lineRule="auto"/>
+              <w:jc w:val="left"/>
+            </w:pPr>
+            <w:r>
+              <w:rPr>
+                <w:sz w:val="20"/>
+                <w:szCs w:val="20"/>
+              </w:rPr>
+              <w:t xml:space="preserve">Writes the change on a new branch, with a language model or a recorded change set offline; every changed Python file must compile</w:t>
+            </w:r>
+          </w:p>
+        </w:tc>
+        <w:tc>
+          <w:tcPr>
+            <w:tcW w:w="2000" w:type="dxa"/>
+            <w:tcBorders>
+              <w:top w:val="single" w:sz="4" w:space="0" w:color="808080"/>
+              <w:left w:val="single" w:sz="4" w:space="0" w:color="808080"/>
+              <w:bottom w:val="single" w:sz="4" w:space="0" w:color="808080"/>
+              <w:right w:val="single" w:sz="4" w:space="0" w:color="808080"/>
+            </w:tcBorders>
+            <w:tcMar>
+              <w:top w:w="50" w:type="dxa"/>
+              <w:left w:w="90" w:type="dxa"/>
+              <w:bottom w:w="50" w:type="dxa"/>
+              <w:right w:w="90" w:type="dxa"/>
+            </w:tcMar>
+            <w:vAlign w:val="center"/>
+          </w:tcPr>
+          <w:p>
+            <w:pPr>
+              <w:spacing w:line="252" w:lineRule="auto"/>
+              <w:jc w:val="left"/>
+            </w:pPr>
+            <w:r>
+              <w:rPr>
+                <w:sz w:val="20"/>
+                <w:szCs w:val="20"/>
+              </w:rPr>
+              <w:t xml:space="preserve">Changed files, commit, pull request</w:t>
+            </w:r>
+          </w:p>
+        </w:tc>
+      </w:tr>
+      <w:tr>
+        <w:trPr>
+          <w:cantSplit/>
+          <w:jc w:val="center"/>
+        </w:trPr>
+        <w:tc>
+          <w:tcPr>
+            <w:tcW w:w="1500" w:type="dxa"/>
+            <w:tcBorders>
+              <w:top w:val="single" w:sz="4" w:space="0" w:color="808080"/>
+              <w:left w:val="single" w:sz="4" w:space="0" w:color="808080"/>
+              <w:bottom w:val="single" w:sz="4" w:space="0" w:color="808080"/>
+              <w:right w:val="single" w:sz="4" w:space="0" w:color="808080"/>
+            </w:tcBorders>
+            <w:tcMar>
+              <w:top w:w="50" w:type="dxa"/>
+              <w:left w:w="90" w:type="dxa"/>
+              <w:bottom w:w="50" w:type="dxa"/>
+              <w:right w:w="90" w:type="dxa"/>
+            </w:tcMar>
+            <w:vAlign w:val="center"/>
+          </w:tcPr>
+          <w:p>
+            <w:pPr>
+              <w:spacing w:line="252" w:lineRule="auto"/>
+              <w:jc w:val="left"/>
+            </w:pPr>
+            <w:r>
+              <w:rPr>
+                <w:sz w:val="20"/>
+                <w:szCs w:val="20"/>
+              </w:rPr>
+              <w:t xml:space="preserve">3. PR Reviewer</w:t>
+            </w:r>
+          </w:p>
+        </w:tc>
+        <w:tc>
+          <w:tcPr>
+            <w:tcW w:w="1900" w:type="dxa"/>
+            <w:tcBorders>
+              <w:top w:val="single" w:sz="4" w:space="0" w:color="808080"/>
+              <w:left w:val="single" w:sz="4" w:space="0" w:color="808080"/>
+              <w:bottom w:val="single" w:sz="4" w:space="0" w:color="808080"/>
+              <w:right w:val="single" w:sz="4" w:space="0" w:color="808080"/>
+            </w:tcBorders>
+            <w:tcMar>
+              <w:top w:w="50" w:type="dxa"/>
+              <w:left w:w="90" w:type="dxa"/>
+              <w:bottom w:w="50" w:type="dxa"/>
+              <w:right w:w="90" w:type="dxa"/>
+            </w:tcMar>
+            <w:vAlign w:val="center"/>
+          </w:tcPr>
+          <w:p>
+            <w:pPr>
+              <w:spacing w:line="252" w:lineRule="auto"/>
+              <w:jc w:val="left"/>
+            </w:pPr>
+            <w:r>
+              <w:rPr>
+                <w:sz w:val="20"/>
+                <w:szCs w:val="20"/>
+              </w:rPr>
+              <w:t xml:space="preserve">Pull request, impact analysis</w:t>
+            </w:r>
+          </w:p>
+        </w:tc>
+        <w:tc>
+          <w:tcPr>
+            <w:tcW w:w="2906" w:type="dxa"/>
+            <w:tcBorders>
+              <w:top w:val="single" w:sz="4" w:space="0" w:color="808080"/>
+              <w:left w:val="single" w:sz="4" w:space="0" w:color="808080"/>
+              <w:bottom w:val="single" w:sz="4" w:space="0" w:color="808080"/>
+              <w:right w:val="single" w:sz="4" w:space="0" w:color="808080"/>
+            </w:tcBorders>
+            <w:tcMar>
+              <w:top w:w="50" w:type="dxa"/>
+              <w:left w:w="90" w:type="dxa"/>
+              <w:bottom w:w="50" w:type="dxa"/>
+              <w:right w:w="90" w:type="dxa"/>
+            </w:tcMar>
+            <w:vAlign w:val="center"/>
+          </w:tcPr>
+          <w:p>
+            <w:pPr>
+              <w:spacing w:line="252" w:lineRule="auto"/>
+              <w:jc w:val="left"/>
+            </w:pPr>
+            <w:r>
+              <w:rPr>
+                <w:sz w:val="20"/>
+                <w:szCs w:val="20"/>
+              </w:rPr>
+              <w:t xml:space="preserve">Checks that the changed files lie inside the impact scope, compiles them, runs the tests at risk and reads the CI status</w:t>
+            </w:r>
+          </w:p>
+        </w:tc>
+        <w:tc>
+          <w:tcPr>
+            <w:tcW w:w="2000" w:type="dxa"/>
+            <w:tcBorders>
+              <w:top w:val="single" w:sz="4" w:space="0" w:color="808080"/>
+              <w:left w:val="single" w:sz="4" w:space="0" w:color="808080"/>
+              <w:bottom w:val="single" w:sz="4" w:space="0" w:color="808080"/>
+              <w:right w:val="single" w:sz="4" w:space="0" w:color="808080"/>
+            </w:tcBorders>
+            <w:tcMar>
+              <w:top w:w="50" w:type="dxa"/>
+              <w:left w:w="90" w:type="dxa"/>
+              <w:bottom w:w="50" w:type="dxa"/>
+              <w:right w:w="90" w:type="dxa"/>
+            </w:tcMar>
+            <w:vAlign w:val="center"/>
+          </w:tcPr>
+          <w:p>
+            <w:pPr>
+              <w:spacing w:line="252" w:lineRule="auto"/>
+              <w:jc w:val="left"/>
+            </w:pPr>
+            <w:r>
+              <w:rPr>
+                <w:sz w:val="20"/>
+                <w:szCs w:val="20"/>
+              </w:rPr>
+              <w:t xml:space="preserve">Review; on approval it merges and returns the merge commit id</w:t>
+            </w:r>
+          </w:p>
+        </w:tc>
+      </w:tr>
+      <w:tr>
+        <w:trPr>
+          <w:cantSplit/>
+          <w:jc w:val="center"/>
+        </w:trPr>
+        <w:tc>
+          <w:tcPr>
+            <w:tcW w:w="1500" w:type="dxa"/>
+            <w:tcBorders>
+              <w:top w:val="single" w:sz="4" w:space="0" w:color="808080"/>
+              <w:left w:val="single" w:sz="4" w:space="0" w:color="808080"/>
+              <w:bottom w:val="single" w:sz="4" w:space="0" w:color="808080"/>
+              <w:right w:val="single" w:sz="4" w:space="0" w:color="808080"/>
+            </w:tcBorders>
+            <w:tcMar>
+              <w:top w:w="50" w:type="dxa"/>
+              <w:left w:w="90" w:type="dxa"/>
+              <w:bottom w:w="50" w:type="dxa"/>
+              <w:right w:w="90" w:type="dxa"/>
+            </w:tcMar>
+            <w:vAlign w:val="center"/>
+          </w:tcPr>
+          <w:p>
+            <w:pPr>
+              <w:spacing w:line="252" w:lineRule="auto"/>
+              <w:jc w:val="left"/>
+            </w:pPr>
+            <w:r>
+              <w:rPr>
+                <w:sz w:val="20"/>
+                <w:szCs w:val="20"/>
+              </w:rPr>
+              <w:t xml:space="preserve">4. Build &amp; Deploy</w:t>
+            </w:r>
+          </w:p>
+        </w:tc>
+        <w:tc>
+          <w:tcPr>
+            <w:tcW w:w="1900" w:type="dxa"/>
+            <w:tcBorders>
+              <w:top w:val="single" w:sz="4" w:space="0" w:color="808080"/>
+              <w:left w:val="single" w:sz="4" w:space="0" w:color="808080"/>
+              <w:bottom w:val="single" w:sz="4" w:space="0" w:color="808080"/>
+              <w:right w:val="single" w:sz="4" w:space="0" w:color="808080"/>
+            </w:tcBorders>
+            <w:tcMar>
+              <w:top w:w="50" w:type="dxa"/>
+              <w:left w:w="90" w:type="dxa"/>
+              <w:bottom w:w="50" w:type="dxa"/>
+              <w:right w:w="90" w:type="dxa"/>
+            </w:tcMar>
+            <w:vAlign w:val="center"/>
+          </w:tcPr>
+          <w:p>
+            <w:pPr>
+              <w:spacing w:line="252" w:lineRule="auto"/>
+              <w:jc w:val="left"/>
+            </w:pPr>
+            <w:r>
+              <w:rPr>
+                <w:sz w:val="20"/>
+                <w:szCs w:val="20"/>
+              </w:rPr>
+              <w:t xml:space="preserve">Commit id, branch</w:t>
+            </w:r>
+          </w:p>
+        </w:tc>
+        <w:tc>
+          <w:tcPr>
+            <w:tcW w:w="2906" w:type="dxa"/>
+            <w:tcBorders>
+              <w:top w:val="single" w:sz="4" w:space="0" w:color="808080"/>
+              <w:left w:val="single" w:sz="4" w:space="0" w:color="808080"/>
+              <w:bottom w:val="single" w:sz="4" w:space="0" w:color="808080"/>
+              <w:right w:val="single" w:sz="4" w:space="0" w:color="808080"/>
+            </w:tcBorders>
+            <w:tcMar>
+              <w:top w:w="50" w:type="dxa"/>
+              <w:left w:w="90" w:type="dxa"/>
+              <w:bottom w:w="50" w:type="dxa"/>
+              <w:right w:w="90" w:type="dxa"/>
+            </w:tcMar>
+            <w:vAlign w:val="center"/>
+          </w:tcPr>
+          <w:p>
+            <w:pPr>
+              <w:spacing w:line="252" w:lineRule="auto"/>
+              <w:jc w:val="left"/>
+            </w:pPr>
+            <w:r>
+              <w:rPr>
+                <w:sz w:val="20"/>
+                <w:szCs w:val="20"/>
+              </w:rPr>
+              <w:t xml:space="preserve">Builds at the commit (full test suite, Maven or Gradle), packages and deploys; on GitHub it dispatches a workflow</w:t>
+            </w:r>
+          </w:p>
+        </w:tc>
+        <w:tc>
+          <w:tcPr>
+            <w:tcW w:w="2000" w:type="dxa"/>
+            <w:tcBorders>
+              <w:top w:val="single" w:sz="4" w:space="0" w:color="808080"/>
+              <w:left w:val="single" w:sz="4" w:space="0" w:color="808080"/>
+              <w:bottom w:val="single" w:sz="4" w:space="0" w:color="808080"/>
+              <w:right w:val="single" w:sz="4" w:space="0" w:color="808080"/>
+            </w:tcBorders>
+            <w:tcMar>
+              <w:top w:w="50" w:type="dxa"/>
+              <w:left w:w="90" w:type="dxa"/>
+              <w:bottom w:w="50" w:type="dxa"/>
+              <w:right w:w="90" w:type="dxa"/>
+            </w:tcMar>
+            <w:vAlign w:val="center"/>
+          </w:tcPr>
+          <w:p>
+            <w:pPr>
+              <w:spacing w:line="252" w:lineRule="auto"/>
+              <w:jc w:val="left"/>
+            </w:pPr>
+            <w:r>
+              <w:rPr>
+                <w:sz w:val="20"/>
+                <w:szCs w:val="20"/>
+              </w:rPr>
+              <w:t xml:space="preserve">Deployed package, or a notification when the build fails</w:t>
+            </w:r>
+          </w:p>
+        </w:tc>
+      </w:tr>
+      <w:tr>
+        <w:trPr>
+          <w:cantSplit/>
+          <w:jc w:val="center"/>
+        </w:trPr>
+        <w:tc>
+          <w:tcPr>
+            <w:tcW w:w="1500" w:type="dxa"/>
+            <w:tcBorders>
+              <w:top w:val="single" w:sz="4" w:space="0" w:color="808080"/>
+              <w:left w:val="single" w:sz="4" w:space="0" w:color="808080"/>
+              <w:bottom w:val="single" w:sz="4" w:space="0" w:color="808080"/>
+              <w:right w:val="single" w:sz="4" w:space="0" w:color="808080"/>
+            </w:tcBorders>
+            <w:tcMar>
+              <w:top w:w="50" w:type="dxa"/>
+              <w:left w:w="90" w:type="dxa"/>
+              <w:bottom w:w="50" w:type="dxa"/>
+              <w:right w:w="90" w:type="dxa"/>
+            </w:tcMar>
+            <w:vAlign w:val="center"/>
+          </w:tcPr>
+          <w:p>
+            <w:pPr>
+              <w:spacing w:line="252" w:lineRule="auto"/>
+              <w:jc w:val="left"/>
+            </w:pPr>
+            <w:r>
+              <w:rPr>
+                <w:sz w:val="20"/>
+                <w:szCs w:val="20"/>
+              </w:rPr>
+              <w:t xml:space="preserve">5. Regression Suite</w:t>
+            </w:r>
+          </w:p>
+        </w:tc>
+        <w:tc>
+          <w:tcPr>
+            <w:tcW w:w="1900" w:type="dxa"/>
+            <w:tcBorders>
+              <w:top w:val="single" w:sz="4" w:space="0" w:color="808080"/>
+              <w:left w:val="single" w:sz="4" w:space="0" w:color="808080"/>
+              <w:bottom w:val="single" w:sz="4" w:space="0" w:color="808080"/>
+              <w:right w:val="single" w:sz="4" w:space="0" w:color="808080"/>
+            </w:tcBorders>
+            <w:tcMar>
+              <w:top w:w="50" w:type="dxa"/>
+              <w:left w:w="90" w:type="dxa"/>
+              <w:bottom w:w="50" w:type="dxa"/>
+              <w:right w:w="90" w:type="dxa"/>
+            </w:tcMar>
+            <w:vAlign w:val="center"/>
+          </w:tcPr>
+          <w:p>
+            <w:pPr>
+              <w:spacing w:line="252" w:lineRule="auto"/>
+              <w:jc w:val="left"/>
+            </w:pPr>
+            <w:r>
+              <w:rPr>
+                <w:sz w:val="20"/>
+                <w:szCs w:val="20"/>
+              </w:rPr>
+              <w:t xml:space="preserve">Impact analysis, regression suite</w:t>
+            </w:r>
+          </w:p>
+        </w:tc>
+        <w:tc>
+          <w:tcPr>
+            <w:tcW w:w="2906" w:type="dxa"/>
+            <w:tcBorders>
+              <w:top w:val="single" w:sz="4" w:space="0" w:color="808080"/>
+              <w:left w:val="single" w:sz="4" w:space="0" w:color="808080"/>
+              <w:bottom w:val="single" w:sz="4" w:space="0" w:color="808080"/>
+              <w:right w:val="single" w:sz="4" w:space="0" w:color="808080"/>
+            </w:tcBorders>
+            <w:tcMar>
+              <w:top w:w="50" w:type="dxa"/>
+              <w:left w:w="90" w:type="dxa"/>
+              <w:bottom w:w="50" w:type="dxa"/>
+              <w:right w:w="90" w:type="dxa"/>
+            </w:tcMar>
+            <w:vAlign w:val="center"/>
+          </w:tcPr>
+          <w:p>
+            <w:pPr>
+              <w:spacing w:line="252" w:lineRule="auto"/>
+              <w:jc w:val="left"/>
+            </w:pPr>
+            <w:r>
+              <w:rPr>
+                <w:sz w:val="20"/>
+                <w:szCs w:val="20"/>
+              </w:rPr>
+              <w:t xml:space="preserve">Runs the selected scope and the full suite</w:t>
+            </w:r>
+          </w:p>
+        </w:tc>
+        <w:tc>
+          <w:tcPr>
+            <w:tcW w:w="2000" w:type="dxa"/>
+            <w:tcBorders>
+              <w:top w:val="single" w:sz="4" w:space="0" w:color="808080"/>
+              <w:left w:val="single" w:sz="4" w:space="0" w:color="808080"/>
+              <w:bottom w:val="single" w:sz="4" w:space="0" w:color="808080"/>
+              <w:right w:val="single" w:sz="4" w:space="0" w:color="808080"/>
+            </w:tcBorders>
+            <w:tcMar>
+              <w:top w:w="50" w:type="dxa"/>
+              <w:left w:w="90" w:type="dxa"/>
+              <w:bottom w:w="50" w:type="dxa"/>
+              <w:right w:w="90" w:type="dxa"/>
+            </w:tcMar>
+            <w:vAlign w:val="center"/>
+          </w:tcPr>
+          <w:p>
+            <w:pPr>
+              <w:spacing w:line="252" w:lineRule="auto"/>
+              <w:jc w:val="left"/>
+            </w:pPr>
+            <w:r>
+              <w:rPr>
+                <w:sz w:val="20"/>
+                <w:szCs w:val="20"/>
+              </w:rPr>
+              <w:t xml:space="preserve">Test report with impact recall</w:t>
+            </w:r>
+          </w:p>
+        </w:tc>
+      </w:tr>
+    </w:tbl>
+    <w:p>
+      <w:pPr>
+        <w:spacing w:after="0"/>
+      </w:pPr>
+    </w:p>
+    <w:p>
+      <w:pPr>
+        <w:spacing w:after="120" w:line="360" w:lineRule="auto"/>
+        <w:ind w:firstLine="720"/>
+        <w:jc w:val="both"/>
+      </w:pPr>
+      <w:r>
+        <w:t xml:space="preserve">The Impact Analysis Agent applies the project's own finding. In RQ1 (Section 7.7) historical failure frequency recovered 519 of the 1,316 tests that actually failed (39.44%) and co-change recovered 61 (4.64%). The agent therefore scores a test at risk as 0.55 × graph proximity + 0.15 × the overlap between the story and the test's name + 0.3 × the test's past failure rate, and reports co-change only as a weak hint. The failure history comes from the Regression Suite Agent's earlier reports, so the workflow learns from its own runs.</w:t>
+      </w:r>
+    </w:p>
+    <w:p>
+      <w:pPr>
+        <w:spacing w:after="120" w:line="360" w:lineRule="auto"/>
+        <w:ind w:firstLine="720"/>
+        <w:jc w:val="both"/>
+      </w:pPr>
+      <w:r>
+        <w:t xml:space="preserve">Fig. 6.9 shows the Agents tab of the demo site, which replays three recorded scenarios on a small sample library (shopcart, 15 tests). The user story is the same in each: “As a shopper, I want to apply the discount code FESTIVE20 at checkout to get 20% off my cart total, capped at Rs 500.” The Impact Analysis Agent puts 7 of the 15 tests at risk, the pricing and cart tests, and leaves the tax, catalogue, inventory and receipt tests out.</w:t>
+      </w:r>
+    </w:p>
+    <w:p>
+      <w:pPr>
+        <w:keepNext/>
+        <w:spacing w:before="160" w:after="60"/>
+        <w:jc w:val="center"/>
+      </w:pPr>
+      <w:r>
+        <w:rPr>
+          <w:noProof/>
+        </w:rPr>
+        <w:drawing>
+          <wp:inline distT="0" distB="0" distL="0" distR="0">
+            <wp:extent cx="5486400" cy="2598821"/>
+            <wp:effectExtent l="0" t="0" r="0" b="0"/>
+            <wp:docPr id="9701" name="fig6_9_agents" descr="fig6_9_agents"/>
+            <wp:cNvGraphicFramePr>
+              <a:graphicFrameLocks xmlns:a="http://schemas.openxmlformats.org/drawingml/2006/main" noChangeAspect="1"/>
+            </wp:cNvGraphicFramePr>
+            <a:graphic xmlns:a="http://schemas.openxmlformats.org/drawingml/2006/main">
+              <a:graphicData uri="http://schemas.openxmlformats.org/drawingml/2006/picture">
+                <pic:pic xmlns:pic="http://schemas.openxmlformats.org/drawingml/2006/picture">
+                  <pic:nvPicPr>
+                    <pic:cNvPr id="0" name=""/>
+                    <pic:cNvPicPr>
+                      <a:picLocks noChangeAspect="1"/>
+                    </pic:cNvPicPr>
+                  </pic:nvPicPr>
+                  <pic:blipFill>
+                    <a:blip r:embed="rIdBRfig6_9_agents"/>
+                    <a:stretch>
+                      <a:fillRect/>
+                    </a:stretch>
+                  </pic:blipFill>
+                  <pic:spPr>
+                    <a:xfrm>
+                      <a:off x="0" y="0"/>
+                      <a:ext cx="5486400" cy="2598821"/>
+                    </a:xfrm>
+                    <a:prstGeom prst="rect">
+                      <a:avLst/>
+                    </a:prstGeom>
+                  </pic:spPr>
+                </pic:pic>
+              </a:graphicData>
+            </a:graphic>
+          </wp:inline>
+        </w:drawing>
+      </w:r>
+    </w:p>
+    <w:p>
+      <w:pPr>
+        <w:spacing w:before="100" w:after="240"/>
+        <w:jc w:val="center"/>
+      </w:pPr>
+      <w:r>
+        <w:rPr>
+          <w:b/>
+          <w:bCs/>
+          <w:sz w:val="20"/>
+          <w:szCs w:val="20"/>
+        </w:rPr>
+        <w:t xml:space="preserve">Fig. 6.9 </w:t>
+      </w:r>
+      <w:r>
+        <w:rPr>
+          <w:sz w:val="20"/>
+          <w:szCs w:val="20"/>
+        </w:rPr>
+        <w:t>Agents Tab of the Demo Site: Five Agents and Three Scenarios</w:t>
+      </w:r>
+    </w:p>
+    <w:p>
+      <w:pPr>
+        <w:spacing w:after="120" w:line="360" w:lineRule="auto"/>
+        <w:ind w:firstLine="720"/>
+        <w:jc w:val="both"/>
+      </w:pPr>
+      <w:r>
+        <w:rPr>
+          <w:b/>
+          <w:bCs/>
+        </w:rPr>
+        <w:t xml:space="preserve">Clean change. </w:t>
+      </w:r>
+      <w:r>
+        <w:t xml:space="preserve">The change edits pricing.py and adds three tests. The reviewer approves and merges, the build passes and the package is deployed, and the regression report passes with 10 of 18 tests selected and 18 of 18 passing in the full suite.</w:t>
+      </w:r>
+    </w:p>
+    <w:p>
+      <w:pPr>
+        <w:spacing w:after="120" w:line="360" w:lineRule="auto"/>
+        <w:ind w:firstLine="720"/>
+        <w:jc w:val="both"/>
+      </w:pPr>
+      <w:r>
+        <w:rPr>
+          <w:b/>
+          <w:bCs/>
+        </w:rPr>
+        <w:t xml:space="preserve">Out-of-scope change. </w:t>
+      </w:r>
+      <w:r>
+        <w:t xml:space="preserve">The change also rewrites receipt formatting, which the story did not ask for. The reviewer's scope check fails and it requests changes, so nothing is merged.</w:t>
+      </w:r>
+    </w:p>
+    <w:p>
+      <w:pPr>
+        <w:spacing w:after="120" w:line="360" w:lineRule="auto"/>
+        <w:ind w:firstLine="720"/>
+        <w:jc w:val="both"/>
+      </w:pPr>
+      <w:r>
+        <w:rPr>
+          <w:b/>
+          <w:bCs/>
+        </w:rPr>
+        <w:t xml:space="preserve">Reviewer in warn mode. </w:t>
+      </w:r>
+      <w:r>
+        <w:t xml:space="preserve">The same change meets a reviewer that only warns. It merges, the full build fails on the two receipt tests, the Build &amp; Deploy Agent sends a build_failed notification and deploys nothing, and the regression report shows an impact recall of 0/2, because both failures lie outside the predicted scope (Fig. 6.10).</w:t>
+      </w:r>
+    </w:p>
+    <w:p>
+      <w:pPr>
+        <w:keepNext/>
+        <w:spacing w:before="160" w:after="60"/>
+        <w:jc w:val="center"/>
+      </w:pPr>
+      <w:r>
+        <w:rPr>
+          <w:noProof/>
+        </w:rPr>
+        <w:drawing>
+          <wp:inline distT="0" distB="0" distL="0" distR="0">
+            <wp:extent cx="4937760" cy="3616692"/>
+            <wp:effectExtent l="0" t="0" r="0" b="0"/>
+            <wp:docPr id="9702" name="fig6_10_agents" descr="fig6_10_agents"/>
+            <wp:cNvGraphicFramePr>
+              <a:graphicFrameLocks xmlns:a="http://schemas.openxmlformats.org/drawingml/2006/main" noChangeAspect="1"/>
+            </wp:cNvGraphicFramePr>
+            <a:graphic xmlns:a="http://schemas.openxmlformats.org/drawingml/2006/main">
+              <a:graphicData uri="http://schemas.openxmlformats.org/drawingml/2006/picture">
+                <pic:pic xmlns:pic="http://schemas.openxmlformats.org/drawingml/2006/picture">
+                  <pic:nvPicPr>
+                    <pic:cNvPr id="0" name=""/>
+                    <pic:cNvPicPr>
+                      <a:picLocks noChangeAspect="1"/>
+                    </pic:cNvPicPr>
+                  </pic:nvPicPr>
+                  <pic:blipFill>
+                    <a:blip r:embed="rIdBRfig6_10_agents"/>
+                    <a:stretch>
+                      <a:fillRect/>
+                    </a:stretch>
+                  </pic:blipFill>
+                  <pic:spPr>
+                    <a:xfrm>
+                      <a:off x="0" y="0"/>
+                      <a:ext cx="4937760" cy="3616692"/>
+                    </a:xfrm>
+                    <a:prstGeom prst="rect">
+                      <a:avLst/>
+                    </a:prstGeom>
+                  </pic:spPr>
+                </pic:pic>
+              </a:graphicData>
+            </a:graphic>
+          </wp:inline>
+        </w:drawing>
+      </w:r>
+    </w:p>
+    <w:p>
+      <w:pPr>
+        <w:spacing w:before="100" w:after="240"/>
+        <w:jc w:val="center"/>
+      </w:pPr>
+      <w:r>
+        <w:rPr>
+          <w:b/>
+          <w:bCs/>
+          <w:sz w:val="20"/>
+          <w:szCs w:val="20"/>
+        </w:rPr>
+        <w:t xml:space="preserve">Fig. 6.10 </w:t>
+      </w:r>
+      <w:r>
+        <w:rPr>
+          <w:sz w:val="20"/>
+          <w:szCs w:val="20"/>
+        </w:rPr>
+        <w:t>Build Failure, Notification and Regression Report in the Third Scenario</w:t>
+      </w:r>
+    </w:p>
+    <w:p>
+      <w:pPr>
+        <w:spacing w:after="120" w:line="360" w:lineRule="auto"/>
+        <w:ind w:firstLine="720"/>
+        <w:jc w:val="both"/>
+      </w:pPr>
+      <w:r>
+        <w:t xml:space="preserve">The demonstration runs fully offline with make agents-demo. Without a language model the story is matched to code by keywords, the Coding Agent replays recorded change sets, and pull requests live in a local forge whose merges are real git merges. With an API key the model interprets the story and writes the code; with a GitHub token the agents open and merge real pull requests and dispatch build workflows. Eleven tests run all three scenarios on the checked-in sample repository. Static reachability cannot see dynamic dispatch or reflection, so the impact scope is a ranked scope rather than a safety guarantee; the full-suite build and the regression report are the checks on it.</w:t>
       </w:r>
     </w:p>
     <w:p>

</xml_diff>